<commit_message>
Refocus GitHub presentation on results
</commit_message>
<xml_diff>
--- a/output/报告/豆瓣电影Top200数据分析报告_GitHub展示版.docx
+++ b/output/报告/豆瓣电影Top200数据分析报告_GitHub展示版.docx
@@ -29,375 +29,7 @@
           <w:color w:val="666666"/>
           <w:sz w:val="24"/>
         </w:rPr>
-        <w:t>Python 数据采集、清洗、可视化与自动化报告生成</w:t>
-      </w:r>
-    </w:p>
-    <w:tbl>
-      <w:tblPr>
-        <w:tblStyle w:val="TableGrid"/>
-        <w:tblW w:type="dxa" w:w="9360"/>
-        <w:tblLayout w:type="fixed"/>
-        <w:tblLook w:firstColumn="1" w:firstRow="1" w:lastColumn="0" w:lastRow="0" w:noHBand="0" w:noVBand="1" w:val="04A0"/>
-        <w:tblInd w:w="120" w:type="dxa"/>
-      </w:tblPr>
-      <w:tblGrid>
-        <w:gridCol w:w="2592"/>
-        <w:gridCol w:w="6768"/>
-      </w:tblGrid>
-      <w:tr>
-        <w:tc>
-          <w:tcPr>
-            <w:tcW w:type="dxa" w:w="2592"/>
-            <w:vAlign w:val="center"/>
-            <w:tcMar>
-              <w:top w:w="80" w:type="dxa"/>
-              <w:start w:w="120" w:type="dxa"/>
-              <w:bottom w:w="80" w:type="dxa"/>
-              <w:end w:w="120" w:type="dxa"/>
-            </w:tcMar>
-            <w:shd w:fill="F2F4F7"/>
-          </w:tcPr>
-          <w:p>
-            <w:pPr>
-              <w:spacing w:after="0" w:line="264" w:lineRule="auto"/>
-            </w:pPr>
-            <w:r>
-              <w:rPr>
-                <w:rFonts w:ascii="Calibri" w:hAnsi="Calibri" w:eastAsia="Microsoft YaHei"/>
-                <w:b/>
-                <w:color w:val="0B2545"/>
-                <w:sz w:val="21"/>
-              </w:rPr>
-              <w:t>项目</w:t>
-            </w:r>
-          </w:p>
-        </w:tc>
-        <w:tc>
-          <w:tcPr>
-            <w:tcW w:type="dxa" w:w="6768"/>
-            <w:vAlign w:val="center"/>
-            <w:tcMar>
-              <w:top w:w="80" w:type="dxa"/>
-              <w:start w:w="120" w:type="dxa"/>
-              <w:bottom w:w="80" w:type="dxa"/>
-              <w:end w:w="120" w:type="dxa"/>
-            </w:tcMar>
-            <w:shd w:fill="F2F4F7"/>
-          </w:tcPr>
-          <w:p>
-            <w:pPr>
-              <w:spacing w:after="0" w:line="264" w:lineRule="auto"/>
-            </w:pPr>
-            <w:r>
-              <w:rPr>
-                <w:rFonts w:ascii="Calibri" w:hAnsi="Calibri" w:eastAsia="Microsoft YaHei"/>
-                <w:b/>
-                <w:color w:val="0B2545"/>
-                <w:sz w:val="21"/>
-              </w:rPr>
-              <w:t>说明</w:t>
-            </w:r>
-          </w:p>
-        </w:tc>
-      </w:tr>
-      <w:tr>
-        <w:tc>
-          <w:tcPr>
-            <w:tcW w:type="dxa" w:w="2592"/>
-            <w:vAlign w:val="center"/>
-            <w:tcMar>
-              <w:top w:w="80" w:type="dxa"/>
-              <w:start w:w="120" w:type="dxa"/>
-              <w:bottom w:w="80" w:type="dxa"/>
-              <w:end w:w="120" w:type="dxa"/>
-            </w:tcMar>
-          </w:tcPr>
-          <w:p>
-            <w:pPr>
-              <w:spacing w:after="0" w:line="264" w:lineRule="auto"/>
-            </w:pPr>
-            <w:r>
-              <w:rPr>
-                <w:rFonts w:ascii="Calibri" w:hAnsi="Calibri" w:eastAsia="Microsoft YaHei"/>
-                <w:b w:val="0"/>
-                <w:color w:val="333333"/>
-                <w:sz w:val="21"/>
-              </w:rPr>
-              <w:t>项目类型</w:t>
-            </w:r>
-          </w:p>
-        </w:tc>
-        <w:tc>
-          <w:tcPr>
-            <w:tcW w:type="dxa" w:w="6768"/>
-            <w:vAlign w:val="center"/>
-            <w:tcMar>
-              <w:top w:w="80" w:type="dxa"/>
-              <w:start w:w="120" w:type="dxa"/>
-              <w:bottom w:w="80" w:type="dxa"/>
-              <w:end w:w="120" w:type="dxa"/>
-            </w:tcMar>
-          </w:tcPr>
-          <w:p>
-            <w:pPr>
-              <w:spacing w:after="0" w:line="264" w:lineRule="auto"/>
-            </w:pPr>
-            <w:r>
-              <w:rPr>
-                <w:rFonts w:ascii="Calibri" w:hAnsi="Calibri" w:eastAsia="Microsoft YaHei"/>
-                <w:b w:val="0"/>
-                <w:color w:val="333333"/>
-                <w:sz w:val="21"/>
-              </w:rPr>
-              <w:t>端到端数据分析管道 / 课程项目展示版</w:t>
-            </w:r>
-          </w:p>
-        </w:tc>
-      </w:tr>
-      <w:tr>
-        <w:tc>
-          <w:tcPr>
-            <w:tcW w:type="dxa" w:w="2592"/>
-            <w:vAlign w:val="center"/>
-            <w:tcMar>
-              <w:top w:w="80" w:type="dxa"/>
-              <w:start w:w="120" w:type="dxa"/>
-              <w:bottom w:w="80" w:type="dxa"/>
-              <w:end w:w="120" w:type="dxa"/>
-            </w:tcMar>
-          </w:tcPr>
-          <w:p>
-            <w:pPr>
-              <w:spacing w:after="0" w:line="264" w:lineRule="auto"/>
-            </w:pPr>
-            <w:r>
-              <w:rPr>
-                <w:rFonts w:ascii="Calibri" w:hAnsi="Calibri" w:eastAsia="Microsoft YaHei"/>
-                <w:b w:val="0"/>
-                <w:color w:val="333333"/>
-                <w:sz w:val="21"/>
-              </w:rPr>
-              <w:t>数据对象</w:t>
-            </w:r>
-          </w:p>
-        </w:tc>
-        <w:tc>
-          <w:tcPr>
-            <w:tcW w:type="dxa" w:w="6768"/>
-            <w:vAlign w:val="center"/>
-            <w:tcMar>
-              <w:top w:w="80" w:type="dxa"/>
-              <w:start w:w="120" w:type="dxa"/>
-              <w:bottom w:w="80" w:type="dxa"/>
-              <w:end w:w="120" w:type="dxa"/>
-            </w:tcMar>
-          </w:tcPr>
-          <w:p>
-            <w:pPr>
-              <w:spacing w:after="0" w:line="264" w:lineRule="auto"/>
-            </w:pPr>
-            <w:r>
-              <w:rPr>
-                <w:rFonts w:ascii="Calibri" w:hAnsi="Calibri" w:eastAsia="Microsoft YaHei"/>
-                <w:b w:val="0"/>
-                <w:color w:val="333333"/>
-                <w:sz w:val="21"/>
-              </w:rPr>
-              <w:t>豆瓣电影 Top250 公开榜单前 200 部影片</w:t>
-            </w:r>
-          </w:p>
-        </w:tc>
-      </w:tr>
-      <w:tr>
-        <w:tc>
-          <w:tcPr>
-            <w:tcW w:type="dxa" w:w="2592"/>
-            <w:vAlign w:val="center"/>
-            <w:tcMar>
-              <w:top w:w="80" w:type="dxa"/>
-              <w:start w:w="120" w:type="dxa"/>
-              <w:bottom w:w="80" w:type="dxa"/>
-              <w:end w:w="120" w:type="dxa"/>
-            </w:tcMar>
-          </w:tcPr>
-          <w:p>
-            <w:pPr>
-              <w:spacing w:after="0" w:line="264" w:lineRule="auto"/>
-            </w:pPr>
-            <w:r>
-              <w:rPr>
-                <w:rFonts w:ascii="Calibri" w:hAnsi="Calibri" w:eastAsia="Microsoft YaHei"/>
-                <w:b w:val="0"/>
-                <w:color w:val="333333"/>
-                <w:sz w:val="21"/>
-              </w:rPr>
-              <w:t>核心技术</w:t>
-            </w:r>
-          </w:p>
-        </w:tc>
-        <w:tc>
-          <w:tcPr>
-            <w:tcW w:type="dxa" w:w="6768"/>
-            <w:vAlign w:val="center"/>
-            <w:tcMar>
-              <w:top w:w="80" w:type="dxa"/>
-              <w:start w:w="120" w:type="dxa"/>
-              <w:bottom w:w="80" w:type="dxa"/>
-              <w:end w:w="120" w:type="dxa"/>
-            </w:tcMar>
-          </w:tcPr>
-          <w:p>
-            <w:pPr>
-              <w:spacing w:after="0" w:line="264" w:lineRule="auto"/>
-            </w:pPr>
-            <w:r>
-              <w:rPr>
-                <w:rFonts w:ascii="Calibri" w:hAnsi="Calibri" w:eastAsia="Microsoft YaHei"/>
-                <w:b w:val="0"/>
-                <w:color w:val="333333"/>
-                <w:sz w:val="21"/>
-              </w:rPr>
-              <w:t>requests, BeautifulSoup4, pandas, scipy, matplotlib, python-docx, pytest</w:t>
-            </w:r>
-          </w:p>
-        </w:tc>
-      </w:tr>
-      <w:tr>
-        <w:tc>
-          <w:tcPr>
-            <w:tcW w:type="dxa" w:w="2592"/>
-            <w:vAlign w:val="center"/>
-            <w:tcMar>
-              <w:top w:w="80" w:type="dxa"/>
-              <w:start w:w="120" w:type="dxa"/>
-              <w:bottom w:w="80" w:type="dxa"/>
-              <w:end w:w="120" w:type="dxa"/>
-            </w:tcMar>
-          </w:tcPr>
-          <w:p>
-            <w:pPr>
-              <w:spacing w:after="0" w:line="264" w:lineRule="auto"/>
-            </w:pPr>
-            <w:r>
-              <w:rPr>
-                <w:rFonts w:ascii="Calibri" w:hAnsi="Calibri" w:eastAsia="Microsoft YaHei"/>
-                <w:b w:val="0"/>
-                <w:color w:val="333333"/>
-                <w:sz w:val="21"/>
-              </w:rPr>
-              <w:t>展示版本</w:t>
-            </w:r>
-          </w:p>
-        </w:tc>
-        <w:tc>
-          <w:tcPr>
-            <w:tcW w:type="dxa" w:w="6768"/>
-            <w:vAlign w:val="center"/>
-            <w:tcMar>
-              <w:top w:w="80" w:type="dxa"/>
-              <w:start w:w="120" w:type="dxa"/>
-              <w:bottom w:w="80" w:type="dxa"/>
-              <w:end w:w="120" w:type="dxa"/>
-            </w:tcMar>
-          </w:tcPr>
-          <w:p>
-            <w:pPr>
-              <w:spacing w:after="0" w:line="264" w:lineRule="auto"/>
-            </w:pPr>
-            <w:r>
-              <w:rPr>
-                <w:rFonts w:ascii="Calibri" w:hAnsi="Calibri" w:eastAsia="Microsoft YaHei"/>
-                <w:b w:val="0"/>
-                <w:color w:val="333333"/>
-                <w:sz w:val="21"/>
-              </w:rPr>
-              <w:t>去除个人身份信息，仅保留项目过程、结果和工程化说明</w:t>
-            </w:r>
-          </w:p>
-        </w:tc>
-      </w:tr>
-    </w:tbl>
-    <w:p>
-      <w:pPr>
-        <w:pStyle w:val="Heading1"/>
-      </w:pPr>
-      <w:r>
-        <w:t>1. 项目亮点</w:t>
-      </w:r>
-    </w:p>
-    <w:p>
-      <w:pPr>
-        <w:pStyle w:val="ListBullet"/>
-        <w:spacing w:after="80" w:line="264" w:lineRule="auto"/>
-      </w:pPr>
-      <w:r>
-        <w:rPr>
-          <w:rFonts w:ascii="Calibri" w:hAnsi="Calibri" w:eastAsia="Microsoft YaHei"/>
-          <w:b w:val="0"/>
-          <w:color w:val="333333"/>
-          <w:sz w:val="21"/>
-        </w:rPr>
-        <w:t>端到端实现公开榜单采集、HTML 解析、字段清洗、统计分析、可视化和报告生成。</w:t>
-      </w:r>
-    </w:p>
-    <w:p>
-      <w:pPr>
-        <w:pStyle w:val="ListBullet"/>
-        <w:spacing w:after="80" w:line="264" w:lineRule="auto"/>
-      </w:pPr>
-      <w:r>
-        <w:rPr>
-          <w:rFonts w:ascii="Calibri" w:hAnsi="Calibri" w:eastAsia="Microsoft YaHei"/>
-          <w:b w:val="0"/>
-          <w:color w:val="333333"/>
-          <w:sz w:val="21"/>
-        </w:rPr>
-        <w:t>支持离线复现：基于已保存 CSV 可重建清洗数据、图表和报告。</w:t>
-      </w:r>
-    </w:p>
-    <w:p>
-      <w:pPr>
-        <w:pStyle w:val="ListBullet"/>
-        <w:spacing w:after="80" w:line="264" w:lineRule="auto"/>
-      </w:pPr>
-      <w:r>
-        <w:rPr>
-          <w:rFonts w:ascii="Calibri" w:hAnsi="Calibri" w:eastAsia="Microsoft YaHei"/>
-          <w:b w:val="0"/>
-          <w:color w:val="333333"/>
-          <w:sz w:val="21"/>
-        </w:rPr>
-        <w:t>对记录数、排名唯一性、关键字段缺失和重复项进行质量核验。</w:t>
-      </w:r>
-    </w:p>
-    <w:p>
-      <w:pPr>
-        <w:pStyle w:val="ListBullet"/>
-        <w:spacing w:after="80" w:line="264" w:lineRule="auto"/>
-      </w:pPr>
-      <w:r>
-        <w:rPr>
-          <w:rFonts w:ascii="Calibri" w:hAnsi="Calibri" w:eastAsia="Microsoft YaHei"/>
-          <w:b w:val="0"/>
-          <w:color w:val="333333"/>
-          <w:sz w:val="21"/>
-        </w:rPr>
-        <w:t>输出课程提交版与 GitHub 展示版两套报告，兼顾作业提交和项目展示。</w:t>
-      </w:r>
-    </w:p>
-    <w:p>
-      <w:pPr>
-        <w:pStyle w:val="ListBullet"/>
-        <w:spacing w:after="80" w:line="264" w:lineRule="auto"/>
-      </w:pPr>
-      <w:r>
-        <w:rPr>
-          <w:rFonts w:ascii="Calibri" w:hAnsi="Calibri" w:eastAsia="Microsoft YaHei"/>
-          <w:b w:val="0"/>
-          <w:color w:val="333333"/>
-          <w:sz w:val="21"/>
-        </w:rPr>
-        <w:t>使用 pytest 覆盖页面解析、数据清洗、拆分和统计摘要等核心逻辑。</w:t>
+        <w:t>结果展示在前，复现流程在后</w:t>
       </w:r>
     </w:p>
     <w:p>
@@ -405,300 +37,21 @@
         <w:pStyle w:val="Heading1"/>
       </w:pPr>
       <w:r>
-        <w:t>2. 数据管道设计</w:t>
+        <w:t>1. 结果总览</w:t>
       </w:r>
     </w:p>
-    <w:tbl>
-      <w:tblPr>
-        <w:tblStyle w:val="TableGrid"/>
-        <w:tblW w:type="dxa" w:w="9360"/>
-        <w:tblLayout w:type="fixed"/>
-        <w:tblLook w:firstColumn="1" w:firstRow="1" w:lastColumn="0" w:lastRow="0" w:noHBand="0" w:noVBand="1" w:val="04A0"/>
-        <w:tblInd w:w="120" w:type="dxa"/>
-      </w:tblPr>
-      <w:tblGrid>
-        <w:gridCol w:w="2592"/>
-        <w:gridCol w:w="6768"/>
-      </w:tblGrid>
-      <w:tr>
-        <w:tc>
-          <w:tcPr>
-            <w:tcW w:type="dxa" w:w="2592"/>
-            <w:vAlign w:val="center"/>
-            <w:tcMar>
-              <w:top w:w="80" w:type="dxa"/>
-              <w:start w:w="120" w:type="dxa"/>
-              <w:bottom w:w="80" w:type="dxa"/>
-              <w:end w:w="120" w:type="dxa"/>
-            </w:tcMar>
-            <w:shd w:fill="F2F4F7"/>
-          </w:tcPr>
-          <w:p>
-            <w:pPr>
-              <w:spacing w:after="0" w:line="264" w:lineRule="auto"/>
-            </w:pPr>
-            <w:r>
-              <w:rPr>
-                <w:rFonts w:ascii="Calibri" w:hAnsi="Calibri" w:eastAsia="Microsoft YaHei"/>
-                <w:b/>
-                <w:color w:val="0B2545"/>
-                <w:sz w:val="21"/>
-              </w:rPr>
-              <w:t>项目</w:t>
-            </w:r>
-          </w:p>
-        </w:tc>
-        <w:tc>
-          <w:tcPr>
-            <w:tcW w:type="dxa" w:w="6768"/>
-            <w:vAlign w:val="center"/>
-            <w:tcMar>
-              <w:top w:w="80" w:type="dxa"/>
-              <w:start w:w="120" w:type="dxa"/>
-              <w:bottom w:w="80" w:type="dxa"/>
-              <w:end w:w="120" w:type="dxa"/>
-            </w:tcMar>
-            <w:shd w:fill="F2F4F7"/>
-          </w:tcPr>
-          <w:p>
-            <w:pPr>
-              <w:spacing w:after="0" w:line="264" w:lineRule="auto"/>
-            </w:pPr>
-            <w:r>
-              <w:rPr>
-                <w:rFonts w:ascii="Calibri" w:hAnsi="Calibri" w:eastAsia="Microsoft YaHei"/>
-                <w:b/>
-                <w:color w:val="0B2545"/>
-                <w:sz w:val="21"/>
-              </w:rPr>
-              <w:t>说明</w:t>
-            </w:r>
-          </w:p>
-        </w:tc>
-      </w:tr>
-      <w:tr>
-        <w:tc>
-          <w:tcPr>
-            <w:tcW w:type="dxa" w:w="2592"/>
-            <w:vAlign w:val="center"/>
-            <w:tcMar>
-              <w:top w:w="80" w:type="dxa"/>
-              <w:start w:w="120" w:type="dxa"/>
-              <w:bottom w:w="80" w:type="dxa"/>
-              <w:end w:w="120" w:type="dxa"/>
-            </w:tcMar>
-          </w:tcPr>
-          <w:p>
-            <w:pPr>
-              <w:spacing w:after="0" w:line="264" w:lineRule="auto"/>
-            </w:pPr>
-            <w:r>
-              <w:rPr>
-                <w:rFonts w:ascii="Calibri" w:hAnsi="Calibri" w:eastAsia="Microsoft YaHei"/>
-                <w:b w:val="0"/>
-                <w:color w:val="333333"/>
-                <w:sz w:val="21"/>
-              </w:rPr>
-              <w:t>采集层</w:t>
-            </w:r>
-          </w:p>
-        </w:tc>
-        <w:tc>
-          <w:tcPr>
-            <w:tcW w:type="dxa" w:w="6768"/>
-            <w:vAlign w:val="center"/>
-            <w:tcMar>
-              <w:top w:w="80" w:type="dxa"/>
-              <w:start w:w="120" w:type="dxa"/>
-              <w:bottom w:w="80" w:type="dxa"/>
-              <w:end w:w="120" w:type="dxa"/>
-            </w:tcMar>
-          </w:tcPr>
-          <w:p>
-            <w:pPr>
-              <w:spacing w:after="0" w:line="264" w:lineRule="auto"/>
-            </w:pPr>
-            <w:r>
-              <w:rPr>
-                <w:rFonts w:ascii="Calibri" w:hAnsi="Calibri" w:eastAsia="Microsoft YaHei"/>
-                <w:b w:val="0"/>
-                <w:color w:val="333333"/>
-                <w:sz w:val="21"/>
-              </w:rPr>
-              <w:t>分页访问公开榜单页面，解析排名、片名、年份、国家/地区、类型、评分和评价人数。</w:t>
-            </w:r>
-          </w:p>
-        </w:tc>
-      </w:tr>
-      <w:tr>
-        <w:tc>
-          <w:tcPr>
-            <w:tcW w:type="dxa" w:w="2592"/>
-            <w:vAlign w:val="center"/>
-            <w:tcMar>
-              <w:top w:w="80" w:type="dxa"/>
-              <w:start w:w="120" w:type="dxa"/>
-              <w:bottom w:w="80" w:type="dxa"/>
-              <w:end w:w="120" w:type="dxa"/>
-            </w:tcMar>
-          </w:tcPr>
-          <w:p>
-            <w:pPr>
-              <w:spacing w:after="0" w:line="264" w:lineRule="auto"/>
-            </w:pPr>
-            <w:r>
-              <w:rPr>
-                <w:rFonts w:ascii="Calibri" w:hAnsi="Calibri" w:eastAsia="Microsoft YaHei"/>
-                <w:b w:val="0"/>
-                <w:color w:val="333333"/>
-                <w:sz w:val="21"/>
-              </w:rPr>
-              <w:t>清洗层</w:t>
-            </w:r>
-          </w:p>
-        </w:tc>
-        <w:tc>
-          <w:tcPr>
-            <w:tcW w:type="dxa" w:w="6768"/>
-            <w:vAlign w:val="center"/>
-            <w:tcMar>
-              <w:top w:w="80" w:type="dxa"/>
-              <w:start w:w="120" w:type="dxa"/>
-              <w:bottom w:w="80" w:type="dxa"/>
-              <w:end w:w="120" w:type="dxa"/>
-            </w:tcMar>
-          </w:tcPr>
-          <w:p>
-            <w:pPr>
-              <w:spacing w:after="0" w:line="264" w:lineRule="auto"/>
-            </w:pPr>
-            <w:r>
-              <w:rPr>
-                <w:rFonts w:ascii="Calibri" w:hAnsi="Calibri" w:eastAsia="Microsoft YaHei"/>
-                <w:b w:val="0"/>
-                <w:color w:val="333333"/>
-                <w:sz w:val="21"/>
-              </w:rPr>
-              <w:t>统一字段类型，处理多值字段，移除重复项，并输出一电影一行的主表。</w:t>
-            </w:r>
-          </w:p>
-        </w:tc>
-      </w:tr>
-      <w:tr>
-        <w:tc>
-          <w:tcPr>
-            <w:tcW w:type="dxa" w:w="2592"/>
-            <w:vAlign w:val="center"/>
-            <w:tcMar>
-              <w:top w:w="80" w:type="dxa"/>
-              <w:start w:w="120" w:type="dxa"/>
-              <w:bottom w:w="80" w:type="dxa"/>
-              <w:end w:w="120" w:type="dxa"/>
-            </w:tcMar>
-          </w:tcPr>
-          <w:p>
-            <w:pPr>
-              <w:spacing w:after="0" w:line="264" w:lineRule="auto"/>
-            </w:pPr>
-            <w:r>
-              <w:rPr>
-                <w:rFonts w:ascii="Calibri" w:hAnsi="Calibri" w:eastAsia="Microsoft YaHei"/>
-                <w:b w:val="0"/>
-                <w:color w:val="333333"/>
-                <w:sz w:val="21"/>
-              </w:rPr>
-              <w:t>分析层</w:t>
-            </w:r>
-          </w:p>
-        </w:tc>
-        <w:tc>
-          <w:tcPr>
-            <w:tcW w:type="dxa" w:w="6768"/>
-            <w:vAlign w:val="center"/>
-            <w:tcMar>
-              <w:top w:w="80" w:type="dxa"/>
-              <w:start w:w="120" w:type="dxa"/>
-              <w:bottom w:w="80" w:type="dxa"/>
-              <w:end w:w="120" w:type="dxa"/>
-            </w:tcMar>
-          </w:tcPr>
-          <w:p>
-            <w:pPr>
-              <w:spacing w:after="0" w:line="264" w:lineRule="auto"/>
-            </w:pPr>
-            <w:r>
-              <w:rPr>
-                <w:rFonts w:ascii="Calibri" w:hAnsi="Calibri" w:eastAsia="Microsoft YaHei"/>
-                <w:b w:val="0"/>
-                <w:color w:val="333333"/>
-                <w:sz w:val="21"/>
-              </w:rPr>
-              <w:t>生成评分、类型、国家/地区、年代和相关关系统计。</w:t>
-            </w:r>
-          </w:p>
-        </w:tc>
-      </w:tr>
-      <w:tr>
-        <w:tc>
-          <w:tcPr>
-            <w:tcW w:type="dxa" w:w="2592"/>
-            <w:vAlign w:val="center"/>
-            <w:tcMar>
-              <w:top w:w="80" w:type="dxa"/>
-              <w:start w:w="120" w:type="dxa"/>
-              <w:bottom w:w="80" w:type="dxa"/>
-              <w:end w:w="120" w:type="dxa"/>
-            </w:tcMar>
-          </w:tcPr>
-          <w:p>
-            <w:pPr>
-              <w:spacing w:after="0" w:line="264" w:lineRule="auto"/>
-            </w:pPr>
-            <w:r>
-              <w:rPr>
-                <w:rFonts w:ascii="Calibri" w:hAnsi="Calibri" w:eastAsia="Microsoft YaHei"/>
-                <w:b w:val="0"/>
-                <w:color w:val="333333"/>
-                <w:sz w:val="21"/>
-              </w:rPr>
-              <w:t>输出层</w:t>
-            </w:r>
-          </w:p>
-        </w:tc>
-        <w:tc>
-          <w:tcPr>
-            <w:tcW w:type="dxa" w:w="6768"/>
-            <w:vAlign w:val="center"/>
-            <w:tcMar>
-              <w:top w:w="80" w:type="dxa"/>
-              <w:start w:w="120" w:type="dxa"/>
-              <w:bottom w:w="80" w:type="dxa"/>
-              <w:end w:w="120" w:type="dxa"/>
-            </w:tcMar>
-          </w:tcPr>
-          <w:p>
-            <w:pPr>
-              <w:spacing w:after="0" w:line="264" w:lineRule="auto"/>
-            </w:pPr>
-            <w:r>
-              <w:rPr>
-                <w:rFonts w:ascii="Calibri" w:hAnsi="Calibri" w:eastAsia="Microsoft YaHei"/>
-                <w:b w:val="0"/>
-                <w:color w:val="333333"/>
-                <w:sz w:val="21"/>
-              </w:rPr>
-              <w:t>保存 CSV/JSON、PNG 图表、Word 报告和 PDF 报告。</w:t>
-            </w:r>
-          </w:p>
-        </w:tc>
-      </w:tr>
-    </w:tbl>
     <w:p>
       <w:pPr>
-        <w:pStyle w:val="Heading1"/>
+        <w:spacing w:after="120" w:line="264" w:lineRule="auto"/>
       </w:pPr>
       <w:r>
-        <w:t>3. 关键结果</w:t>
+        <w:rPr>
+          <w:rFonts w:ascii="Calibri" w:hAnsi="Calibri" w:eastAsia="Microsoft YaHei"/>
+          <w:b w:val="0"/>
+          <w:color w:val="333333"/>
+          <w:sz w:val="22"/>
+        </w:rPr>
+        <w:t>本项目分析豆瓣电影 Top250 公开榜单前 200 部影片，重点呈现评分分布、类型结构、国家/地区来源、年代分布和排名关系。下表为本次数据快照的核心结果。</w:t>
       </w:r>
     </w:p>
     <w:tbl>
@@ -954,6 +307,60 @@
                 <w:color w:val="333333"/>
                 <w:sz w:val="21"/>
               </w:rPr>
+              <w:t>中位评分</w:t>
+            </w:r>
+          </w:p>
+        </w:tc>
+        <w:tc>
+          <w:tcPr>
+            <w:tcW w:type="dxa" w:w="6768"/>
+            <w:vAlign w:val="center"/>
+            <w:tcMar>
+              <w:top w:w="80" w:type="dxa"/>
+              <w:start w:w="120" w:type="dxa"/>
+              <w:bottom w:w="80" w:type="dxa"/>
+              <w:end w:w="120" w:type="dxa"/>
+            </w:tcMar>
+          </w:tcPr>
+          <w:p>
+            <w:pPr>
+              <w:spacing w:after="0" w:line="264" w:lineRule="auto"/>
+            </w:pPr>
+            <w:r>
+              <w:rPr>
+                <w:rFonts w:ascii="Calibri" w:hAnsi="Calibri" w:eastAsia="Microsoft YaHei"/>
+                <w:b w:val="0"/>
+                <w:color w:val="333333"/>
+                <w:sz w:val="21"/>
+              </w:rPr>
+              <w:t>9.00</w:t>
+            </w:r>
+          </w:p>
+        </w:tc>
+      </w:tr>
+      <w:tr>
+        <w:tc>
+          <w:tcPr>
+            <w:tcW w:type="dxa" w:w="2592"/>
+            <w:vAlign w:val="center"/>
+            <w:tcMar>
+              <w:top w:w="80" w:type="dxa"/>
+              <w:start w:w="120" w:type="dxa"/>
+              <w:bottom w:w="80" w:type="dxa"/>
+              <w:end w:w="120" w:type="dxa"/>
+            </w:tcMar>
+          </w:tcPr>
+          <w:p>
+            <w:pPr>
+              <w:spacing w:after="0" w:line="264" w:lineRule="auto"/>
+            </w:pPr>
+            <w:r>
+              <w:rPr>
+                <w:rFonts w:ascii="Calibri" w:hAnsi="Calibri" w:eastAsia="Microsoft YaHei"/>
+                <w:b w:val="0"/>
+                <w:color w:val="333333"/>
+                <w:sz w:val="21"/>
+              </w:rPr>
               <w:t>评分范围</w:t>
             </w:r>
           </w:p>
@@ -1062,6 +469,114 @@
                 <w:color w:val="333333"/>
                 <w:sz w:val="21"/>
               </w:rPr>
+              <w:t>出现最多的类型</w:t>
+            </w:r>
+          </w:p>
+        </w:tc>
+        <w:tc>
+          <w:tcPr>
+            <w:tcW w:type="dxa" w:w="6768"/>
+            <w:vAlign w:val="center"/>
+            <w:tcMar>
+              <w:top w:w="80" w:type="dxa"/>
+              <w:start w:w="120" w:type="dxa"/>
+              <w:bottom w:w="80" w:type="dxa"/>
+              <w:end w:w="120" w:type="dxa"/>
+            </w:tcMar>
+          </w:tcPr>
+          <w:p>
+            <w:pPr>
+              <w:spacing w:after="0" w:line="264" w:lineRule="auto"/>
+            </w:pPr>
+            <w:r>
+              <w:rPr>
+                <w:rFonts w:ascii="Calibri" w:hAnsi="Calibri" w:eastAsia="Microsoft YaHei"/>
+                <w:b w:val="0"/>
+                <w:color w:val="333333"/>
+                <w:sz w:val="21"/>
+              </w:rPr>
+              <w:t>剧情</w:t>
+            </w:r>
+          </w:p>
+        </w:tc>
+      </w:tr>
+      <w:tr>
+        <w:tc>
+          <w:tcPr>
+            <w:tcW w:type="dxa" w:w="2592"/>
+            <w:vAlign w:val="center"/>
+            <w:tcMar>
+              <w:top w:w="80" w:type="dxa"/>
+              <w:start w:w="120" w:type="dxa"/>
+              <w:bottom w:w="80" w:type="dxa"/>
+              <w:end w:w="120" w:type="dxa"/>
+            </w:tcMar>
+          </w:tcPr>
+          <w:p>
+            <w:pPr>
+              <w:spacing w:after="0" w:line="264" w:lineRule="auto"/>
+            </w:pPr>
+            <w:r>
+              <w:rPr>
+                <w:rFonts w:ascii="Calibri" w:hAnsi="Calibri" w:eastAsia="Microsoft YaHei"/>
+                <w:b w:val="0"/>
+                <w:color w:val="333333"/>
+                <w:sz w:val="21"/>
+              </w:rPr>
+              <w:t>出现最多的国家/地区</w:t>
+            </w:r>
+          </w:p>
+        </w:tc>
+        <w:tc>
+          <w:tcPr>
+            <w:tcW w:type="dxa" w:w="6768"/>
+            <w:vAlign w:val="center"/>
+            <w:tcMar>
+              <w:top w:w="80" w:type="dxa"/>
+              <w:start w:w="120" w:type="dxa"/>
+              <w:bottom w:w="80" w:type="dxa"/>
+              <w:end w:w="120" w:type="dxa"/>
+            </w:tcMar>
+          </w:tcPr>
+          <w:p>
+            <w:pPr>
+              <w:spacing w:after="0" w:line="264" w:lineRule="auto"/>
+            </w:pPr>
+            <w:r>
+              <w:rPr>
+                <w:rFonts w:ascii="Calibri" w:hAnsi="Calibri" w:eastAsia="Microsoft YaHei"/>
+                <w:b w:val="0"/>
+                <w:color w:val="333333"/>
+                <w:sz w:val="21"/>
+              </w:rPr>
+              <w:t>美国</w:t>
+            </w:r>
+          </w:p>
+        </w:tc>
+      </w:tr>
+      <w:tr>
+        <w:tc>
+          <w:tcPr>
+            <w:tcW w:type="dxa" w:w="2592"/>
+            <w:vAlign w:val="center"/>
+            <w:tcMar>
+              <w:top w:w="80" w:type="dxa"/>
+              <w:start w:w="120" w:type="dxa"/>
+              <w:bottom w:w="80" w:type="dxa"/>
+              <w:end w:w="120" w:type="dxa"/>
+            </w:tcMar>
+          </w:tcPr>
+          <w:p>
+            <w:pPr>
+              <w:spacing w:after="0" w:line="264" w:lineRule="auto"/>
+            </w:pPr>
+            <w:r>
+              <w:rPr>
+                <w:rFonts w:ascii="Calibri" w:hAnsi="Calibri" w:eastAsia="Microsoft YaHei"/>
+                <w:b w:val="0"/>
+                <w:color w:val="333333"/>
+                <w:sz w:val="21"/>
+              </w:rPr>
               <w:t>数量最多的年代</w:t>
             </w:r>
           </w:p>
@@ -1099,7 +614,90 @@
         <w:pStyle w:val="Heading1"/>
       </w:pPr>
       <w:r>
-        <w:t>4. 类别与地区观察</w:t>
+        <w:t>2. 主要发现</w:t>
+      </w:r>
+    </w:p>
+    <w:p>
+      <w:pPr>
+        <w:pStyle w:val="ListBullet"/>
+        <w:spacing w:after="80" w:line="264" w:lineRule="auto"/>
+      </w:pPr>
+      <w:r>
+        <w:rPr>
+          <w:rFonts w:ascii="Calibri" w:hAnsi="Calibri" w:eastAsia="Microsoft YaHei"/>
+          <w:b w:val="0"/>
+          <w:color w:val="333333"/>
+          <w:sz w:val="21"/>
+        </w:rPr>
+        <w:t>Top200 电影评分集中在 8.8-9.3 区间，整体评分水平很高。</w:t>
+      </w:r>
+    </w:p>
+    <w:p>
+      <w:pPr>
+        <w:pStyle w:val="ListBullet"/>
+        <w:spacing w:after="80" w:line="264" w:lineRule="auto"/>
+      </w:pPr>
+      <w:r>
+        <w:rPr>
+          <w:rFonts w:ascii="Calibri" w:hAnsi="Calibri" w:eastAsia="Microsoft YaHei"/>
+          <w:b w:val="0"/>
+          <w:color w:val="333333"/>
+          <w:sz w:val="21"/>
+        </w:rPr>
+        <w:t>剧情片出现 150 次，是榜单中最突出的类型标签。</w:t>
+      </w:r>
+    </w:p>
+    <w:p>
+      <w:pPr>
+        <w:pStyle w:val="ListBullet"/>
+        <w:spacing w:after="80" w:line="264" w:lineRule="auto"/>
+      </w:pPr>
+      <w:r>
+        <w:rPr>
+          <w:rFonts w:ascii="Calibri" w:hAnsi="Calibri" w:eastAsia="Microsoft YaHei"/>
+          <w:b w:val="0"/>
+          <w:color w:val="333333"/>
+          <w:sz w:val="21"/>
+        </w:rPr>
+        <w:t>美国电影出现 110 次，在国家/地区来源中占比最高。</w:t>
+      </w:r>
+    </w:p>
+    <w:p>
+      <w:pPr>
+        <w:pStyle w:val="ListBullet"/>
+        <w:spacing w:after="80" w:line="264" w:lineRule="auto"/>
+      </w:pPr>
+      <w:r>
+        <w:rPr>
+          <w:rFonts w:ascii="Calibri" w:hAnsi="Calibri" w:eastAsia="Microsoft YaHei"/>
+          <w:b w:val="0"/>
+          <w:color w:val="333333"/>
+          <w:sz w:val="21"/>
+        </w:rPr>
+        <w:t>1990 年代、2000 年代和 2010 年代影片构成榜单主体，其中 2000 年代数量最多。</w:t>
+      </w:r>
+    </w:p>
+    <w:p>
+      <w:pPr>
+        <w:pStyle w:val="ListBullet"/>
+        <w:spacing w:after="80" w:line="264" w:lineRule="auto"/>
+      </w:pPr>
+      <w:r>
+        <w:rPr>
+          <w:rFonts w:ascii="Calibri" w:hAnsi="Calibri" w:eastAsia="Microsoft YaHei"/>
+          <w:b w:val="0"/>
+          <w:color w:val="333333"/>
+          <w:sz w:val="21"/>
+        </w:rPr>
+        <w:t>排名越靠前评分整体越高；评分与评价人数之间的线性相关性较弱。</w:t>
+      </w:r>
+    </w:p>
+    <w:p>
+      <w:pPr>
+        <w:pStyle w:val="Heading1"/>
+      </w:pPr>
+      <w:r>
+        <w:t>3. 类型与地区结构</w:t>
       </w:r>
     </w:p>
     <w:p>
@@ -2105,7 +1703,7 @@
         <w:pStyle w:val="Heading1"/>
       </w:pPr>
       <w:r>
-        <w:t>5. 可视化结果</w:t>
+        <w:t>4. 可视化结果</w:t>
       </w:r>
     </w:p>
     <w:p>
@@ -2383,7 +1981,7 @@
         <w:pStyle w:val="Heading1"/>
       </w:pPr>
       <w:r>
-        <w:t>6. 工程化与复现</w:t>
+        <w:t>5. 项目输出</w:t>
       </w:r>
     </w:p>
     <w:tbl>
@@ -2477,7 +2075,7 @@
                 <w:color w:val="333333"/>
                 <w:sz w:val="21"/>
               </w:rPr>
-              <w:t>复现入口</w:t>
+              <w:t>清洗数据</w:t>
             </w:r>
           </w:p>
         </w:tc>
@@ -2503,7 +2101,223 @@
                 <w:color w:val="333333"/>
                 <w:sz w:val="21"/>
               </w:rPr>
-              <w:t>run_pipeline.py --skip-fetch 可基于本地原始 CSV 重建结果。</w:t>
+              <w:t>data/processed/movies_clean.csv</w:t>
+            </w:r>
+          </w:p>
+        </w:tc>
+      </w:tr>
+      <w:tr>
+        <w:tc>
+          <w:tcPr>
+            <w:tcW w:type="dxa" w:w="2592"/>
+            <w:vAlign w:val="center"/>
+            <w:tcMar>
+              <w:top w:w="80" w:type="dxa"/>
+              <w:start w:w="120" w:type="dxa"/>
+              <w:bottom w:w="80" w:type="dxa"/>
+              <w:end w:w="120" w:type="dxa"/>
+            </w:tcMar>
+          </w:tcPr>
+          <w:p>
+            <w:pPr>
+              <w:spacing w:after="0" w:line="264" w:lineRule="auto"/>
+            </w:pPr>
+            <w:r>
+              <w:rPr>
+                <w:rFonts w:ascii="Calibri" w:hAnsi="Calibri" w:eastAsia="Microsoft YaHei"/>
+                <w:b w:val="0"/>
+                <w:color w:val="333333"/>
+                <w:sz w:val="21"/>
+              </w:rPr>
+              <w:t>类型展开表</w:t>
+            </w:r>
+          </w:p>
+        </w:tc>
+        <w:tc>
+          <w:tcPr>
+            <w:tcW w:type="dxa" w:w="6768"/>
+            <w:vAlign w:val="center"/>
+            <w:tcMar>
+              <w:top w:w="80" w:type="dxa"/>
+              <w:start w:w="120" w:type="dxa"/>
+              <w:bottom w:w="80" w:type="dxa"/>
+              <w:end w:w="120" w:type="dxa"/>
+            </w:tcMar>
+          </w:tcPr>
+          <w:p>
+            <w:pPr>
+              <w:spacing w:after="0" w:line="264" w:lineRule="auto"/>
+            </w:pPr>
+            <w:r>
+              <w:rPr>
+                <w:rFonts w:ascii="Calibri" w:hAnsi="Calibri" w:eastAsia="Microsoft YaHei"/>
+                <w:b w:val="0"/>
+                <w:color w:val="333333"/>
+                <w:sz w:val="21"/>
+              </w:rPr>
+              <w:t>data/processed/movies_by_genre.csv</w:t>
+            </w:r>
+          </w:p>
+        </w:tc>
+      </w:tr>
+      <w:tr>
+        <w:tc>
+          <w:tcPr>
+            <w:tcW w:type="dxa" w:w="2592"/>
+            <w:vAlign w:val="center"/>
+            <w:tcMar>
+              <w:top w:w="80" w:type="dxa"/>
+              <w:start w:w="120" w:type="dxa"/>
+              <w:bottom w:w="80" w:type="dxa"/>
+              <w:end w:w="120" w:type="dxa"/>
+            </w:tcMar>
+          </w:tcPr>
+          <w:p>
+            <w:pPr>
+              <w:spacing w:after="0" w:line="264" w:lineRule="auto"/>
+            </w:pPr>
+            <w:r>
+              <w:rPr>
+                <w:rFonts w:ascii="Calibri" w:hAnsi="Calibri" w:eastAsia="Microsoft YaHei"/>
+                <w:b w:val="0"/>
+                <w:color w:val="333333"/>
+                <w:sz w:val="21"/>
+              </w:rPr>
+              <w:t>国家/地区展开表</w:t>
+            </w:r>
+          </w:p>
+        </w:tc>
+        <w:tc>
+          <w:tcPr>
+            <w:tcW w:type="dxa" w:w="6768"/>
+            <w:vAlign w:val="center"/>
+            <w:tcMar>
+              <w:top w:w="80" w:type="dxa"/>
+              <w:start w:w="120" w:type="dxa"/>
+              <w:bottom w:w="80" w:type="dxa"/>
+              <w:end w:w="120" w:type="dxa"/>
+            </w:tcMar>
+          </w:tcPr>
+          <w:p>
+            <w:pPr>
+              <w:spacing w:after="0" w:line="264" w:lineRule="auto"/>
+            </w:pPr>
+            <w:r>
+              <w:rPr>
+                <w:rFonts w:ascii="Calibri" w:hAnsi="Calibri" w:eastAsia="Microsoft YaHei"/>
+                <w:b w:val="0"/>
+                <w:color w:val="333333"/>
+                <w:sz w:val="21"/>
+              </w:rPr>
+              <w:t>data/processed/movies_by_country.csv</w:t>
+            </w:r>
+          </w:p>
+        </w:tc>
+      </w:tr>
+      <w:tr>
+        <w:tc>
+          <w:tcPr>
+            <w:tcW w:type="dxa" w:w="2592"/>
+            <w:vAlign w:val="center"/>
+            <w:tcMar>
+              <w:top w:w="80" w:type="dxa"/>
+              <w:start w:w="120" w:type="dxa"/>
+              <w:bottom w:w="80" w:type="dxa"/>
+              <w:end w:w="120" w:type="dxa"/>
+            </w:tcMar>
+          </w:tcPr>
+          <w:p>
+            <w:pPr>
+              <w:spacing w:after="0" w:line="264" w:lineRule="auto"/>
+            </w:pPr>
+            <w:r>
+              <w:rPr>
+                <w:rFonts w:ascii="Calibri" w:hAnsi="Calibri" w:eastAsia="Microsoft YaHei"/>
+                <w:b w:val="0"/>
+                <w:color w:val="333333"/>
+                <w:sz w:val="21"/>
+              </w:rPr>
+              <w:t>统计摘要</w:t>
+            </w:r>
+          </w:p>
+        </w:tc>
+        <w:tc>
+          <w:tcPr>
+            <w:tcW w:type="dxa" w:w="6768"/>
+            <w:vAlign w:val="center"/>
+            <w:tcMar>
+              <w:top w:w="80" w:type="dxa"/>
+              <w:start w:w="120" w:type="dxa"/>
+              <w:bottom w:w="80" w:type="dxa"/>
+              <w:end w:w="120" w:type="dxa"/>
+            </w:tcMar>
+          </w:tcPr>
+          <w:p>
+            <w:pPr>
+              <w:spacing w:after="0" w:line="264" w:lineRule="auto"/>
+            </w:pPr>
+            <w:r>
+              <w:rPr>
+                <w:rFonts w:ascii="Calibri" w:hAnsi="Calibri" w:eastAsia="Microsoft YaHei"/>
+                <w:b w:val="0"/>
+                <w:color w:val="333333"/>
+                <w:sz w:val="21"/>
+              </w:rPr>
+              <w:t>data/processed/analysis_summary.json</w:t>
+            </w:r>
+          </w:p>
+        </w:tc>
+      </w:tr>
+      <w:tr>
+        <w:tc>
+          <w:tcPr>
+            <w:tcW w:type="dxa" w:w="2592"/>
+            <w:vAlign w:val="center"/>
+            <w:tcMar>
+              <w:top w:w="80" w:type="dxa"/>
+              <w:start w:w="120" w:type="dxa"/>
+              <w:bottom w:w="80" w:type="dxa"/>
+              <w:end w:w="120" w:type="dxa"/>
+            </w:tcMar>
+          </w:tcPr>
+          <w:p>
+            <w:pPr>
+              <w:spacing w:after="0" w:line="264" w:lineRule="auto"/>
+            </w:pPr>
+            <w:r>
+              <w:rPr>
+                <w:rFonts w:ascii="Calibri" w:hAnsi="Calibri" w:eastAsia="Microsoft YaHei"/>
+                <w:b w:val="0"/>
+                <w:color w:val="333333"/>
+                <w:sz w:val="21"/>
+              </w:rPr>
+              <w:t>分析图表</w:t>
+            </w:r>
+          </w:p>
+        </w:tc>
+        <w:tc>
+          <w:tcPr>
+            <w:tcW w:type="dxa" w:w="6768"/>
+            <w:vAlign w:val="center"/>
+            <w:tcMar>
+              <w:top w:w="80" w:type="dxa"/>
+              <w:start w:w="120" w:type="dxa"/>
+              <w:bottom w:w="80" w:type="dxa"/>
+              <w:end w:w="120" w:type="dxa"/>
+            </w:tcMar>
+          </w:tcPr>
+          <w:p>
+            <w:pPr>
+              <w:spacing w:after="0" w:line="264" w:lineRule="auto"/>
+            </w:pPr>
+            <w:r>
+              <w:rPr>
+                <w:rFonts w:ascii="Calibri" w:hAnsi="Calibri" w:eastAsia="Microsoft YaHei"/>
+                <w:b w:val="0"/>
+                <w:color w:val="333333"/>
+                <w:sz w:val="21"/>
+              </w:rPr>
+              <w:t>output/figures/*.png</w:t>
             </w:r>
           </w:p>
         </w:tc>
@@ -2557,7 +2371,94 @@
                 <w:color w:val="333333"/>
                 <w:sz w:val="21"/>
               </w:rPr>
-              <w:t>scripts/build_github_showcase_report.py 可单独重建本展示版 Word。</w:t>
+              <w:t>GitHub 展示版 DOCX/PDF</w:t>
+            </w:r>
+          </w:p>
+        </w:tc>
+      </w:tr>
+    </w:tbl>
+    <w:p>
+      <w:pPr>
+        <w:sectPr>
+          <w:pgSz w:w="12240" w:h="15840"/>
+          <w:pgMar w:top="1440" w:right="1440" w:bottom="1440" w:left="1440" w:header="708" w:footer="708" w:gutter="0"/>
+          <w:cols w:space="720"/>
+          <w:docGrid w:linePitch="360"/>
+        </w:sectPr>
+      </w:pPr>
+    </w:p>
+    <w:p>
+      <w:pPr>
+        <w:pStyle w:val="Heading1"/>
+      </w:pPr>
+      <w:r>
+        <w:t>6. 可复现操作</w:t>
+      </w:r>
+    </w:p>
+    <w:tbl>
+      <w:tblPr>
+        <w:tblStyle w:val="TableGrid"/>
+        <w:tblW w:type="dxa" w:w="9360"/>
+        <w:tblLayout w:type="fixed"/>
+        <w:tblLook w:firstColumn="1" w:firstRow="1" w:lastColumn="0" w:lastRow="0" w:noHBand="0" w:noVBand="1" w:val="04A0"/>
+        <w:tblInd w:w="120" w:type="dxa"/>
+      </w:tblPr>
+      <w:tblGrid>
+        <w:gridCol w:w="2592"/>
+        <w:gridCol w:w="6768"/>
+      </w:tblGrid>
+      <w:tr>
+        <w:tc>
+          <w:tcPr>
+            <w:tcW w:type="dxa" w:w="2592"/>
+            <w:vAlign w:val="center"/>
+            <w:tcMar>
+              <w:top w:w="80" w:type="dxa"/>
+              <w:start w:w="120" w:type="dxa"/>
+              <w:bottom w:w="80" w:type="dxa"/>
+              <w:end w:w="120" w:type="dxa"/>
+            </w:tcMar>
+            <w:shd w:fill="F2F4F7"/>
+          </w:tcPr>
+          <w:p>
+            <w:pPr>
+              <w:spacing w:after="0" w:line="264" w:lineRule="auto"/>
+            </w:pPr>
+            <w:r>
+              <w:rPr>
+                <w:rFonts w:ascii="Calibri" w:hAnsi="Calibri" w:eastAsia="Microsoft YaHei"/>
+                <w:b/>
+                <w:color w:val="0B2545"/>
+                <w:sz w:val="21"/>
+              </w:rPr>
+              <w:t>项目</w:t>
+            </w:r>
+          </w:p>
+        </w:tc>
+        <w:tc>
+          <w:tcPr>
+            <w:tcW w:type="dxa" w:w="6768"/>
+            <w:vAlign w:val="center"/>
+            <w:tcMar>
+              <w:top w:w="80" w:type="dxa"/>
+              <w:start w:w="120" w:type="dxa"/>
+              <w:bottom w:w="80" w:type="dxa"/>
+              <w:end w:w="120" w:type="dxa"/>
+            </w:tcMar>
+            <w:shd w:fill="F2F4F7"/>
+          </w:tcPr>
+          <w:p>
+            <w:pPr>
+              <w:spacing w:after="0" w:line="264" w:lineRule="auto"/>
+            </w:pPr>
+            <w:r>
+              <w:rPr>
+                <w:rFonts w:ascii="Calibri" w:hAnsi="Calibri" w:eastAsia="Microsoft YaHei"/>
+                <w:b/>
+                <w:color w:val="0B2545"/>
+                <w:sz w:val="21"/>
+              </w:rPr>
+              <w:t>说明</w:t>
             </w:r>
           </w:p>
         </w:tc>
@@ -2585,7 +2486,223 @@
                 <w:color w:val="333333"/>
                 <w:sz w:val="21"/>
               </w:rPr>
-              <w:t>测试方式</w:t>
+              <w:t>安装依赖</w:t>
+            </w:r>
+          </w:p>
+        </w:tc>
+        <w:tc>
+          <w:tcPr>
+            <w:tcW w:type="dxa" w:w="6768"/>
+            <w:vAlign w:val="center"/>
+            <w:tcMar>
+              <w:top w:w="80" w:type="dxa"/>
+              <w:start w:w="120" w:type="dxa"/>
+              <w:bottom w:w="80" w:type="dxa"/>
+              <w:end w:w="120" w:type="dxa"/>
+            </w:tcMar>
+          </w:tcPr>
+          <w:p>
+            <w:pPr>
+              <w:spacing w:after="0" w:line="264" w:lineRule="auto"/>
+            </w:pPr>
+            <w:r>
+              <w:rPr>
+                <w:rFonts w:ascii="Calibri" w:hAnsi="Calibri" w:eastAsia="Microsoft YaHei"/>
+                <w:b w:val="0"/>
+                <w:color w:val="333333"/>
+                <w:sz w:val="21"/>
+              </w:rPr>
+              <w:t>python -m venv .venv；.venv\Scripts\python.exe -m pip install -r requirements.txt</w:t>
+            </w:r>
+          </w:p>
+        </w:tc>
+      </w:tr>
+      <w:tr>
+        <w:tc>
+          <w:tcPr>
+            <w:tcW w:type="dxa" w:w="2592"/>
+            <w:vAlign w:val="center"/>
+            <w:tcMar>
+              <w:top w:w="80" w:type="dxa"/>
+              <w:start w:w="120" w:type="dxa"/>
+              <w:bottom w:w="80" w:type="dxa"/>
+              <w:end w:w="120" w:type="dxa"/>
+            </w:tcMar>
+          </w:tcPr>
+          <w:p>
+            <w:pPr>
+              <w:spacing w:after="0" w:line="264" w:lineRule="auto"/>
+            </w:pPr>
+            <w:r>
+              <w:rPr>
+                <w:rFonts w:ascii="Calibri" w:hAnsi="Calibri" w:eastAsia="Microsoft YaHei"/>
+                <w:b w:val="0"/>
+                <w:color w:val="333333"/>
+                <w:sz w:val="21"/>
+              </w:rPr>
+              <w:t>离线复现</w:t>
+            </w:r>
+          </w:p>
+        </w:tc>
+        <w:tc>
+          <w:tcPr>
+            <w:tcW w:type="dxa" w:w="6768"/>
+            <w:vAlign w:val="center"/>
+            <w:tcMar>
+              <w:top w:w="80" w:type="dxa"/>
+              <w:start w:w="120" w:type="dxa"/>
+              <w:bottom w:w="80" w:type="dxa"/>
+              <w:end w:w="120" w:type="dxa"/>
+            </w:tcMar>
+          </w:tcPr>
+          <w:p>
+            <w:pPr>
+              <w:spacing w:after="0" w:line="264" w:lineRule="auto"/>
+            </w:pPr>
+            <w:r>
+              <w:rPr>
+                <w:rFonts w:ascii="Calibri" w:hAnsi="Calibri" w:eastAsia="Microsoft YaHei"/>
+                <w:b w:val="0"/>
+                <w:color w:val="333333"/>
+                <w:sz w:val="21"/>
+              </w:rPr>
+              <w:t>python run_pipeline.py --skip-fetch --student-name ... --student-id ... --class-name ...</w:t>
+            </w:r>
+          </w:p>
+        </w:tc>
+      </w:tr>
+      <w:tr>
+        <w:tc>
+          <w:tcPr>
+            <w:tcW w:type="dxa" w:w="2592"/>
+            <w:vAlign w:val="center"/>
+            <w:tcMar>
+              <w:top w:w="80" w:type="dxa"/>
+              <w:start w:w="120" w:type="dxa"/>
+              <w:bottom w:w="80" w:type="dxa"/>
+              <w:end w:w="120" w:type="dxa"/>
+            </w:tcMar>
+          </w:tcPr>
+          <w:p>
+            <w:pPr>
+              <w:spacing w:after="0" w:line="264" w:lineRule="auto"/>
+            </w:pPr>
+            <w:r>
+              <w:rPr>
+                <w:rFonts w:ascii="Calibri" w:hAnsi="Calibri" w:eastAsia="Microsoft YaHei"/>
+                <w:b w:val="0"/>
+                <w:color w:val="333333"/>
+                <w:sz w:val="21"/>
+              </w:rPr>
+              <w:t>重新采集</w:t>
+            </w:r>
+          </w:p>
+        </w:tc>
+        <w:tc>
+          <w:tcPr>
+            <w:tcW w:type="dxa" w:w="6768"/>
+            <w:vAlign w:val="center"/>
+            <w:tcMar>
+              <w:top w:w="80" w:type="dxa"/>
+              <w:start w:w="120" w:type="dxa"/>
+              <w:bottom w:w="80" w:type="dxa"/>
+              <w:end w:w="120" w:type="dxa"/>
+            </w:tcMar>
+          </w:tcPr>
+          <w:p>
+            <w:pPr>
+              <w:spacing w:after="0" w:line="264" w:lineRule="auto"/>
+            </w:pPr>
+            <w:r>
+              <w:rPr>
+                <w:rFonts w:ascii="Calibri" w:hAnsi="Calibri" w:eastAsia="Microsoft YaHei"/>
+                <w:b w:val="0"/>
+                <w:color w:val="333333"/>
+                <w:sz w:val="21"/>
+              </w:rPr>
+              <w:t>python run_pipeline.py --fetch --student-name ... --student-id ... --class-name ...</w:t>
+            </w:r>
+          </w:p>
+        </w:tc>
+      </w:tr>
+      <w:tr>
+        <w:tc>
+          <w:tcPr>
+            <w:tcW w:type="dxa" w:w="2592"/>
+            <w:vAlign w:val="center"/>
+            <w:tcMar>
+              <w:top w:w="80" w:type="dxa"/>
+              <w:start w:w="120" w:type="dxa"/>
+              <w:bottom w:w="80" w:type="dxa"/>
+              <w:end w:w="120" w:type="dxa"/>
+            </w:tcMar>
+          </w:tcPr>
+          <w:p>
+            <w:pPr>
+              <w:spacing w:after="0" w:line="264" w:lineRule="auto"/>
+            </w:pPr>
+            <w:r>
+              <w:rPr>
+                <w:rFonts w:ascii="Calibri" w:hAnsi="Calibri" w:eastAsia="Microsoft YaHei"/>
+                <w:b w:val="0"/>
+                <w:color w:val="333333"/>
+                <w:sz w:val="21"/>
+              </w:rPr>
+              <w:t>重建展示报告</w:t>
+            </w:r>
+          </w:p>
+        </w:tc>
+        <w:tc>
+          <w:tcPr>
+            <w:tcW w:type="dxa" w:w="6768"/>
+            <w:vAlign w:val="center"/>
+            <w:tcMar>
+              <w:top w:w="80" w:type="dxa"/>
+              <w:start w:w="120" w:type="dxa"/>
+              <w:bottom w:w="80" w:type="dxa"/>
+              <w:end w:w="120" w:type="dxa"/>
+            </w:tcMar>
+          </w:tcPr>
+          <w:p>
+            <w:pPr>
+              <w:spacing w:after="0" w:line="264" w:lineRule="auto"/>
+            </w:pPr>
+            <w:r>
+              <w:rPr>
+                <w:rFonts w:ascii="Calibri" w:hAnsi="Calibri" w:eastAsia="Microsoft YaHei"/>
+                <w:b w:val="0"/>
+                <w:color w:val="333333"/>
+                <w:sz w:val="21"/>
+              </w:rPr>
+              <w:t>python scripts/build_github_showcase_report.py</w:t>
+            </w:r>
+          </w:p>
+        </w:tc>
+      </w:tr>
+      <w:tr>
+        <w:tc>
+          <w:tcPr>
+            <w:tcW w:type="dxa" w:w="2592"/>
+            <w:vAlign w:val="center"/>
+            <w:tcMar>
+              <w:top w:w="80" w:type="dxa"/>
+              <w:start w:w="120" w:type="dxa"/>
+              <w:bottom w:w="80" w:type="dxa"/>
+              <w:end w:w="120" w:type="dxa"/>
+            </w:tcMar>
+          </w:tcPr>
+          <w:p>
+            <w:pPr>
+              <w:spacing w:after="0" w:line="264" w:lineRule="auto"/>
+            </w:pPr>
+            <w:r>
+              <w:rPr>
+                <w:rFonts w:ascii="Calibri" w:hAnsi="Calibri" w:eastAsia="Microsoft YaHei"/>
+                <w:b w:val="0"/>
+                <w:color w:val="333333"/>
+                <w:sz w:val="21"/>
+              </w:rPr>
+              <w:t>运行测试</w:t>
             </w:r>
           </w:p>
         </w:tc>
@@ -2616,6 +2733,83 @@
           </w:p>
         </w:tc>
       </w:tr>
+    </w:tbl>
+    <w:p>
+      <w:pPr>
+        <w:pStyle w:val="Heading1"/>
+      </w:pPr>
+      <w:r>
+        <w:t>7. 项目实现说明</w:t>
+      </w:r>
+    </w:p>
+    <w:tbl>
+      <w:tblPr>
+        <w:tblStyle w:val="TableGrid"/>
+        <w:tblW w:type="dxa" w:w="9360"/>
+        <w:tblLayout w:type="fixed"/>
+        <w:tblLook w:firstColumn="1" w:firstRow="1" w:lastColumn="0" w:lastRow="0" w:noHBand="0" w:noVBand="1" w:val="04A0"/>
+        <w:tblInd w:w="120" w:type="dxa"/>
+      </w:tblPr>
+      <w:tblGrid>
+        <w:gridCol w:w="2592"/>
+        <w:gridCol w:w="6768"/>
+      </w:tblGrid>
+      <w:tr>
+        <w:tc>
+          <w:tcPr>
+            <w:tcW w:type="dxa" w:w="2592"/>
+            <w:vAlign w:val="center"/>
+            <w:tcMar>
+              <w:top w:w="80" w:type="dxa"/>
+              <w:start w:w="120" w:type="dxa"/>
+              <w:bottom w:w="80" w:type="dxa"/>
+              <w:end w:w="120" w:type="dxa"/>
+            </w:tcMar>
+            <w:shd w:fill="F2F4F7"/>
+          </w:tcPr>
+          <w:p>
+            <w:pPr>
+              <w:spacing w:after="0" w:line="264" w:lineRule="auto"/>
+            </w:pPr>
+            <w:r>
+              <w:rPr>
+                <w:rFonts w:ascii="Calibri" w:hAnsi="Calibri" w:eastAsia="Microsoft YaHei"/>
+                <w:b/>
+                <w:color w:val="0B2545"/>
+                <w:sz w:val="21"/>
+              </w:rPr>
+              <w:t>项目</w:t>
+            </w:r>
+          </w:p>
+        </w:tc>
+        <w:tc>
+          <w:tcPr>
+            <w:tcW w:type="dxa" w:w="6768"/>
+            <w:vAlign w:val="center"/>
+            <w:tcMar>
+              <w:top w:w="80" w:type="dxa"/>
+              <w:start w:w="120" w:type="dxa"/>
+              <w:bottom w:w="80" w:type="dxa"/>
+              <w:end w:w="120" w:type="dxa"/>
+            </w:tcMar>
+            <w:shd w:fill="F2F4F7"/>
+          </w:tcPr>
+          <w:p>
+            <w:pPr>
+              <w:spacing w:after="0" w:line="264" w:lineRule="auto"/>
+            </w:pPr>
+            <w:r>
+              <w:rPr>
+                <w:rFonts w:ascii="Calibri" w:hAnsi="Calibri" w:eastAsia="Microsoft YaHei"/>
+                <w:b/>
+                <w:color w:val="0B2545"/>
+                <w:sz w:val="21"/>
+              </w:rPr>
+              <w:t>说明</w:t>
+            </w:r>
+          </w:p>
+        </w:tc>
+      </w:tr>
       <w:tr>
         <w:tc>
           <w:tcPr>
@@ -2639,7 +2833,7 @@
                 <w:color w:val="333333"/>
                 <w:sz w:val="21"/>
               </w:rPr>
-              <w:t>文档补充</w:t>
+              <w:t>采集层</w:t>
             </w:r>
           </w:p>
         </w:tc>
@@ -2665,7 +2859,169 @@
                 <w:color w:val="333333"/>
                 <w:sz w:val="21"/>
               </w:rPr>
-              <w:t>README.md、docs/project_overview.md、docs/data_dictionary.md</w:t>
+              <w:t>分页访问公开榜单页面，解析排名、片名、年份、国家/地区、类型、评分和评价人数。</w:t>
+            </w:r>
+          </w:p>
+        </w:tc>
+      </w:tr>
+      <w:tr>
+        <w:tc>
+          <w:tcPr>
+            <w:tcW w:type="dxa" w:w="2592"/>
+            <w:vAlign w:val="center"/>
+            <w:tcMar>
+              <w:top w:w="80" w:type="dxa"/>
+              <w:start w:w="120" w:type="dxa"/>
+              <w:bottom w:w="80" w:type="dxa"/>
+              <w:end w:w="120" w:type="dxa"/>
+            </w:tcMar>
+          </w:tcPr>
+          <w:p>
+            <w:pPr>
+              <w:spacing w:after="0" w:line="264" w:lineRule="auto"/>
+            </w:pPr>
+            <w:r>
+              <w:rPr>
+                <w:rFonts w:ascii="Calibri" w:hAnsi="Calibri" w:eastAsia="Microsoft YaHei"/>
+                <w:b w:val="0"/>
+                <w:color w:val="333333"/>
+                <w:sz w:val="21"/>
+              </w:rPr>
+              <w:t>清洗层</w:t>
+            </w:r>
+          </w:p>
+        </w:tc>
+        <w:tc>
+          <w:tcPr>
+            <w:tcW w:type="dxa" w:w="6768"/>
+            <w:vAlign w:val="center"/>
+            <w:tcMar>
+              <w:top w:w="80" w:type="dxa"/>
+              <w:start w:w="120" w:type="dxa"/>
+              <w:bottom w:w="80" w:type="dxa"/>
+              <w:end w:w="120" w:type="dxa"/>
+            </w:tcMar>
+          </w:tcPr>
+          <w:p>
+            <w:pPr>
+              <w:spacing w:after="0" w:line="264" w:lineRule="auto"/>
+            </w:pPr>
+            <w:r>
+              <w:rPr>
+                <w:rFonts w:ascii="Calibri" w:hAnsi="Calibri" w:eastAsia="Microsoft YaHei"/>
+                <w:b w:val="0"/>
+                <w:color w:val="333333"/>
+                <w:sz w:val="21"/>
+              </w:rPr>
+              <w:t>统一字段类型，处理多值字段，移除重复项，并输出一电影一行的主表。</w:t>
+            </w:r>
+          </w:p>
+        </w:tc>
+      </w:tr>
+      <w:tr>
+        <w:tc>
+          <w:tcPr>
+            <w:tcW w:type="dxa" w:w="2592"/>
+            <w:vAlign w:val="center"/>
+            <w:tcMar>
+              <w:top w:w="80" w:type="dxa"/>
+              <w:start w:w="120" w:type="dxa"/>
+              <w:bottom w:w="80" w:type="dxa"/>
+              <w:end w:w="120" w:type="dxa"/>
+            </w:tcMar>
+          </w:tcPr>
+          <w:p>
+            <w:pPr>
+              <w:spacing w:after="0" w:line="264" w:lineRule="auto"/>
+            </w:pPr>
+            <w:r>
+              <w:rPr>
+                <w:rFonts w:ascii="Calibri" w:hAnsi="Calibri" w:eastAsia="Microsoft YaHei"/>
+                <w:b w:val="0"/>
+                <w:color w:val="333333"/>
+                <w:sz w:val="21"/>
+              </w:rPr>
+              <w:t>分析层</w:t>
+            </w:r>
+          </w:p>
+        </w:tc>
+        <w:tc>
+          <w:tcPr>
+            <w:tcW w:type="dxa" w:w="6768"/>
+            <w:vAlign w:val="center"/>
+            <w:tcMar>
+              <w:top w:w="80" w:type="dxa"/>
+              <w:start w:w="120" w:type="dxa"/>
+              <w:bottom w:w="80" w:type="dxa"/>
+              <w:end w:w="120" w:type="dxa"/>
+            </w:tcMar>
+          </w:tcPr>
+          <w:p>
+            <w:pPr>
+              <w:spacing w:after="0" w:line="264" w:lineRule="auto"/>
+            </w:pPr>
+            <w:r>
+              <w:rPr>
+                <w:rFonts w:ascii="Calibri" w:hAnsi="Calibri" w:eastAsia="Microsoft YaHei"/>
+                <w:b w:val="0"/>
+                <w:color w:val="333333"/>
+                <w:sz w:val="21"/>
+              </w:rPr>
+              <w:t>生成评分、类型、国家/地区、年代和相关关系统计。</w:t>
+            </w:r>
+          </w:p>
+        </w:tc>
+      </w:tr>
+      <w:tr>
+        <w:tc>
+          <w:tcPr>
+            <w:tcW w:type="dxa" w:w="2592"/>
+            <w:vAlign w:val="center"/>
+            <w:tcMar>
+              <w:top w:w="80" w:type="dxa"/>
+              <w:start w:w="120" w:type="dxa"/>
+              <w:bottom w:w="80" w:type="dxa"/>
+              <w:end w:w="120" w:type="dxa"/>
+            </w:tcMar>
+          </w:tcPr>
+          <w:p>
+            <w:pPr>
+              <w:spacing w:after="0" w:line="264" w:lineRule="auto"/>
+            </w:pPr>
+            <w:r>
+              <w:rPr>
+                <w:rFonts w:ascii="Calibri" w:hAnsi="Calibri" w:eastAsia="Microsoft YaHei"/>
+                <w:b w:val="0"/>
+                <w:color w:val="333333"/>
+                <w:sz w:val="21"/>
+              </w:rPr>
+              <w:t>输出层</w:t>
+            </w:r>
+          </w:p>
+        </w:tc>
+        <w:tc>
+          <w:tcPr>
+            <w:tcW w:type="dxa" w:w="6768"/>
+            <w:vAlign w:val="center"/>
+            <w:tcMar>
+              <w:top w:w="80" w:type="dxa"/>
+              <w:start w:w="120" w:type="dxa"/>
+              <w:bottom w:w="80" w:type="dxa"/>
+              <w:end w:w="120" w:type="dxa"/>
+            </w:tcMar>
+          </w:tcPr>
+          <w:p>
+            <w:pPr>
+              <w:spacing w:after="0" w:line="264" w:lineRule="auto"/>
+            </w:pPr>
+            <w:r>
+              <w:rPr>
+                <w:rFonts w:ascii="Calibri" w:hAnsi="Calibri" w:eastAsia="Microsoft YaHei"/>
+                <w:b w:val="0"/>
+                <w:color w:val="333333"/>
+                <w:sz w:val="21"/>
+              </w:rPr>
+              <w:t>保存 CSV/JSON、PNG 图表、Word 报告和 PDF 报告。</w:t>
             </w:r>
           </w:p>
         </w:tc>
@@ -2676,7 +3032,7 @@
         <w:pStyle w:val="Heading1"/>
       </w:pPr>
       <w:r>
-        <w:t>7. 局限性与后续方向</w:t>
+        <w:t>8. 局限性</w:t>
       </w:r>
     </w:p>
     <w:p>
@@ -2721,7 +3077,7 @@
           <w:color w:val="333333"/>
           <w:sz w:val="21"/>
         </w:rPr>
-        <w:t>后续可加入交互式看板、自动化 CI、配置化运行和更丰富的文本分析。</w:t>
+        <w:t>当前项目以探索性分析为主，后续可加入交互式看板、自动化 CI 和更丰富的文本分析。</w:t>
       </w:r>
     </w:p>
     <w:sectPr>

</xml_diff>

<commit_message>
Add machine learning showcase extension
</commit_message>
<xml_diff>
--- a/output/报告/豆瓣电影Top200数据分析报告_GitHub展示版.docx
+++ b/output/报告/豆瓣电影Top200数据分析报告_GitHub展示版.docx
@@ -690,6 +690,36 @@
           <w:sz w:val="21"/>
         </w:rPr>
         <w:t>排名越靠前评分整体越高；评分与评价人数之间的线性相关性较弱。</w:t>
+      </w:r>
+    </w:p>
+    <w:p>
+      <w:pPr>
+        <w:pStyle w:val="ListBullet"/>
+        <w:spacing w:after="80" w:line="264" w:lineRule="auto"/>
+      </w:pPr>
+      <w:r>
+        <w:rPr>
+          <w:rFonts w:ascii="Calibri" w:hAnsi="Calibri" w:eastAsia="Microsoft YaHei"/>
+          <w:b w:val="0"/>
+          <w:color w:val="333333"/>
+          <w:sz w:val="21"/>
+        </w:rPr>
+        <w:t>机器学习扩展中，随机森林 的 5 折交叉验证 MAE 为 0.1459，优于平均分基线 0.2034。</w:t>
+      </w:r>
+    </w:p>
+    <w:p>
+      <w:pPr>
+        <w:pStyle w:val="ListBullet"/>
+        <w:spacing w:after="80" w:line="264" w:lineRule="auto"/>
+      </w:pPr>
+      <w:r>
+        <w:rPr>
+          <w:rFonts w:ascii="Calibri" w:hAnsi="Calibri" w:eastAsia="Microsoft YaHei"/>
+          <w:b w:val="0"/>
+          <w:color w:val="333333"/>
+          <w:sz w:val="21"/>
+        </w:rPr>
+        <w:t>KMeans 分群形成华语剧情、欧美剧情、悬疑惊悚、动画奇幻等电影画像，可作为结果展示补充。</w:t>
       </w:r>
     </w:p>
     <w:p>
@@ -1703,7 +1733,1045 @@
         <w:pStyle w:val="Heading1"/>
       </w:pPr>
       <w:r>
-        <w:t>4. 可视化结果</w:t>
+        <w:t>4. 机器学习探索</w:t>
+      </w:r>
+    </w:p>
+    <w:p>
+      <w:pPr>
+        <w:spacing w:after="120" w:line="264" w:lineRule="auto"/>
+      </w:pPr>
+      <w:r>
+        <w:rPr>
+          <w:rFonts w:ascii="Calibri" w:hAnsi="Calibri" w:eastAsia="Microsoft YaHei"/>
+          <w:b w:val="0"/>
+          <w:color w:val="333333"/>
+          <w:sz w:val="22"/>
+        </w:rPr>
+        <w:t>该扩展使用年份、距今年数、评价人数对数、类型标签数、国家/地区数，以及热门类型和国家/地区的多热编码，进行评分预测和电影画像分群。由于样本量只有 200 条且评分范围较窄，模型定位为探索性分析，不作为真实评分预测服务。</w:t>
+      </w:r>
+    </w:p>
+    <w:tbl>
+      <w:tblPr>
+        <w:tblStyle w:val="TableGrid"/>
+        <w:tblW w:type="dxa" w:w="9360"/>
+        <w:tblLayout w:type="fixed"/>
+        <w:tblLook w:firstColumn="1" w:firstRow="1" w:lastColumn="0" w:lastRow="0" w:noHBand="0" w:noVBand="1" w:val="04A0"/>
+        <w:tblInd w:w="120" w:type="dxa"/>
+      </w:tblPr>
+      <w:tblGrid>
+        <w:gridCol w:w="3456"/>
+        <w:gridCol w:w="1872"/>
+        <w:gridCol w:w="1872"/>
+        <w:gridCol w:w="2160"/>
+      </w:tblGrid>
+      <w:tr>
+        <w:tc>
+          <w:tcPr>
+            <w:tcW w:type="dxa" w:w="3456"/>
+            <w:vAlign w:val="center"/>
+            <w:tcMar>
+              <w:top w:w="80" w:type="dxa"/>
+              <w:start w:w="120" w:type="dxa"/>
+              <w:bottom w:w="80" w:type="dxa"/>
+              <w:end w:w="120" w:type="dxa"/>
+            </w:tcMar>
+            <w:shd w:fill="F2F4F7"/>
+          </w:tcPr>
+          <w:p>
+            <w:pPr>
+              <w:spacing w:after="0" w:line="264" w:lineRule="auto"/>
+            </w:pPr>
+            <w:r>
+              <w:rPr>
+                <w:rFonts w:ascii="Calibri" w:hAnsi="Calibri" w:eastAsia="Microsoft YaHei"/>
+                <w:b/>
+                <w:color w:val="0B2545"/>
+                <w:sz w:val="21"/>
+              </w:rPr>
+              <w:t>模型</w:t>
+            </w:r>
+          </w:p>
+        </w:tc>
+        <w:tc>
+          <w:tcPr>
+            <w:tcW w:type="dxa" w:w="1872"/>
+            <w:vAlign w:val="center"/>
+            <w:tcMar>
+              <w:top w:w="80" w:type="dxa"/>
+              <w:start w:w="120" w:type="dxa"/>
+              <w:bottom w:w="80" w:type="dxa"/>
+              <w:end w:w="120" w:type="dxa"/>
+            </w:tcMar>
+            <w:shd w:fill="F2F4F7"/>
+          </w:tcPr>
+          <w:p>
+            <w:pPr>
+              <w:spacing w:after="0" w:line="264" w:lineRule="auto"/>
+            </w:pPr>
+            <w:r>
+              <w:rPr>
+                <w:rFonts w:ascii="Calibri" w:hAnsi="Calibri" w:eastAsia="Microsoft YaHei"/>
+                <w:b/>
+                <w:color w:val="0B2545"/>
+                <w:sz w:val="21"/>
+              </w:rPr>
+              <w:t>MAE</w:t>
+            </w:r>
+          </w:p>
+        </w:tc>
+        <w:tc>
+          <w:tcPr>
+            <w:tcW w:type="dxa" w:w="1872"/>
+            <w:vAlign w:val="center"/>
+            <w:tcMar>
+              <w:top w:w="80" w:type="dxa"/>
+              <w:start w:w="120" w:type="dxa"/>
+              <w:bottom w:w="80" w:type="dxa"/>
+              <w:end w:w="120" w:type="dxa"/>
+            </w:tcMar>
+            <w:shd w:fill="F2F4F7"/>
+          </w:tcPr>
+          <w:p>
+            <w:pPr>
+              <w:spacing w:after="0" w:line="264" w:lineRule="auto"/>
+            </w:pPr>
+            <w:r>
+              <w:rPr>
+                <w:rFonts w:ascii="Calibri" w:hAnsi="Calibri" w:eastAsia="Microsoft YaHei"/>
+                <w:b/>
+                <w:color w:val="0B2545"/>
+                <w:sz w:val="21"/>
+              </w:rPr>
+              <w:t>RMSE</w:t>
+            </w:r>
+          </w:p>
+        </w:tc>
+        <w:tc>
+          <w:tcPr>
+            <w:tcW w:type="dxa" w:w="2160"/>
+            <w:vAlign w:val="center"/>
+            <w:tcMar>
+              <w:top w:w="80" w:type="dxa"/>
+              <w:start w:w="120" w:type="dxa"/>
+              <w:bottom w:w="80" w:type="dxa"/>
+              <w:end w:w="120" w:type="dxa"/>
+            </w:tcMar>
+            <w:shd w:fill="F2F4F7"/>
+          </w:tcPr>
+          <w:p>
+            <w:pPr>
+              <w:spacing w:after="0" w:line="264" w:lineRule="auto"/>
+            </w:pPr>
+            <w:r>
+              <w:rPr>
+                <w:rFonts w:ascii="Calibri" w:hAnsi="Calibri" w:eastAsia="Microsoft YaHei"/>
+                <w:b/>
+                <w:color w:val="0B2545"/>
+                <w:sz w:val="21"/>
+              </w:rPr>
+              <w:t>R²</w:t>
+            </w:r>
+          </w:p>
+        </w:tc>
+      </w:tr>
+      <w:tr>
+        <w:tc>
+          <w:tcPr>
+            <w:tcW w:type="dxa" w:w="3456"/>
+            <w:vAlign w:val="center"/>
+            <w:tcMar>
+              <w:top w:w="80" w:type="dxa"/>
+              <w:start w:w="120" w:type="dxa"/>
+              <w:bottom w:w="80" w:type="dxa"/>
+              <w:end w:w="120" w:type="dxa"/>
+            </w:tcMar>
+          </w:tcPr>
+          <w:p>
+            <w:pPr>
+              <w:spacing w:after="0" w:line="264" w:lineRule="auto"/>
+            </w:pPr>
+            <w:r>
+              <w:rPr>
+                <w:rFonts w:ascii="Calibri" w:hAnsi="Calibri" w:eastAsia="Microsoft YaHei"/>
+                <w:b w:val="0"/>
+                <w:color w:val="333333"/>
+                <w:sz w:val="21"/>
+              </w:rPr>
+              <w:t>平均分基线</w:t>
+            </w:r>
+          </w:p>
+        </w:tc>
+        <w:tc>
+          <w:tcPr>
+            <w:tcW w:type="dxa" w:w="1872"/>
+            <w:vAlign w:val="center"/>
+            <w:tcMar>
+              <w:top w:w="80" w:type="dxa"/>
+              <w:start w:w="120" w:type="dxa"/>
+              <w:bottom w:w="80" w:type="dxa"/>
+              <w:end w:w="120" w:type="dxa"/>
+            </w:tcMar>
+          </w:tcPr>
+          <w:p>
+            <w:pPr>
+              <w:spacing w:after="0" w:line="264" w:lineRule="auto"/>
+            </w:pPr>
+            <w:r>
+              <w:rPr>
+                <w:rFonts w:ascii="Calibri" w:hAnsi="Calibri" w:eastAsia="Microsoft YaHei"/>
+                <w:b w:val="0"/>
+                <w:color w:val="333333"/>
+                <w:sz w:val="21"/>
+              </w:rPr>
+              <w:t>0.2034</w:t>
+            </w:r>
+          </w:p>
+        </w:tc>
+        <w:tc>
+          <w:tcPr>
+            <w:tcW w:type="dxa" w:w="1872"/>
+            <w:vAlign w:val="center"/>
+            <w:tcMar>
+              <w:top w:w="80" w:type="dxa"/>
+              <w:start w:w="120" w:type="dxa"/>
+              <w:bottom w:w="80" w:type="dxa"/>
+              <w:end w:w="120" w:type="dxa"/>
+            </w:tcMar>
+          </w:tcPr>
+          <w:p>
+            <w:pPr>
+              <w:spacing w:after="0" w:line="264" w:lineRule="auto"/>
+            </w:pPr>
+            <w:r>
+              <w:rPr>
+                <w:rFonts w:ascii="Calibri" w:hAnsi="Calibri" w:eastAsia="Microsoft YaHei"/>
+                <w:b w:val="0"/>
+                <w:color w:val="333333"/>
+                <w:sz w:val="21"/>
+              </w:rPr>
+              <w:t>0.2426</w:t>
+            </w:r>
+          </w:p>
+        </w:tc>
+        <w:tc>
+          <w:tcPr>
+            <w:tcW w:type="dxa" w:w="2160"/>
+            <w:vAlign w:val="center"/>
+            <w:tcMar>
+              <w:top w:w="80" w:type="dxa"/>
+              <w:start w:w="120" w:type="dxa"/>
+              <w:bottom w:w="80" w:type="dxa"/>
+              <w:end w:w="120" w:type="dxa"/>
+            </w:tcMar>
+          </w:tcPr>
+          <w:p>
+            <w:pPr>
+              <w:spacing w:after="0" w:line="264" w:lineRule="auto"/>
+            </w:pPr>
+            <w:r>
+              <w:rPr>
+                <w:rFonts w:ascii="Calibri" w:hAnsi="Calibri" w:eastAsia="Microsoft YaHei"/>
+                <w:b w:val="0"/>
+                <w:color w:val="333333"/>
+                <w:sz w:val="21"/>
+              </w:rPr>
+              <w:t>-0.0088</w:t>
+            </w:r>
+          </w:p>
+        </w:tc>
+      </w:tr>
+      <w:tr>
+        <w:tc>
+          <w:tcPr>
+            <w:tcW w:type="dxa" w:w="3456"/>
+            <w:vAlign w:val="center"/>
+            <w:tcMar>
+              <w:top w:w="80" w:type="dxa"/>
+              <w:start w:w="120" w:type="dxa"/>
+              <w:bottom w:w="80" w:type="dxa"/>
+              <w:end w:w="120" w:type="dxa"/>
+            </w:tcMar>
+          </w:tcPr>
+          <w:p>
+            <w:pPr>
+              <w:spacing w:after="0" w:line="264" w:lineRule="auto"/>
+            </w:pPr>
+            <w:r>
+              <w:rPr>
+                <w:rFonts w:ascii="Calibri" w:hAnsi="Calibri" w:eastAsia="Microsoft YaHei"/>
+                <w:b w:val="0"/>
+                <w:color w:val="333333"/>
+                <w:sz w:val="21"/>
+              </w:rPr>
+              <w:t>岭回归</w:t>
+            </w:r>
+          </w:p>
+        </w:tc>
+        <w:tc>
+          <w:tcPr>
+            <w:tcW w:type="dxa" w:w="1872"/>
+            <w:vAlign w:val="center"/>
+            <w:tcMar>
+              <w:top w:w="80" w:type="dxa"/>
+              <w:start w:w="120" w:type="dxa"/>
+              <w:bottom w:w="80" w:type="dxa"/>
+              <w:end w:w="120" w:type="dxa"/>
+            </w:tcMar>
+          </w:tcPr>
+          <w:p>
+            <w:pPr>
+              <w:spacing w:after="0" w:line="264" w:lineRule="auto"/>
+            </w:pPr>
+            <w:r>
+              <w:rPr>
+                <w:rFonts w:ascii="Calibri" w:hAnsi="Calibri" w:eastAsia="Microsoft YaHei"/>
+                <w:b w:val="0"/>
+                <w:color w:val="333333"/>
+                <w:sz w:val="21"/>
+              </w:rPr>
+              <w:t>0.1700</w:t>
+            </w:r>
+          </w:p>
+        </w:tc>
+        <w:tc>
+          <w:tcPr>
+            <w:tcW w:type="dxa" w:w="1872"/>
+            <w:vAlign w:val="center"/>
+            <w:tcMar>
+              <w:top w:w="80" w:type="dxa"/>
+              <w:start w:w="120" w:type="dxa"/>
+              <w:bottom w:w="80" w:type="dxa"/>
+              <w:end w:w="120" w:type="dxa"/>
+            </w:tcMar>
+          </w:tcPr>
+          <w:p>
+            <w:pPr>
+              <w:spacing w:after="0" w:line="264" w:lineRule="auto"/>
+            </w:pPr>
+            <w:r>
+              <w:rPr>
+                <w:rFonts w:ascii="Calibri" w:hAnsi="Calibri" w:eastAsia="Microsoft YaHei"/>
+                <w:b w:val="0"/>
+                <w:color w:val="333333"/>
+                <w:sz w:val="21"/>
+              </w:rPr>
+              <w:t>0.2172</w:t>
+            </w:r>
+          </w:p>
+        </w:tc>
+        <w:tc>
+          <w:tcPr>
+            <w:tcW w:type="dxa" w:w="2160"/>
+            <w:vAlign w:val="center"/>
+            <w:tcMar>
+              <w:top w:w="80" w:type="dxa"/>
+              <w:start w:w="120" w:type="dxa"/>
+              <w:bottom w:w="80" w:type="dxa"/>
+              <w:end w:w="120" w:type="dxa"/>
+            </w:tcMar>
+          </w:tcPr>
+          <w:p>
+            <w:pPr>
+              <w:spacing w:after="0" w:line="264" w:lineRule="auto"/>
+            </w:pPr>
+            <w:r>
+              <w:rPr>
+                <w:rFonts w:ascii="Calibri" w:hAnsi="Calibri" w:eastAsia="Microsoft YaHei"/>
+                <w:b w:val="0"/>
+                <w:color w:val="333333"/>
+                <w:sz w:val="21"/>
+              </w:rPr>
+              <w:t>0.1814</w:t>
+            </w:r>
+          </w:p>
+        </w:tc>
+      </w:tr>
+      <w:tr>
+        <w:tc>
+          <w:tcPr>
+            <w:tcW w:type="dxa" w:w="3456"/>
+            <w:vAlign w:val="center"/>
+            <w:tcMar>
+              <w:top w:w="80" w:type="dxa"/>
+              <w:start w:w="120" w:type="dxa"/>
+              <w:bottom w:w="80" w:type="dxa"/>
+              <w:end w:w="120" w:type="dxa"/>
+            </w:tcMar>
+          </w:tcPr>
+          <w:p>
+            <w:pPr>
+              <w:spacing w:after="0" w:line="264" w:lineRule="auto"/>
+            </w:pPr>
+            <w:r>
+              <w:rPr>
+                <w:rFonts w:ascii="Calibri" w:hAnsi="Calibri" w:eastAsia="Microsoft YaHei"/>
+                <w:b w:val="0"/>
+                <w:color w:val="333333"/>
+                <w:sz w:val="21"/>
+              </w:rPr>
+              <w:t>随机森林</w:t>
+            </w:r>
+          </w:p>
+        </w:tc>
+        <w:tc>
+          <w:tcPr>
+            <w:tcW w:type="dxa" w:w="1872"/>
+            <w:vAlign w:val="center"/>
+            <w:tcMar>
+              <w:top w:w="80" w:type="dxa"/>
+              <w:start w:w="120" w:type="dxa"/>
+              <w:bottom w:w="80" w:type="dxa"/>
+              <w:end w:w="120" w:type="dxa"/>
+            </w:tcMar>
+          </w:tcPr>
+          <w:p>
+            <w:pPr>
+              <w:spacing w:after="0" w:line="264" w:lineRule="auto"/>
+            </w:pPr>
+            <w:r>
+              <w:rPr>
+                <w:rFonts w:ascii="Calibri" w:hAnsi="Calibri" w:eastAsia="Microsoft YaHei"/>
+                <w:b w:val="0"/>
+                <w:color w:val="333333"/>
+                <w:sz w:val="21"/>
+              </w:rPr>
+              <w:t>0.1459</w:t>
+            </w:r>
+          </w:p>
+        </w:tc>
+        <w:tc>
+          <w:tcPr>
+            <w:tcW w:type="dxa" w:w="1872"/>
+            <w:vAlign w:val="center"/>
+            <w:tcMar>
+              <w:top w:w="80" w:type="dxa"/>
+              <w:start w:w="120" w:type="dxa"/>
+              <w:bottom w:w="80" w:type="dxa"/>
+              <w:end w:w="120" w:type="dxa"/>
+            </w:tcMar>
+          </w:tcPr>
+          <w:p>
+            <w:pPr>
+              <w:spacing w:after="0" w:line="264" w:lineRule="auto"/>
+            </w:pPr>
+            <w:r>
+              <w:rPr>
+                <w:rFonts w:ascii="Calibri" w:hAnsi="Calibri" w:eastAsia="Microsoft YaHei"/>
+                <w:b w:val="0"/>
+                <w:color w:val="333333"/>
+                <w:sz w:val="21"/>
+              </w:rPr>
+              <w:t>0.1837</w:t>
+            </w:r>
+          </w:p>
+        </w:tc>
+        <w:tc>
+          <w:tcPr>
+            <w:tcW w:type="dxa" w:w="2160"/>
+            <w:vAlign w:val="center"/>
+            <w:tcMar>
+              <w:top w:w="80" w:type="dxa"/>
+              <w:start w:w="120" w:type="dxa"/>
+              <w:bottom w:w="80" w:type="dxa"/>
+              <w:end w:w="120" w:type="dxa"/>
+            </w:tcMar>
+          </w:tcPr>
+          <w:p>
+            <w:pPr>
+              <w:spacing w:after="0" w:line="264" w:lineRule="auto"/>
+            </w:pPr>
+            <w:r>
+              <w:rPr>
+                <w:rFonts w:ascii="Calibri" w:hAnsi="Calibri" w:eastAsia="Microsoft YaHei"/>
+                <w:b w:val="0"/>
+                <w:color w:val="333333"/>
+                <w:sz w:val="21"/>
+              </w:rPr>
+              <w:t>0.4171</w:t>
+            </w:r>
+          </w:p>
+        </w:tc>
+      </w:tr>
+    </w:tbl>
+    <w:p>
+      <w:pPr>
+        <w:spacing w:after="120" w:line="264" w:lineRule="auto"/>
+      </w:pPr>
+      <w:r>
+        <w:rPr>
+          <w:rFonts w:ascii="Calibri" w:hAnsi="Calibri" w:eastAsia="Microsoft YaHei"/>
+          <w:b w:val="0"/>
+          <w:color w:val="333333"/>
+          <w:sz w:val="22"/>
+        </w:rPr>
+        <w:t>特征重要性显示，评价人数（对数）、上映年份、距今年数和类型标签数对模型误差影响最大，说明榜单内评分差异与热度、年代及类型结构存在一定关系。</w:t>
+      </w:r>
+    </w:p>
+    <w:tbl>
+      <w:tblPr>
+        <w:tblStyle w:val="TableGrid"/>
+        <w:tblW w:type="dxa" w:w="9360"/>
+        <w:tblLayout w:type="fixed"/>
+        <w:tblLook w:firstColumn="1" w:firstRow="1" w:lastColumn="0" w:lastRow="0" w:noHBand="0" w:noVBand="1" w:val="04A0"/>
+        <w:tblInd w:w="120" w:type="dxa"/>
+      </w:tblPr>
+      <w:tblGrid>
+        <w:gridCol w:w="2304"/>
+        <w:gridCol w:w="1152"/>
+        <w:gridCol w:w="1296"/>
+        <w:gridCol w:w="4608"/>
+      </w:tblGrid>
+      <w:tr>
+        <w:tc>
+          <w:tcPr>
+            <w:tcW w:type="dxa" w:w="2304"/>
+            <w:vAlign w:val="center"/>
+            <w:tcMar>
+              <w:top w:w="80" w:type="dxa"/>
+              <w:start w:w="120" w:type="dxa"/>
+              <w:bottom w:w="80" w:type="dxa"/>
+              <w:end w:w="120" w:type="dxa"/>
+            </w:tcMar>
+            <w:shd w:fill="F2F4F7"/>
+          </w:tcPr>
+          <w:p>
+            <w:pPr>
+              <w:spacing w:after="0" w:line="264" w:lineRule="auto"/>
+            </w:pPr>
+            <w:r>
+              <w:rPr>
+                <w:rFonts w:ascii="Calibri" w:hAnsi="Calibri" w:eastAsia="Microsoft YaHei"/>
+                <w:b/>
+                <w:color w:val="0B2545"/>
+                <w:sz w:val="21"/>
+              </w:rPr>
+              <w:t>分群画像</w:t>
+            </w:r>
+          </w:p>
+        </w:tc>
+        <w:tc>
+          <w:tcPr>
+            <w:tcW w:type="dxa" w:w="1152"/>
+            <w:vAlign w:val="center"/>
+            <w:tcMar>
+              <w:top w:w="80" w:type="dxa"/>
+              <w:start w:w="120" w:type="dxa"/>
+              <w:bottom w:w="80" w:type="dxa"/>
+              <w:end w:w="120" w:type="dxa"/>
+            </w:tcMar>
+            <w:shd w:fill="F2F4F7"/>
+          </w:tcPr>
+          <w:p>
+            <w:pPr>
+              <w:spacing w:after="0" w:line="264" w:lineRule="auto"/>
+            </w:pPr>
+            <w:r>
+              <w:rPr>
+                <w:rFonts w:ascii="Calibri" w:hAnsi="Calibri" w:eastAsia="Microsoft YaHei"/>
+                <w:b/>
+                <w:color w:val="0B2545"/>
+                <w:sz w:val="21"/>
+              </w:rPr>
+              <w:t>数量</w:t>
+            </w:r>
+          </w:p>
+        </w:tc>
+        <w:tc>
+          <w:tcPr>
+            <w:tcW w:type="dxa" w:w="1296"/>
+            <w:vAlign w:val="center"/>
+            <w:tcMar>
+              <w:top w:w="80" w:type="dxa"/>
+              <w:start w:w="120" w:type="dxa"/>
+              <w:bottom w:w="80" w:type="dxa"/>
+              <w:end w:w="120" w:type="dxa"/>
+            </w:tcMar>
+            <w:shd w:fill="F2F4F7"/>
+          </w:tcPr>
+          <w:p>
+            <w:pPr>
+              <w:spacing w:after="0" w:line="264" w:lineRule="auto"/>
+            </w:pPr>
+            <w:r>
+              <w:rPr>
+                <w:rFonts w:ascii="Calibri" w:hAnsi="Calibri" w:eastAsia="Microsoft YaHei"/>
+                <w:b/>
+                <w:color w:val="0B2545"/>
+                <w:sz w:val="21"/>
+              </w:rPr>
+              <w:t>平均评分</w:t>
+            </w:r>
+          </w:p>
+        </w:tc>
+        <w:tc>
+          <w:tcPr>
+            <w:tcW w:type="dxa" w:w="4608"/>
+            <w:vAlign w:val="center"/>
+            <w:tcMar>
+              <w:top w:w="80" w:type="dxa"/>
+              <w:start w:w="120" w:type="dxa"/>
+              <w:bottom w:w="80" w:type="dxa"/>
+              <w:end w:w="120" w:type="dxa"/>
+            </w:tcMar>
+            <w:shd w:fill="F2F4F7"/>
+          </w:tcPr>
+          <w:p>
+            <w:pPr>
+              <w:spacing w:after="0" w:line="264" w:lineRule="auto"/>
+            </w:pPr>
+            <w:r>
+              <w:rPr>
+                <w:rFonts w:ascii="Calibri" w:hAnsi="Calibri" w:eastAsia="Microsoft YaHei"/>
+                <w:b/>
+                <w:color w:val="0B2545"/>
+                <w:sz w:val="21"/>
+              </w:rPr>
+              <w:t>代表影片</w:t>
+            </w:r>
+          </w:p>
+        </w:tc>
+      </w:tr>
+      <w:tr>
+        <w:tc>
+          <w:tcPr>
+            <w:tcW w:type="dxa" w:w="2304"/>
+            <w:vAlign w:val="center"/>
+            <w:tcMar>
+              <w:top w:w="80" w:type="dxa"/>
+              <w:start w:w="120" w:type="dxa"/>
+              <w:bottom w:w="80" w:type="dxa"/>
+              <w:end w:w="120" w:type="dxa"/>
+            </w:tcMar>
+          </w:tcPr>
+          <w:p>
+            <w:pPr>
+              <w:spacing w:after="0" w:line="264" w:lineRule="auto"/>
+            </w:pPr>
+            <w:r>
+              <w:rPr>
+                <w:rFonts w:ascii="Calibri" w:hAnsi="Calibri" w:eastAsia="Microsoft YaHei"/>
+                <w:b w:val="0"/>
+                <w:color w:val="333333"/>
+                <w:sz w:val="21"/>
+              </w:rPr>
+              <w:t>华语剧情高口碑片</w:t>
+            </w:r>
+          </w:p>
+        </w:tc>
+        <w:tc>
+          <w:tcPr>
+            <w:tcW w:type="dxa" w:w="1152"/>
+            <w:vAlign w:val="center"/>
+            <w:tcMar>
+              <w:top w:w="80" w:type="dxa"/>
+              <w:start w:w="120" w:type="dxa"/>
+              <w:bottom w:w="80" w:type="dxa"/>
+              <w:end w:w="120" w:type="dxa"/>
+            </w:tcMar>
+          </w:tcPr>
+          <w:p>
+            <w:pPr>
+              <w:spacing w:after="0" w:line="264" w:lineRule="auto"/>
+            </w:pPr>
+            <w:r>
+              <w:rPr>
+                <w:rFonts w:ascii="Calibri" w:hAnsi="Calibri" w:eastAsia="Microsoft YaHei"/>
+                <w:b w:val="0"/>
+                <w:color w:val="333333"/>
+                <w:sz w:val="21"/>
+              </w:rPr>
+              <w:t>26</w:t>
+            </w:r>
+          </w:p>
+        </w:tc>
+        <w:tc>
+          <w:tcPr>
+            <w:tcW w:type="dxa" w:w="1296"/>
+            <w:vAlign w:val="center"/>
+            <w:tcMar>
+              <w:top w:w="80" w:type="dxa"/>
+              <w:start w:w="120" w:type="dxa"/>
+              <w:bottom w:w="80" w:type="dxa"/>
+              <w:end w:w="120" w:type="dxa"/>
+            </w:tcMar>
+          </w:tcPr>
+          <w:p>
+            <w:pPr>
+              <w:spacing w:after="0" w:line="264" w:lineRule="auto"/>
+            </w:pPr>
+            <w:r>
+              <w:rPr>
+                <w:rFonts w:ascii="Calibri" w:hAnsi="Calibri" w:eastAsia="Microsoft YaHei"/>
+                <w:b w:val="0"/>
+                <w:color w:val="333333"/>
+                <w:sz w:val="21"/>
+              </w:rPr>
+              <w:t>8.946</w:t>
+            </w:r>
+          </w:p>
+        </w:tc>
+        <w:tc>
+          <w:tcPr>
+            <w:tcW w:type="dxa" w:w="4608"/>
+            <w:vAlign w:val="center"/>
+            <w:tcMar>
+              <w:top w:w="80" w:type="dxa"/>
+              <w:start w:w="120" w:type="dxa"/>
+              <w:bottom w:w="80" w:type="dxa"/>
+              <w:end w:w="120" w:type="dxa"/>
+            </w:tcMar>
+          </w:tcPr>
+          <w:p>
+            <w:pPr>
+              <w:spacing w:after="0" w:line="264" w:lineRule="auto"/>
+            </w:pPr>
+            <w:r>
+              <w:rPr>
+                <w:rFonts w:ascii="Calibri" w:hAnsi="Calibri" w:eastAsia="Microsoft YaHei"/>
+                <w:b w:val="0"/>
+                <w:color w:val="333333"/>
+                <w:sz w:val="21"/>
+              </w:rPr>
+              <w:t>霸王别姬、背靠背，脸对脸、活着、鬼子来了</w:t>
+            </w:r>
+          </w:p>
+        </w:tc>
+      </w:tr>
+      <w:tr>
+        <w:tc>
+          <w:tcPr>
+            <w:tcW w:type="dxa" w:w="2304"/>
+            <w:vAlign w:val="center"/>
+            <w:tcMar>
+              <w:top w:w="80" w:type="dxa"/>
+              <w:start w:w="120" w:type="dxa"/>
+              <w:bottom w:w="80" w:type="dxa"/>
+              <w:end w:w="120" w:type="dxa"/>
+            </w:tcMar>
+          </w:tcPr>
+          <w:p>
+            <w:pPr>
+              <w:spacing w:after="0" w:line="264" w:lineRule="auto"/>
+            </w:pPr>
+            <w:r>
+              <w:rPr>
+                <w:rFonts w:ascii="Calibri" w:hAnsi="Calibri" w:eastAsia="Microsoft YaHei"/>
+                <w:b w:val="0"/>
+                <w:color w:val="333333"/>
+                <w:sz w:val="21"/>
+              </w:rPr>
+              <w:t>欧美剧情经典片</w:t>
+            </w:r>
+          </w:p>
+        </w:tc>
+        <w:tc>
+          <w:tcPr>
+            <w:tcW w:type="dxa" w:w="1152"/>
+            <w:vAlign w:val="center"/>
+            <w:tcMar>
+              <w:top w:w="80" w:type="dxa"/>
+              <w:start w:w="120" w:type="dxa"/>
+              <w:bottom w:w="80" w:type="dxa"/>
+              <w:end w:w="120" w:type="dxa"/>
+            </w:tcMar>
+          </w:tcPr>
+          <w:p>
+            <w:pPr>
+              <w:spacing w:after="0" w:line="264" w:lineRule="auto"/>
+            </w:pPr>
+            <w:r>
+              <w:rPr>
+                <w:rFonts w:ascii="Calibri" w:hAnsi="Calibri" w:eastAsia="Microsoft YaHei"/>
+                <w:b w:val="0"/>
+                <w:color w:val="333333"/>
+                <w:sz w:val="21"/>
+              </w:rPr>
+              <w:t>98</w:t>
+            </w:r>
+          </w:p>
+        </w:tc>
+        <w:tc>
+          <w:tcPr>
+            <w:tcW w:type="dxa" w:w="1296"/>
+            <w:vAlign w:val="center"/>
+            <w:tcMar>
+              <w:top w:w="80" w:type="dxa"/>
+              <w:start w:w="120" w:type="dxa"/>
+              <w:bottom w:w="80" w:type="dxa"/>
+              <w:end w:w="120" w:type="dxa"/>
+            </w:tcMar>
+          </w:tcPr>
+          <w:p>
+            <w:pPr>
+              <w:spacing w:after="0" w:line="264" w:lineRule="auto"/>
+            </w:pPr>
+            <w:r>
+              <w:rPr>
+                <w:rFonts w:ascii="Calibri" w:hAnsi="Calibri" w:eastAsia="Microsoft YaHei"/>
+                <w:b w:val="0"/>
+                <w:color w:val="333333"/>
+                <w:sz w:val="21"/>
+              </w:rPr>
+              <w:t>9.074</w:t>
+            </w:r>
+          </w:p>
+        </w:tc>
+        <w:tc>
+          <w:tcPr>
+            <w:tcW w:type="dxa" w:w="4608"/>
+            <w:vAlign w:val="center"/>
+            <w:tcMar>
+              <w:top w:w="80" w:type="dxa"/>
+              <w:start w:w="120" w:type="dxa"/>
+              <w:bottom w:w="80" w:type="dxa"/>
+              <w:end w:w="120" w:type="dxa"/>
+            </w:tcMar>
+          </w:tcPr>
+          <w:p>
+            <w:pPr>
+              <w:spacing w:after="0" w:line="264" w:lineRule="auto"/>
+            </w:pPr>
+            <w:r>
+              <w:rPr>
+                <w:rFonts w:ascii="Calibri" w:hAnsi="Calibri" w:eastAsia="Microsoft YaHei"/>
+                <w:b w:val="0"/>
+                <w:color w:val="333333"/>
+                <w:sz w:val="21"/>
+              </w:rPr>
+              <w:t>肖申克的救赎、泰坦尼克号、阿甘正传、美丽人生</w:t>
+            </w:r>
+          </w:p>
+        </w:tc>
+      </w:tr>
+      <w:tr>
+        <w:tc>
+          <w:tcPr>
+            <w:tcW w:type="dxa" w:w="2304"/>
+            <w:vAlign w:val="center"/>
+            <w:tcMar>
+              <w:top w:w="80" w:type="dxa"/>
+              <w:start w:w="120" w:type="dxa"/>
+              <w:bottom w:w="80" w:type="dxa"/>
+              <w:end w:w="120" w:type="dxa"/>
+            </w:tcMar>
+          </w:tcPr>
+          <w:p>
+            <w:pPr>
+              <w:spacing w:after="0" w:line="264" w:lineRule="auto"/>
+            </w:pPr>
+            <w:r>
+              <w:rPr>
+                <w:rFonts w:ascii="Calibri" w:hAnsi="Calibri" w:eastAsia="Microsoft YaHei"/>
+                <w:b w:val="0"/>
+                <w:color w:val="333333"/>
+                <w:sz w:val="21"/>
+              </w:rPr>
+              <w:t>悬疑惊悚与犯罪片</w:t>
+            </w:r>
+          </w:p>
+        </w:tc>
+        <w:tc>
+          <w:tcPr>
+            <w:tcW w:type="dxa" w:w="1152"/>
+            <w:vAlign w:val="center"/>
+            <w:tcMar>
+              <w:top w:w="80" w:type="dxa"/>
+              <w:start w:w="120" w:type="dxa"/>
+              <w:bottom w:w="80" w:type="dxa"/>
+              <w:end w:w="120" w:type="dxa"/>
+            </w:tcMar>
+          </w:tcPr>
+          <w:p>
+            <w:pPr>
+              <w:spacing w:after="0" w:line="264" w:lineRule="auto"/>
+            </w:pPr>
+            <w:r>
+              <w:rPr>
+                <w:rFonts w:ascii="Calibri" w:hAnsi="Calibri" w:eastAsia="Microsoft YaHei"/>
+                <w:b w:val="0"/>
+                <w:color w:val="333333"/>
+                <w:sz w:val="21"/>
+              </w:rPr>
+              <w:t>31</w:t>
+            </w:r>
+          </w:p>
+        </w:tc>
+        <w:tc>
+          <w:tcPr>
+            <w:tcW w:type="dxa" w:w="1296"/>
+            <w:vAlign w:val="center"/>
+            <w:tcMar>
+              <w:top w:w="80" w:type="dxa"/>
+              <w:start w:w="120" w:type="dxa"/>
+              <w:bottom w:w="80" w:type="dxa"/>
+              <w:end w:w="120" w:type="dxa"/>
+            </w:tcMar>
+          </w:tcPr>
+          <w:p>
+            <w:pPr>
+              <w:spacing w:after="0" w:line="264" w:lineRule="auto"/>
+            </w:pPr>
+            <w:r>
+              <w:rPr>
+                <w:rFonts w:ascii="Calibri" w:hAnsi="Calibri" w:eastAsia="Microsoft YaHei"/>
+                <w:b w:val="0"/>
+                <w:color w:val="333333"/>
+                <w:sz w:val="21"/>
+              </w:rPr>
+              <w:t>8.910</w:t>
+            </w:r>
+          </w:p>
+        </w:tc>
+        <w:tc>
+          <w:tcPr>
+            <w:tcW w:type="dxa" w:w="4608"/>
+            <w:vAlign w:val="center"/>
+            <w:tcMar>
+              <w:top w:w="80" w:type="dxa"/>
+              <w:start w:w="120" w:type="dxa"/>
+              <w:bottom w:w="80" w:type="dxa"/>
+              <w:end w:w="120" w:type="dxa"/>
+            </w:tcMar>
+          </w:tcPr>
+          <w:p>
+            <w:pPr>
+              <w:spacing w:after="0" w:line="264" w:lineRule="auto"/>
+            </w:pPr>
+            <w:r>
+              <w:rPr>
+                <w:rFonts w:ascii="Calibri" w:hAnsi="Calibri" w:eastAsia="Microsoft YaHei"/>
+                <w:b w:val="0"/>
+                <w:color w:val="333333"/>
+                <w:sz w:val="21"/>
+              </w:rPr>
+              <w:t>控方证人、盗梦空间、无间道、蝙蝠侠：黑暗骑士</w:t>
+            </w:r>
+          </w:p>
+        </w:tc>
+      </w:tr>
+      <w:tr>
+        <w:tc>
+          <w:tcPr>
+            <w:tcW w:type="dxa" w:w="2304"/>
+            <w:vAlign w:val="center"/>
+            <w:tcMar>
+              <w:top w:w="80" w:type="dxa"/>
+              <w:start w:w="120" w:type="dxa"/>
+              <w:bottom w:w="80" w:type="dxa"/>
+              <w:end w:w="120" w:type="dxa"/>
+            </w:tcMar>
+          </w:tcPr>
+          <w:p>
+            <w:pPr>
+              <w:spacing w:after="0" w:line="264" w:lineRule="auto"/>
+            </w:pPr>
+            <w:r>
+              <w:rPr>
+                <w:rFonts w:ascii="Calibri" w:hAnsi="Calibri" w:eastAsia="Microsoft YaHei"/>
+                <w:b w:val="0"/>
+                <w:color w:val="333333"/>
+                <w:sz w:val="21"/>
+              </w:rPr>
+              <w:t>动画奇幻与冒险片</w:t>
+            </w:r>
+          </w:p>
+        </w:tc>
+        <w:tc>
+          <w:tcPr>
+            <w:tcW w:type="dxa" w:w="1152"/>
+            <w:vAlign w:val="center"/>
+            <w:tcMar>
+              <w:top w:w="80" w:type="dxa"/>
+              <w:start w:w="120" w:type="dxa"/>
+              <w:bottom w:w="80" w:type="dxa"/>
+              <w:end w:w="120" w:type="dxa"/>
+            </w:tcMar>
+          </w:tcPr>
+          <w:p>
+            <w:pPr>
+              <w:spacing w:after="0" w:line="264" w:lineRule="auto"/>
+            </w:pPr>
+            <w:r>
+              <w:rPr>
+                <w:rFonts w:ascii="Calibri" w:hAnsi="Calibri" w:eastAsia="Microsoft YaHei"/>
+                <w:b w:val="0"/>
+                <w:color w:val="333333"/>
+                <w:sz w:val="21"/>
+              </w:rPr>
+              <w:t>45</w:t>
+            </w:r>
+          </w:p>
+        </w:tc>
+        <w:tc>
+          <w:tcPr>
+            <w:tcW w:type="dxa" w:w="1296"/>
+            <w:vAlign w:val="center"/>
+            <w:tcMar>
+              <w:top w:w="80" w:type="dxa"/>
+              <w:start w:w="120" w:type="dxa"/>
+              <w:bottom w:w="80" w:type="dxa"/>
+              <w:end w:w="120" w:type="dxa"/>
+            </w:tcMar>
+          </w:tcPr>
+          <w:p>
+            <w:pPr>
+              <w:spacing w:after="0" w:line="264" w:lineRule="auto"/>
+            </w:pPr>
+            <w:r>
+              <w:rPr>
+                <w:rFonts w:ascii="Calibri" w:hAnsi="Calibri" w:eastAsia="Microsoft YaHei"/>
+                <w:b w:val="0"/>
+                <w:color w:val="333333"/>
+                <w:sz w:val="21"/>
+              </w:rPr>
+              <w:t>8.978</w:t>
+            </w:r>
+          </w:p>
+        </w:tc>
+        <w:tc>
+          <w:tcPr>
+            <w:tcW w:type="dxa" w:w="4608"/>
+            <w:vAlign w:val="center"/>
+            <w:tcMar>
+              <w:top w:w="80" w:type="dxa"/>
+              <w:start w:w="120" w:type="dxa"/>
+              <w:bottom w:w="80" w:type="dxa"/>
+              <w:end w:w="120" w:type="dxa"/>
+            </w:tcMar>
+          </w:tcPr>
+          <w:p>
+            <w:pPr>
+              <w:spacing w:after="0" w:line="264" w:lineRule="auto"/>
+            </w:pPr>
+            <w:r>
+              <w:rPr>
+                <w:rFonts w:ascii="Calibri" w:hAnsi="Calibri" w:eastAsia="Microsoft YaHei"/>
+                <w:b w:val="0"/>
+                <w:color w:val="333333"/>
+                <w:sz w:val="21"/>
+              </w:rPr>
+              <w:t>千与千寻、星际穿越、大闹天宫、疯狂动物城</w:t>
+            </w:r>
+          </w:p>
+        </w:tc>
+      </w:tr>
+    </w:tbl>
+    <w:p>
+      <w:pPr>
+        <w:sectPr>
+          <w:pgSz w:w="12240" w:h="15840"/>
+          <w:pgMar w:top="1440" w:right="1440" w:bottom="1440" w:left="1440" w:header="708" w:footer="708" w:gutter="0"/>
+          <w:cols w:space="720"/>
+          <w:docGrid w:linePitch="360"/>
+        </w:sectPr>
+      </w:pPr>
+    </w:p>
+    <w:p>
+      <w:pPr>
+        <w:pStyle w:val="Heading1"/>
+      </w:pPr>
+      <w:r>
+        <w:t>5. 可视化结果</w:t>
       </w:r>
     </w:p>
     <w:p>
@@ -1713,7 +2781,7 @@
       <w:r>
         <w:drawing>
           <wp:inline xmlns:a="http://schemas.openxmlformats.org/drawingml/2006/main" xmlns:pic="http://schemas.openxmlformats.org/drawingml/2006/picture">
-            <wp:extent cx="5394960" cy="3093245"/>
+            <wp:extent cx="5394960" cy="3089768"/>
             <wp:docPr id="1" name="Picture 1"/>
             <wp:cNvGraphicFramePr>
               <a:graphicFrameLocks noChangeAspect="1"/>
@@ -1734,7 +2802,7 @@
                   <pic:spPr>
                     <a:xfrm>
                       <a:off x="0" y="0"/>
-                      <a:ext cx="5394960" cy="3093245"/>
+                      <a:ext cx="5394960" cy="3089768"/>
                     </a:xfrm>
                     <a:prstGeom prst="rect"/>
                   </pic:spPr>
@@ -1767,7 +2835,7 @@
       <w:r>
         <w:drawing>
           <wp:inline xmlns:a="http://schemas.openxmlformats.org/drawingml/2006/main" xmlns:pic="http://schemas.openxmlformats.org/drawingml/2006/picture">
-            <wp:extent cx="5394960" cy="3576411"/>
+            <wp:extent cx="5394960" cy="3571027"/>
             <wp:docPr id="2" name="Picture 2"/>
             <wp:cNvGraphicFramePr>
               <a:graphicFrameLocks noChangeAspect="1"/>
@@ -1788,7 +2856,7 @@
                   <pic:spPr>
                     <a:xfrm>
                       <a:off x="0" y="0"/>
-                      <a:ext cx="5394960" cy="3576411"/>
+                      <a:ext cx="5394960" cy="3571027"/>
                     </a:xfrm>
                     <a:prstGeom prst="rect"/>
                   </pic:spPr>
@@ -1821,7 +2889,7 @@
       <w:r>
         <w:drawing>
           <wp:inline xmlns:a="http://schemas.openxmlformats.org/drawingml/2006/main" xmlns:pic="http://schemas.openxmlformats.org/drawingml/2006/picture">
-            <wp:extent cx="5394960" cy="3577753"/>
+            <wp:extent cx="5394960" cy="3573049"/>
             <wp:docPr id="3" name="Picture 3"/>
             <wp:cNvGraphicFramePr>
               <a:graphicFrameLocks noChangeAspect="1"/>
@@ -1842,7 +2910,7 @@
                   <pic:spPr>
                     <a:xfrm>
                       <a:off x="0" y="0"/>
-                      <a:ext cx="5394960" cy="3577753"/>
+                      <a:ext cx="5394960" cy="3573049"/>
                     </a:xfrm>
                     <a:prstGeom prst="rect"/>
                   </pic:spPr>
@@ -1875,7 +2943,7 @@
       <w:r>
         <w:drawing>
           <wp:inline xmlns:a="http://schemas.openxmlformats.org/drawingml/2006/main" xmlns:pic="http://schemas.openxmlformats.org/drawingml/2006/picture">
-            <wp:extent cx="5394960" cy="2309315"/>
+            <wp:extent cx="5394960" cy="2305862"/>
             <wp:docPr id="4" name="Picture 4"/>
             <wp:cNvGraphicFramePr>
               <a:graphicFrameLocks noChangeAspect="1"/>
@@ -1896,7 +2964,7 @@
                   <pic:spPr>
                     <a:xfrm>
                       <a:off x="0" y="0"/>
-                      <a:ext cx="5394960" cy="2309315"/>
+                      <a:ext cx="5394960" cy="2305862"/>
                     </a:xfrm>
                     <a:prstGeom prst="rect"/>
                   </pic:spPr>
@@ -1929,7 +2997,7 @@
       <w:r>
         <w:drawing>
           <wp:inline xmlns:a="http://schemas.openxmlformats.org/drawingml/2006/main" xmlns:pic="http://schemas.openxmlformats.org/drawingml/2006/picture">
-            <wp:extent cx="5394960" cy="3277899"/>
+            <wp:extent cx="5394960" cy="3268509"/>
             <wp:docPr id="5" name="Picture 5"/>
             <wp:cNvGraphicFramePr>
               <a:graphicFrameLocks noChangeAspect="1"/>
@@ -1950,7 +3018,7 @@
                   <pic:spPr>
                     <a:xfrm>
                       <a:off x="0" y="0"/>
-                      <a:ext cx="5394960" cy="3277899"/>
+                      <a:ext cx="5394960" cy="3268509"/>
                     </a:xfrm>
                     <a:prstGeom prst="rect"/>
                   </pic:spPr>
@@ -1978,10 +3046,172 @@
     </w:p>
     <w:p>
       <w:pPr>
+        <w:jc w:val="center"/>
+      </w:pPr>
+      <w:r>
+        <w:drawing>
+          <wp:inline xmlns:a="http://schemas.openxmlformats.org/drawingml/2006/main" xmlns:pic="http://schemas.openxmlformats.org/drawingml/2006/picture">
+            <wp:extent cx="5394960" cy="3043736"/>
+            <wp:docPr id="6" name="Picture 6"/>
+            <wp:cNvGraphicFramePr>
+              <a:graphicFrameLocks noChangeAspect="1"/>
+            </wp:cNvGraphicFramePr>
+            <a:graphic>
+              <a:graphicData uri="http://schemas.openxmlformats.org/drawingml/2006/picture">
+                <pic:pic>
+                  <pic:nvPicPr>
+                    <pic:cNvPr id="0" name="08_机器学习评分预测对比.png"/>
+                    <pic:cNvPicPr/>
+                  </pic:nvPicPr>
+                  <pic:blipFill>
+                    <a:blip r:embed="rId15"/>
+                    <a:stretch>
+                      <a:fillRect/>
+                    </a:stretch>
+                  </pic:blipFill>
+                  <pic:spPr>
+                    <a:xfrm>
+                      <a:off x="0" y="0"/>
+                      <a:ext cx="5394960" cy="3043736"/>
+                    </a:xfrm>
+                    <a:prstGeom prst="rect"/>
+                  </pic:spPr>
+                </pic:pic>
+              </a:graphicData>
+            </a:graphic>
+          </wp:inline>
+        </w:drawing>
+      </w:r>
+    </w:p>
+    <w:p>
+      <w:pPr>
+        <w:spacing w:before="40" w:after="160"/>
+        <w:jc w:val="center"/>
+      </w:pPr>
+      <w:r>
+        <w:rPr>
+          <w:rFonts w:ascii="Calibri" w:hAnsi="Calibri" w:eastAsia="Microsoft YaHei"/>
+          <w:b w:val="0"/>
+          <w:color w:val="666666"/>
+          <w:sz w:val="18"/>
+        </w:rPr>
+        <w:t>图 6 机器学习评分预测 MAE 对比</w:t>
+      </w:r>
+    </w:p>
+    <w:p>
+      <w:pPr>
+        <w:jc w:val="center"/>
+      </w:pPr>
+      <w:r>
+        <w:drawing>
+          <wp:inline xmlns:a="http://schemas.openxmlformats.org/drawingml/2006/main" xmlns:pic="http://schemas.openxmlformats.org/drawingml/2006/picture">
+            <wp:extent cx="5394960" cy="3213502"/>
+            <wp:docPr id="7" name="Picture 7"/>
+            <wp:cNvGraphicFramePr>
+              <a:graphicFrameLocks noChangeAspect="1"/>
+            </wp:cNvGraphicFramePr>
+            <a:graphic>
+              <a:graphicData uri="http://schemas.openxmlformats.org/drawingml/2006/picture">
+                <pic:pic>
+                  <pic:nvPicPr>
+                    <pic:cNvPr id="0" name="09_机器学习特征重要性.png"/>
+                    <pic:cNvPicPr/>
+                  </pic:nvPicPr>
+                  <pic:blipFill>
+                    <a:blip r:embed="rId16"/>
+                    <a:stretch>
+                      <a:fillRect/>
+                    </a:stretch>
+                  </pic:blipFill>
+                  <pic:spPr>
+                    <a:xfrm>
+                      <a:off x="0" y="0"/>
+                      <a:ext cx="5394960" cy="3213502"/>
+                    </a:xfrm>
+                    <a:prstGeom prst="rect"/>
+                  </pic:spPr>
+                </pic:pic>
+              </a:graphicData>
+            </a:graphic>
+          </wp:inline>
+        </w:drawing>
+      </w:r>
+    </w:p>
+    <w:p>
+      <w:pPr>
+        <w:spacing w:before="40" w:after="160"/>
+        <w:jc w:val="center"/>
+      </w:pPr>
+      <w:r>
+        <w:rPr>
+          <w:rFonts w:ascii="Calibri" w:hAnsi="Calibri" w:eastAsia="Microsoft YaHei"/>
+          <w:b w:val="0"/>
+          <w:color w:val="666666"/>
+          <w:sz w:val="18"/>
+        </w:rPr>
+        <w:t>图 7 随机森林置换特征重要性</w:t>
+      </w:r>
+    </w:p>
+    <w:p>
+      <w:pPr>
+        <w:jc w:val="center"/>
+      </w:pPr>
+      <w:r>
+        <w:drawing>
+          <wp:inline xmlns:a="http://schemas.openxmlformats.org/drawingml/2006/main" xmlns:pic="http://schemas.openxmlformats.org/drawingml/2006/picture">
+            <wp:extent cx="5394960" cy="3424879"/>
+            <wp:docPr id="8" name="Picture 8"/>
+            <wp:cNvGraphicFramePr>
+              <a:graphicFrameLocks noChangeAspect="1"/>
+            </wp:cNvGraphicFramePr>
+            <a:graphic>
+              <a:graphicData uri="http://schemas.openxmlformats.org/drawingml/2006/picture">
+                <pic:pic>
+                  <pic:nvPicPr>
+                    <pic:cNvPr id="0" name="10_电影画像分群.png"/>
+                    <pic:cNvPicPr/>
+                  </pic:nvPicPr>
+                  <pic:blipFill>
+                    <a:blip r:embed="rId17"/>
+                    <a:stretch>
+                      <a:fillRect/>
+                    </a:stretch>
+                  </pic:blipFill>
+                  <pic:spPr>
+                    <a:xfrm>
+                      <a:off x="0" y="0"/>
+                      <a:ext cx="5394960" cy="3424879"/>
+                    </a:xfrm>
+                    <a:prstGeom prst="rect"/>
+                  </pic:spPr>
+                </pic:pic>
+              </a:graphicData>
+            </a:graphic>
+          </wp:inline>
+        </w:drawing>
+      </w:r>
+    </w:p>
+    <w:p>
+      <w:pPr>
+        <w:spacing w:before="40" w:after="160"/>
+        <w:jc w:val="center"/>
+      </w:pPr>
+      <w:r>
+        <w:rPr>
+          <w:rFonts w:ascii="Calibri" w:hAnsi="Calibri" w:eastAsia="Microsoft YaHei"/>
+          <w:b w:val="0"/>
+          <w:color w:val="666666"/>
+          <w:sz w:val="18"/>
+        </w:rPr>
+        <w:t>图 8 电影画像分群二维投影</w:t>
+      </w:r>
+    </w:p>
+    <w:p>
+      <w:pPr>
         <w:pStyle w:val="Heading1"/>
       </w:pPr>
       <w:r>
-        <w:t>5. 项目输出</w:t>
+        <w:t>6. 项目输出</w:t>
       </w:r>
     </w:p>
     <w:tbl>
@@ -2291,6 +3521,114 @@
                 <w:color w:val="333333"/>
                 <w:sz w:val="21"/>
               </w:rPr>
+              <w:t>机器学习摘要</w:t>
+            </w:r>
+          </w:p>
+        </w:tc>
+        <w:tc>
+          <w:tcPr>
+            <w:tcW w:type="dxa" w:w="6768"/>
+            <w:vAlign w:val="center"/>
+            <w:tcMar>
+              <w:top w:w="80" w:type="dxa"/>
+              <w:start w:w="120" w:type="dxa"/>
+              <w:bottom w:w="80" w:type="dxa"/>
+              <w:end w:w="120" w:type="dxa"/>
+            </w:tcMar>
+          </w:tcPr>
+          <w:p>
+            <w:pPr>
+              <w:spacing w:after="0" w:line="264" w:lineRule="auto"/>
+            </w:pPr>
+            <w:r>
+              <w:rPr>
+                <w:rFonts w:ascii="Calibri" w:hAnsi="Calibri" w:eastAsia="Microsoft YaHei"/>
+                <w:b w:val="0"/>
+                <w:color w:val="333333"/>
+                <w:sz w:val="21"/>
+              </w:rPr>
+              <w:t>data/processed/ml_summary.json</w:t>
+            </w:r>
+          </w:p>
+        </w:tc>
+      </w:tr>
+      <w:tr>
+        <w:tc>
+          <w:tcPr>
+            <w:tcW w:type="dxa" w:w="2592"/>
+            <w:vAlign w:val="center"/>
+            <w:tcMar>
+              <w:top w:w="80" w:type="dxa"/>
+              <w:start w:w="120" w:type="dxa"/>
+              <w:bottom w:w="80" w:type="dxa"/>
+              <w:end w:w="120" w:type="dxa"/>
+            </w:tcMar>
+          </w:tcPr>
+          <w:p>
+            <w:pPr>
+              <w:spacing w:after="0" w:line="264" w:lineRule="auto"/>
+            </w:pPr>
+            <w:r>
+              <w:rPr>
+                <w:rFonts w:ascii="Calibri" w:hAnsi="Calibri" w:eastAsia="Microsoft YaHei"/>
+                <w:b w:val="0"/>
+                <w:color w:val="333333"/>
+                <w:sz w:val="21"/>
+              </w:rPr>
+              <w:t>电影分群结果</w:t>
+            </w:r>
+          </w:p>
+        </w:tc>
+        <w:tc>
+          <w:tcPr>
+            <w:tcW w:type="dxa" w:w="6768"/>
+            <w:vAlign w:val="center"/>
+            <w:tcMar>
+              <w:top w:w="80" w:type="dxa"/>
+              <w:start w:w="120" w:type="dxa"/>
+              <w:bottom w:w="80" w:type="dxa"/>
+              <w:end w:w="120" w:type="dxa"/>
+            </w:tcMar>
+          </w:tcPr>
+          <w:p>
+            <w:pPr>
+              <w:spacing w:after="0" w:line="264" w:lineRule="auto"/>
+            </w:pPr>
+            <w:r>
+              <w:rPr>
+                <w:rFonts w:ascii="Calibri" w:hAnsi="Calibri" w:eastAsia="Microsoft YaHei"/>
+                <w:b w:val="0"/>
+                <w:color w:val="333333"/>
+                <w:sz w:val="21"/>
+              </w:rPr>
+              <w:t>data/processed/movie_ml_clusters.csv</w:t>
+            </w:r>
+          </w:p>
+        </w:tc>
+      </w:tr>
+      <w:tr>
+        <w:tc>
+          <w:tcPr>
+            <w:tcW w:type="dxa" w:w="2592"/>
+            <w:vAlign w:val="center"/>
+            <w:tcMar>
+              <w:top w:w="80" w:type="dxa"/>
+              <w:start w:w="120" w:type="dxa"/>
+              <w:bottom w:w="80" w:type="dxa"/>
+              <w:end w:w="120" w:type="dxa"/>
+            </w:tcMar>
+          </w:tcPr>
+          <w:p>
+            <w:pPr>
+              <w:spacing w:after="0" w:line="264" w:lineRule="auto"/>
+            </w:pPr>
+            <w:r>
+              <w:rPr>
+                <w:rFonts w:ascii="Calibri" w:hAnsi="Calibri" w:eastAsia="Microsoft YaHei"/>
+                <w:b w:val="0"/>
+                <w:color w:val="333333"/>
+                <w:sz w:val="21"/>
+              </w:rPr>
               <w:t>分析图表</w:t>
             </w:r>
           </w:p>
@@ -2392,7 +3730,7 @@
         <w:pStyle w:val="Heading1"/>
       </w:pPr>
       <w:r>
-        <w:t>6. 可复现操作</w:t>
+        <w:t>7. 可复现操作</w:t>
       </w:r>
     </w:p>
     <w:tbl>
@@ -2648,6 +3986,60 @@
                 <w:color w:val="333333"/>
                 <w:sz w:val="21"/>
               </w:rPr>
+              <w:t>运行 ML 扩展</w:t>
+            </w:r>
+          </w:p>
+        </w:tc>
+        <w:tc>
+          <w:tcPr>
+            <w:tcW w:type="dxa" w:w="6768"/>
+            <w:vAlign w:val="center"/>
+            <w:tcMar>
+              <w:top w:w="80" w:type="dxa"/>
+              <w:start w:w="120" w:type="dxa"/>
+              <w:bottom w:w="80" w:type="dxa"/>
+              <w:end w:w="120" w:type="dxa"/>
+            </w:tcMar>
+          </w:tcPr>
+          <w:p>
+            <w:pPr>
+              <w:spacing w:after="0" w:line="264" w:lineRule="auto"/>
+            </w:pPr>
+            <w:r>
+              <w:rPr>
+                <w:rFonts w:ascii="Calibri" w:hAnsi="Calibri" w:eastAsia="Microsoft YaHei"/>
+                <w:b w:val="0"/>
+                <w:color w:val="333333"/>
+                <w:sz w:val="21"/>
+              </w:rPr>
+              <w:t>python scripts/run_ml_extension.py</w:t>
+            </w:r>
+          </w:p>
+        </w:tc>
+      </w:tr>
+      <w:tr>
+        <w:tc>
+          <w:tcPr>
+            <w:tcW w:type="dxa" w:w="2592"/>
+            <w:vAlign w:val="center"/>
+            <w:tcMar>
+              <w:top w:w="80" w:type="dxa"/>
+              <w:start w:w="120" w:type="dxa"/>
+              <w:bottom w:w="80" w:type="dxa"/>
+              <w:end w:w="120" w:type="dxa"/>
+            </w:tcMar>
+          </w:tcPr>
+          <w:p>
+            <w:pPr>
+              <w:spacing w:after="0" w:line="264" w:lineRule="auto"/>
+            </w:pPr>
+            <w:r>
+              <w:rPr>
+                <w:rFonts w:ascii="Calibri" w:hAnsi="Calibri" w:eastAsia="Microsoft YaHei"/>
+                <w:b w:val="0"/>
+                <w:color w:val="333333"/>
+                <w:sz w:val="21"/>
+              </w:rPr>
               <w:t>重建展示报告</w:t>
             </w:r>
           </w:p>
@@ -2739,7 +4131,7 @@
         <w:pStyle w:val="Heading1"/>
       </w:pPr>
       <w:r>
-        <w:t>7. 项目实现说明</w:t>
+        <w:t>8. 项目实现说明</w:t>
       </w:r>
     </w:p>
     <w:tbl>
@@ -2995,6 +4387,60 @@
                 <w:color w:val="333333"/>
                 <w:sz w:val="21"/>
               </w:rPr>
+              <w:t>建模层</w:t>
+            </w:r>
+          </w:p>
+        </w:tc>
+        <w:tc>
+          <w:tcPr>
+            <w:tcW w:type="dxa" w:w="6768"/>
+            <w:vAlign w:val="center"/>
+            <w:tcMar>
+              <w:top w:w="80" w:type="dxa"/>
+              <w:start w:w="120" w:type="dxa"/>
+              <w:bottom w:w="80" w:type="dxa"/>
+              <w:end w:w="120" w:type="dxa"/>
+            </w:tcMar>
+          </w:tcPr>
+          <w:p>
+            <w:pPr>
+              <w:spacing w:after="0" w:line="264" w:lineRule="auto"/>
+            </w:pPr>
+            <w:r>
+              <w:rPr>
+                <w:rFonts w:ascii="Calibri" w:hAnsi="Calibri" w:eastAsia="Microsoft YaHei"/>
+                <w:b w:val="0"/>
+                <w:color w:val="333333"/>
+                <w:sz w:val="21"/>
+              </w:rPr>
+              <w:t>执行评分预测交叉验证、随机森林特征重要性分析和 KMeans 电影分群。</w:t>
+            </w:r>
+          </w:p>
+        </w:tc>
+      </w:tr>
+      <w:tr>
+        <w:tc>
+          <w:tcPr>
+            <w:tcW w:type="dxa" w:w="2592"/>
+            <w:vAlign w:val="center"/>
+            <w:tcMar>
+              <w:top w:w="80" w:type="dxa"/>
+              <w:start w:w="120" w:type="dxa"/>
+              <w:bottom w:w="80" w:type="dxa"/>
+              <w:end w:w="120" w:type="dxa"/>
+            </w:tcMar>
+          </w:tcPr>
+          <w:p>
+            <w:pPr>
+              <w:spacing w:after="0" w:line="264" w:lineRule="auto"/>
+            </w:pPr>
+            <w:r>
+              <w:rPr>
+                <w:rFonts w:ascii="Calibri" w:hAnsi="Calibri" w:eastAsia="Microsoft YaHei"/>
+                <w:b w:val="0"/>
+                <w:color w:val="333333"/>
+                <w:sz w:val="21"/>
+              </w:rPr>
               <w:t>输出层</w:t>
             </w:r>
           </w:p>
@@ -3029,10 +4475,20 @@
     </w:tbl>
     <w:p>
       <w:pPr>
+        <w:sectPr>
+          <w:pgSz w:w="12240" w:h="15840"/>
+          <w:pgMar w:top="1440" w:right="1440" w:bottom="1440" w:left="1440" w:header="708" w:footer="708" w:gutter="0"/>
+          <w:cols w:space="720"/>
+          <w:docGrid w:linePitch="360"/>
+        </w:sectPr>
+      </w:pPr>
+    </w:p>
+    <w:p>
+      <w:pPr>
         <w:pStyle w:val="Heading1"/>
       </w:pPr>
       <w:r>
-        <w:t>8. 局限性</w:t>
+        <w:t>9. 局限性</w:t>
       </w:r>
     </w:p>
     <w:p>
@@ -3077,7 +4533,22 @@
           <w:color w:val="333333"/>
           <w:sz w:val="21"/>
         </w:rPr>
-        <w:t>当前项目以探索性分析为主，后续可加入交互式看板、自动化 CI 和更丰富的文本分析。</w:t>
+        <w:t>机器学习扩展使用小样本高分榜单数据，适合展示建模流程与特征解释，不适合作为真实评分预测系统。</w:t>
+      </w:r>
+    </w:p>
+    <w:p>
+      <w:pPr>
+        <w:pStyle w:val="ListBullet"/>
+        <w:spacing w:after="80" w:line="264" w:lineRule="auto"/>
+      </w:pPr>
+      <w:r>
+        <w:rPr>
+          <w:rFonts w:ascii="Calibri" w:hAnsi="Calibri" w:eastAsia="Microsoft YaHei"/>
+          <w:b w:val="0"/>
+          <w:color w:val="333333"/>
+          <w:sz w:val="21"/>
+        </w:rPr>
+        <w:t>后续可加入交互式看板、自动化 CI 和更丰富的文本分析。</w:t>
       </w:r>
     </w:p>
     <w:sectPr>

</xml_diff>

<commit_message>
Force Songti headings in showcase report
</commit_message>
<xml_diff>
--- a/output/报告/豆瓣电影Top200数据分析报告_GitHub展示版.docx
+++ b/output/报告/豆瓣电影Top200数据分析报告_GitHub展示版.docx
@@ -9,7 +9,7 @@
       </w:pPr>
       <w:r>
         <w:rPr>
-          <w:rFonts w:ascii="宋体" w:hAnsi="宋体" w:eastAsia="宋体"/>
+          <w:rFonts w:ascii="宋体" w:hAnsi="宋体" w:eastAsia="宋体" w:cs="宋体"/>
           <w:b/>
           <w:color w:val="000000"/>
           <w:sz w:val="48"/>
@@ -24,7 +24,7 @@
       </w:pPr>
       <w:r>
         <w:rPr>
-          <w:rFonts w:ascii="宋体" w:hAnsi="宋体" w:eastAsia="宋体"/>
+          <w:rFonts w:ascii="宋体" w:hAnsi="宋体" w:eastAsia="宋体" w:cs="宋体"/>
           <w:b w:val="0"/>
           <w:color w:val="000000"/>
           <w:sz w:val="24"/>
@@ -35,8 +35,15 @@
     <w:p>
       <w:pPr>
         <w:pStyle w:val="Heading1"/>
+        <w:spacing w:before="320" w:after="160" w:line="264" w:lineRule="auto"/>
       </w:pPr>
       <w:r>
+        <w:rPr>
+          <w:rFonts w:ascii="宋体" w:hAnsi="宋体" w:eastAsia="宋体" w:cs="宋体"/>
+          <w:b/>
+          <w:color w:val="000000"/>
+          <w:sz w:val="32"/>
+        </w:rPr>
         <w:t>1. 研究对象与结论摘要</w:t>
       </w:r>
     </w:p>
@@ -46,7 +53,7 @@
       </w:pPr>
       <w:r>
         <w:rPr>
-          <w:rFonts w:ascii="宋体" w:hAnsi="宋体" w:eastAsia="宋体"/>
+          <w:rFonts w:ascii="宋体" w:hAnsi="宋体" w:eastAsia="宋体" w:cs="宋体"/>
           <w:b w:val="0"/>
           <w:color w:val="000000"/>
           <w:sz w:val="22"/>
@@ -60,7 +67,7 @@
       </w:pPr>
       <w:r>
         <w:rPr>
-          <w:rFonts w:ascii="宋体" w:hAnsi="宋体" w:eastAsia="宋体"/>
+          <w:rFonts w:ascii="宋体" w:hAnsi="宋体" w:eastAsia="宋体" w:cs="宋体"/>
           <w:b w:val="0"/>
           <w:color w:val="000000"/>
           <w:sz w:val="22"/>
@@ -99,7 +106,7 @@
             </w:pPr>
             <w:r>
               <w:rPr>
-                <w:rFonts w:ascii="宋体" w:hAnsi="宋体" w:eastAsia="宋体"/>
+                <w:rFonts w:ascii="宋体" w:hAnsi="宋体" w:eastAsia="宋体" w:cs="宋体"/>
                 <w:b/>
                 <w:color w:val="000000"/>
                 <w:sz w:val="21"/>
@@ -126,7 +133,7 @@
             </w:pPr>
             <w:r>
               <w:rPr>
-                <w:rFonts w:ascii="宋体" w:hAnsi="宋体" w:eastAsia="宋体"/>
+                <w:rFonts w:ascii="宋体" w:hAnsi="宋体" w:eastAsia="宋体" w:cs="宋体"/>
                 <w:b/>
                 <w:color w:val="000000"/>
                 <w:sz w:val="21"/>
@@ -154,7 +161,7 @@
             </w:pPr>
             <w:r>
               <w:rPr>
-                <w:rFonts w:ascii="宋体" w:hAnsi="宋体" w:eastAsia="宋体"/>
+                <w:rFonts w:ascii="宋体" w:hAnsi="宋体" w:eastAsia="宋体" w:cs="宋体"/>
                 <w:b w:val="0"/>
                 <w:color w:val="000000"/>
                 <w:sz w:val="21"/>
@@ -180,7 +187,7 @@
             </w:pPr>
             <w:r>
               <w:rPr>
-                <w:rFonts w:ascii="宋体" w:hAnsi="宋体" w:eastAsia="宋体"/>
+                <w:rFonts w:ascii="宋体" w:hAnsi="宋体" w:eastAsia="宋体" w:cs="宋体"/>
                 <w:b w:val="0"/>
                 <w:color w:val="000000"/>
                 <w:sz w:val="21"/>
@@ -208,7 +215,7 @@
             </w:pPr>
             <w:r>
               <w:rPr>
-                <w:rFonts w:ascii="宋体" w:hAnsi="宋体" w:eastAsia="宋体"/>
+                <w:rFonts w:ascii="宋体" w:hAnsi="宋体" w:eastAsia="宋体" w:cs="宋体"/>
                 <w:b w:val="0"/>
                 <w:color w:val="000000"/>
                 <w:sz w:val="21"/>
@@ -234,7 +241,7 @@
             </w:pPr>
             <w:r>
               <w:rPr>
-                <w:rFonts w:ascii="宋体" w:hAnsi="宋体" w:eastAsia="宋体"/>
+                <w:rFonts w:ascii="宋体" w:hAnsi="宋体" w:eastAsia="宋体" w:cs="宋体"/>
                 <w:b w:val="0"/>
                 <w:color w:val="000000"/>
                 <w:sz w:val="21"/>
@@ -262,7 +269,7 @@
             </w:pPr>
             <w:r>
               <w:rPr>
-                <w:rFonts w:ascii="宋体" w:hAnsi="宋体" w:eastAsia="宋体"/>
+                <w:rFonts w:ascii="宋体" w:hAnsi="宋体" w:eastAsia="宋体" w:cs="宋体"/>
                 <w:b w:val="0"/>
                 <w:color w:val="000000"/>
                 <w:sz w:val="21"/>
@@ -288,7 +295,7 @@
             </w:pPr>
             <w:r>
               <w:rPr>
-                <w:rFonts w:ascii="宋体" w:hAnsi="宋体" w:eastAsia="宋体"/>
+                <w:rFonts w:ascii="宋体" w:hAnsi="宋体" w:eastAsia="宋体" w:cs="宋体"/>
                 <w:b w:val="0"/>
                 <w:color w:val="000000"/>
                 <w:sz w:val="21"/>
@@ -316,7 +323,7 @@
             </w:pPr>
             <w:r>
               <w:rPr>
-                <w:rFonts w:ascii="宋体" w:hAnsi="宋体" w:eastAsia="宋体"/>
+                <w:rFonts w:ascii="宋体" w:hAnsi="宋体" w:eastAsia="宋体" w:cs="宋体"/>
                 <w:b w:val="0"/>
                 <w:color w:val="000000"/>
                 <w:sz w:val="21"/>
@@ -342,7 +349,7 @@
             </w:pPr>
             <w:r>
               <w:rPr>
-                <w:rFonts w:ascii="宋体" w:hAnsi="宋体" w:eastAsia="宋体"/>
+                <w:rFonts w:ascii="宋体" w:hAnsi="宋体" w:eastAsia="宋体" w:cs="宋体"/>
                 <w:b w:val="0"/>
                 <w:color w:val="000000"/>
                 <w:sz w:val="21"/>
@@ -370,7 +377,7 @@
             </w:pPr>
             <w:r>
               <w:rPr>
-                <w:rFonts w:ascii="宋体" w:hAnsi="宋体" w:eastAsia="宋体"/>
+                <w:rFonts w:ascii="宋体" w:hAnsi="宋体" w:eastAsia="宋体" w:cs="宋体"/>
                 <w:b w:val="0"/>
                 <w:color w:val="000000"/>
                 <w:sz w:val="21"/>
@@ -396,7 +403,7 @@
             </w:pPr>
             <w:r>
               <w:rPr>
-                <w:rFonts w:ascii="宋体" w:hAnsi="宋体" w:eastAsia="宋体"/>
+                <w:rFonts w:ascii="宋体" w:hAnsi="宋体" w:eastAsia="宋体" w:cs="宋体"/>
                 <w:b w:val="0"/>
                 <w:color w:val="000000"/>
                 <w:sz w:val="21"/>
@@ -424,7 +431,7 @@
             </w:pPr>
             <w:r>
               <w:rPr>
-                <w:rFonts w:ascii="宋体" w:hAnsi="宋体" w:eastAsia="宋体"/>
+                <w:rFonts w:ascii="宋体" w:hAnsi="宋体" w:eastAsia="宋体" w:cs="宋体"/>
                 <w:b w:val="0"/>
                 <w:color w:val="000000"/>
                 <w:sz w:val="21"/>
@@ -450,7 +457,7 @@
             </w:pPr>
             <w:r>
               <w:rPr>
-                <w:rFonts w:ascii="宋体" w:hAnsi="宋体" w:eastAsia="宋体"/>
+                <w:rFonts w:ascii="宋体" w:hAnsi="宋体" w:eastAsia="宋体" w:cs="宋体"/>
                 <w:b w:val="0"/>
                 <w:color w:val="000000"/>
                 <w:sz w:val="21"/>
@@ -478,7 +485,7 @@
             </w:pPr>
             <w:r>
               <w:rPr>
-                <w:rFonts w:ascii="宋体" w:hAnsi="宋体" w:eastAsia="宋体"/>
+                <w:rFonts w:ascii="宋体" w:hAnsi="宋体" w:eastAsia="宋体" w:cs="宋体"/>
                 <w:b w:val="0"/>
                 <w:color w:val="000000"/>
                 <w:sz w:val="21"/>
@@ -504,7 +511,7 @@
             </w:pPr>
             <w:r>
               <w:rPr>
-                <w:rFonts w:ascii="宋体" w:hAnsi="宋体" w:eastAsia="宋体"/>
+                <w:rFonts w:ascii="宋体" w:hAnsi="宋体" w:eastAsia="宋体" w:cs="宋体"/>
                 <w:b w:val="0"/>
                 <w:color w:val="000000"/>
                 <w:sz w:val="21"/>
@@ -532,7 +539,7 @@
             </w:pPr>
             <w:r>
               <w:rPr>
-                <w:rFonts w:ascii="宋体" w:hAnsi="宋体" w:eastAsia="宋体"/>
+                <w:rFonts w:ascii="宋体" w:hAnsi="宋体" w:eastAsia="宋体" w:cs="宋体"/>
                 <w:b w:val="0"/>
                 <w:color w:val="000000"/>
                 <w:sz w:val="21"/>
@@ -558,7 +565,7 @@
             </w:pPr>
             <w:r>
               <w:rPr>
-                <w:rFonts w:ascii="宋体" w:hAnsi="宋体" w:eastAsia="宋体"/>
+                <w:rFonts w:ascii="宋体" w:hAnsi="宋体" w:eastAsia="宋体" w:cs="宋体"/>
                 <w:b w:val="0"/>
                 <w:color w:val="000000"/>
                 <w:sz w:val="21"/>
@@ -586,7 +593,7 @@
             </w:pPr>
             <w:r>
               <w:rPr>
-                <w:rFonts w:ascii="宋体" w:hAnsi="宋体" w:eastAsia="宋体"/>
+                <w:rFonts w:ascii="宋体" w:hAnsi="宋体" w:eastAsia="宋体" w:cs="宋体"/>
                 <w:b w:val="0"/>
                 <w:color w:val="000000"/>
                 <w:sz w:val="21"/>
@@ -612,7 +619,7 @@
             </w:pPr>
             <w:r>
               <w:rPr>
-                <w:rFonts w:ascii="宋体" w:hAnsi="宋体" w:eastAsia="宋体"/>
+                <w:rFonts w:ascii="宋体" w:hAnsi="宋体" w:eastAsia="宋体" w:cs="宋体"/>
                 <w:b w:val="0"/>
                 <w:color w:val="000000"/>
                 <w:sz w:val="21"/>
@@ -640,7 +647,7 @@
             </w:pPr>
             <w:r>
               <w:rPr>
-                <w:rFonts w:ascii="宋体" w:hAnsi="宋体" w:eastAsia="宋体"/>
+                <w:rFonts w:ascii="宋体" w:hAnsi="宋体" w:eastAsia="宋体" w:cs="宋体"/>
                 <w:b w:val="0"/>
                 <w:color w:val="000000"/>
                 <w:sz w:val="21"/>
@@ -666,7 +673,7 @@
             </w:pPr>
             <w:r>
               <w:rPr>
-                <w:rFonts w:ascii="宋体" w:hAnsi="宋体" w:eastAsia="宋体"/>
+                <w:rFonts w:ascii="宋体" w:hAnsi="宋体" w:eastAsia="宋体" w:cs="宋体"/>
                 <w:b w:val="0"/>
                 <w:color w:val="000000"/>
                 <w:sz w:val="21"/>
@@ -680,8 +687,15 @@
     <w:p>
       <w:pPr>
         <w:pStyle w:val="Heading1"/>
+        <w:spacing w:before="320" w:after="160" w:line="264" w:lineRule="auto"/>
       </w:pPr>
       <w:r>
+        <w:rPr>
+          <w:rFonts w:ascii="宋体" w:hAnsi="宋体" w:eastAsia="宋体" w:cs="宋体"/>
+          <w:b/>
+          <w:color w:val="000000"/>
+          <w:sz w:val="32"/>
+        </w:rPr>
         <w:t>2. 数据质量与统计口径</w:t>
       </w:r>
     </w:p>
@@ -691,7 +705,7 @@
       </w:pPr>
       <w:r>
         <w:rPr>
-          <w:rFonts w:ascii="宋体" w:hAnsi="宋体" w:eastAsia="宋体"/>
+          <w:rFonts w:ascii="宋体" w:hAnsi="宋体" w:eastAsia="宋体" w:cs="宋体"/>
           <w:b w:val="0"/>
           <w:color w:val="000000"/>
           <w:sz w:val="22"/>
@@ -730,7 +744,7 @@
             </w:pPr>
             <w:r>
               <w:rPr>
-                <w:rFonts w:ascii="宋体" w:hAnsi="宋体" w:eastAsia="宋体"/>
+                <w:rFonts w:ascii="宋体" w:hAnsi="宋体" w:eastAsia="宋体" w:cs="宋体"/>
                 <w:b/>
                 <w:color w:val="000000"/>
                 <w:sz w:val="21"/>
@@ -757,7 +771,7 @@
             </w:pPr>
             <w:r>
               <w:rPr>
-                <w:rFonts w:ascii="宋体" w:hAnsi="宋体" w:eastAsia="宋体"/>
+                <w:rFonts w:ascii="宋体" w:hAnsi="宋体" w:eastAsia="宋体" w:cs="宋体"/>
                 <w:b/>
                 <w:color w:val="000000"/>
                 <w:sz w:val="21"/>
@@ -785,7 +799,7 @@
             </w:pPr>
             <w:r>
               <w:rPr>
-                <w:rFonts w:ascii="宋体" w:hAnsi="宋体" w:eastAsia="宋体"/>
+                <w:rFonts w:ascii="宋体" w:hAnsi="宋体" w:eastAsia="宋体" w:cs="宋体"/>
                 <w:b w:val="0"/>
                 <w:color w:val="000000"/>
                 <w:sz w:val="21"/>
@@ -811,7 +825,7 @@
             </w:pPr>
             <w:r>
               <w:rPr>
-                <w:rFonts w:ascii="宋体" w:hAnsi="宋体" w:eastAsia="宋体"/>
+                <w:rFonts w:ascii="宋体" w:hAnsi="宋体" w:eastAsia="宋体" w:cs="宋体"/>
                 <w:b w:val="0"/>
                 <w:color w:val="000000"/>
                 <w:sz w:val="21"/>
@@ -839,7 +853,7 @@
             </w:pPr>
             <w:r>
               <w:rPr>
-                <w:rFonts w:ascii="宋体" w:hAnsi="宋体" w:eastAsia="宋体"/>
+                <w:rFonts w:ascii="宋体" w:hAnsi="宋体" w:eastAsia="宋体" w:cs="宋体"/>
                 <w:b w:val="0"/>
                 <w:color w:val="000000"/>
                 <w:sz w:val="21"/>
@@ -865,7 +879,7 @@
             </w:pPr>
             <w:r>
               <w:rPr>
-                <w:rFonts w:ascii="宋体" w:hAnsi="宋体" w:eastAsia="宋体"/>
+                <w:rFonts w:ascii="宋体" w:hAnsi="宋体" w:eastAsia="宋体" w:cs="宋体"/>
                 <w:b w:val="0"/>
                 <w:color w:val="000000"/>
                 <w:sz w:val="21"/>
@@ -893,7 +907,7 @@
             </w:pPr>
             <w:r>
               <w:rPr>
-                <w:rFonts w:ascii="宋体" w:hAnsi="宋体" w:eastAsia="宋体"/>
+                <w:rFonts w:ascii="宋体" w:hAnsi="宋体" w:eastAsia="宋体" w:cs="宋体"/>
                 <w:b w:val="0"/>
                 <w:color w:val="000000"/>
                 <w:sz w:val="21"/>
@@ -919,7 +933,7 @@
             </w:pPr>
             <w:r>
               <w:rPr>
-                <w:rFonts w:ascii="宋体" w:hAnsi="宋体" w:eastAsia="宋体"/>
+                <w:rFonts w:ascii="宋体" w:hAnsi="宋体" w:eastAsia="宋体" w:cs="宋体"/>
                 <w:b w:val="0"/>
                 <w:color w:val="000000"/>
                 <w:sz w:val="21"/>
@@ -947,7 +961,7 @@
             </w:pPr>
             <w:r>
               <w:rPr>
-                <w:rFonts w:ascii="宋体" w:hAnsi="宋体" w:eastAsia="宋体"/>
+                <w:rFonts w:ascii="宋体" w:hAnsi="宋体" w:eastAsia="宋体" w:cs="宋体"/>
                 <w:b w:val="0"/>
                 <w:color w:val="000000"/>
                 <w:sz w:val="21"/>
@@ -973,7 +987,7 @@
             </w:pPr>
             <w:r>
               <w:rPr>
-                <w:rFonts w:ascii="宋体" w:hAnsi="宋体" w:eastAsia="宋体"/>
+                <w:rFonts w:ascii="宋体" w:hAnsi="宋体" w:eastAsia="宋体" w:cs="宋体"/>
                 <w:b w:val="0"/>
                 <w:color w:val="000000"/>
                 <w:sz w:val="21"/>
@@ -1001,7 +1015,7 @@
             </w:pPr>
             <w:r>
               <w:rPr>
-                <w:rFonts w:ascii="宋体" w:hAnsi="宋体" w:eastAsia="宋体"/>
+                <w:rFonts w:ascii="宋体" w:hAnsi="宋体" w:eastAsia="宋体" w:cs="宋体"/>
                 <w:b w:val="0"/>
                 <w:color w:val="000000"/>
                 <w:sz w:val="21"/>
@@ -1027,7 +1041,7 @@
             </w:pPr>
             <w:r>
               <w:rPr>
-                <w:rFonts w:ascii="宋体" w:hAnsi="宋体" w:eastAsia="宋体"/>
+                <w:rFonts w:ascii="宋体" w:hAnsi="宋体" w:eastAsia="宋体" w:cs="宋体"/>
                 <w:b w:val="0"/>
                 <w:color w:val="000000"/>
                 <w:sz w:val="21"/>
@@ -1055,7 +1069,7 @@
             </w:pPr>
             <w:r>
               <w:rPr>
-                <w:rFonts w:ascii="宋体" w:hAnsi="宋体" w:eastAsia="宋体"/>
+                <w:rFonts w:ascii="宋体" w:hAnsi="宋体" w:eastAsia="宋体" w:cs="宋体"/>
                 <w:b w:val="0"/>
                 <w:color w:val="000000"/>
                 <w:sz w:val="21"/>
@@ -1081,7 +1095,7 @@
             </w:pPr>
             <w:r>
               <w:rPr>
-                <w:rFonts w:ascii="宋体" w:hAnsi="宋体" w:eastAsia="宋体"/>
+                <w:rFonts w:ascii="宋体" w:hAnsi="宋体" w:eastAsia="宋体" w:cs="宋体"/>
                 <w:b w:val="0"/>
                 <w:color w:val="000000"/>
                 <w:sz w:val="21"/>
@@ -1109,7 +1123,7 @@
             </w:pPr>
             <w:r>
               <w:rPr>
-                <w:rFonts w:ascii="宋体" w:hAnsi="宋体" w:eastAsia="宋体"/>
+                <w:rFonts w:ascii="宋体" w:hAnsi="宋体" w:eastAsia="宋体" w:cs="宋体"/>
                 <w:b w:val="0"/>
                 <w:color w:val="000000"/>
                 <w:sz w:val="21"/>
@@ -1135,7 +1149,7 @@
             </w:pPr>
             <w:r>
               <w:rPr>
-                <w:rFonts w:ascii="宋体" w:hAnsi="宋体" w:eastAsia="宋体"/>
+                <w:rFonts w:ascii="宋体" w:hAnsi="宋体" w:eastAsia="宋体" w:cs="宋体"/>
                 <w:b w:val="0"/>
                 <w:color w:val="000000"/>
                 <w:sz w:val="21"/>
@@ -1163,7 +1177,7 @@
             </w:pPr>
             <w:r>
               <w:rPr>
-                <w:rFonts w:ascii="宋体" w:hAnsi="宋体" w:eastAsia="宋体"/>
+                <w:rFonts w:ascii="宋体" w:hAnsi="宋体" w:eastAsia="宋体" w:cs="宋体"/>
                 <w:b w:val="0"/>
                 <w:color w:val="000000"/>
                 <w:sz w:val="21"/>
@@ -1189,7 +1203,7 @@
             </w:pPr>
             <w:r>
               <w:rPr>
-                <w:rFonts w:ascii="宋体" w:hAnsi="宋体" w:eastAsia="宋体"/>
+                <w:rFonts w:ascii="宋体" w:hAnsi="宋体" w:eastAsia="宋体" w:cs="宋体"/>
                 <w:b w:val="0"/>
                 <w:color w:val="000000"/>
                 <w:sz w:val="21"/>
@@ -1217,7 +1231,7 @@
             </w:pPr>
             <w:r>
               <w:rPr>
-                <w:rFonts w:ascii="宋体" w:hAnsi="宋体" w:eastAsia="宋体"/>
+                <w:rFonts w:ascii="宋体" w:hAnsi="宋体" w:eastAsia="宋体" w:cs="宋体"/>
                 <w:b w:val="0"/>
                 <w:color w:val="000000"/>
                 <w:sz w:val="21"/>
@@ -1243,7 +1257,7 @@
             </w:pPr>
             <w:r>
               <w:rPr>
-                <w:rFonts w:ascii="宋体" w:hAnsi="宋体" w:eastAsia="宋体"/>
+                <w:rFonts w:ascii="宋体" w:hAnsi="宋体" w:eastAsia="宋体" w:cs="宋体"/>
                 <w:b w:val="0"/>
                 <w:color w:val="000000"/>
                 <w:sz w:val="21"/>
@@ -1257,8 +1271,15 @@
     <w:p>
       <w:pPr>
         <w:pStyle w:val="Heading1"/>
+        <w:spacing w:before="320" w:after="160" w:line="264" w:lineRule="auto"/>
       </w:pPr>
       <w:r>
+        <w:rPr>
+          <w:rFonts w:ascii="宋体" w:hAnsi="宋体" w:eastAsia="宋体" w:cs="宋体"/>
+          <w:b/>
+          <w:color w:val="000000"/>
+          <w:sz w:val="32"/>
+        </w:rPr>
         <w:t>3. 评分分布分析</w:t>
       </w:r>
     </w:p>
@@ -1268,7 +1289,7 @@
       </w:pPr>
       <w:r>
         <w:rPr>
-          <w:rFonts w:ascii="宋体" w:hAnsi="宋体" w:eastAsia="宋体"/>
+          <w:rFonts w:ascii="宋体" w:hAnsi="宋体" w:eastAsia="宋体" w:cs="宋体"/>
           <w:b w:val="0"/>
           <w:color w:val="000000"/>
           <w:sz w:val="22"/>
@@ -1308,7 +1329,7 @@
             </w:pPr>
             <w:r>
               <w:rPr>
-                <w:rFonts w:ascii="宋体" w:hAnsi="宋体" w:eastAsia="宋体"/>
+                <w:rFonts w:ascii="宋体" w:hAnsi="宋体" w:eastAsia="宋体" w:cs="宋体"/>
                 <w:b/>
                 <w:color w:val="000000"/>
                 <w:sz w:val="21"/>
@@ -1335,7 +1356,7 @@
             </w:pPr>
             <w:r>
               <w:rPr>
-                <w:rFonts w:ascii="宋体" w:hAnsi="宋体" w:eastAsia="宋体"/>
+                <w:rFonts w:ascii="宋体" w:hAnsi="宋体" w:eastAsia="宋体" w:cs="宋体"/>
                 <w:b/>
                 <w:color w:val="000000"/>
                 <w:sz w:val="21"/>
@@ -1362,7 +1383,7 @@
             </w:pPr>
             <w:r>
               <w:rPr>
-                <w:rFonts w:ascii="宋体" w:hAnsi="宋体" w:eastAsia="宋体"/>
+                <w:rFonts w:ascii="宋体" w:hAnsi="宋体" w:eastAsia="宋体" w:cs="宋体"/>
                 <w:b/>
                 <w:color w:val="000000"/>
                 <w:sz w:val="21"/>
@@ -1390,7 +1411,7 @@
             </w:pPr>
             <w:r>
               <w:rPr>
-                <w:rFonts w:ascii="宋体" w:hAnsi="宋体" w:eastAsia="宋体"/>
+                <w:rFonts w:ascii="宋体" w:hAnsi="宋体" w:eastAsia="宋体" w:cs="宋体"/>
                 <w:b w:val="0"/>
                 <w:color w:val="000000"/>
                 <w:sz w:val="21"/>
@@ -1416,7 +1437,7 @@
             </w:pPr>
             <w:r>
               <w:rPr>
-                <w:rFonts w:ascii="宋体" w:hAnsi="宋体" w:eastAsia="宋体"/>
+                <w:rFonts w:ascii="宋体" w:hAnsi="宋体" w:eastAsia="宋体" w:cs="宋体"/>
                 <w:b w:val="0"/>
                 <w:color w:val="000000"/>
                 <w:sz w:val="21"/>
@@ -1442,7 +1463,7 @@
             </w:pPr>
             <w:r>
               <w:rPr>
-                <w:rFonts w:ascii="宋体" w:hAnsi="宋体" w:eastAsia="宋体"/>
+                <w:rFonts w:ascii="宋体" w:hAnsi="宋体" w:eastAsia="宋体" w:cs="宋体"/>
                 <w:b w:val="0"/>
                 <w:color w:val="000000"/>
                 <w:sz w:val="21"/>
@@ -1470,7 +1491,7 @@
             </w:pPr>
             <w:r>
               <w:rPr>
-                <w:rFonts w:ascii="宋体" w:hAnsi="宋体" w:eastAsia="宋体"/>
+                <w:rFonts w:ascii="宋体" w:hAnsi="宋体" w:eastAsia="宋体" w:cs="宋体"/>
                 <w:b w:val="0"/>
                 <w:color w:val="000000"/>
                 <w:sz w:val="21"/>
@@ -1496,7 +1517,7 @@
             </w:pPr>
             <w:r>
               <w:rPr>
-                <w:rFonts w:ascii="宋体" w:hAnsi="宋体" w:eastAsia="宋体"/>
+                <w:rFonts w:ascii="宋体" w:hAnsi="宋体" w:eastAsia="宋体" w:cs="宋体"/>
                 <w:b w:val="0"/>
                 <w:color w:val="000000"/>
                 <w:sz w:val="21"/>
@@ -1522,7 +1543,7 @@
             </w:pPr>
             <w:r>
               <w:rPr>
-                <w:rFonts w:ascii="宋体" w:hAnsi="宋体" w:eastAsia="宋体"/>
+                <w:rFonts w:ascii="宋体" w:hAnsi="宋体" w:eastAsia="宋体" w:cs="宋体"/>
                 <w:b w:val="0"/>
                 <w:color w:val="000000"/>
                 <w:sz w:val="21"/>
@@ -1550,7 +1571,7 @@
             </w:pPr>
             <w:r>
               <w:rPr>
-                <w:rFonts w:ascii="宋体" w:hAnsi="宋体" w:eastAsia="宋体"/>
+                <w:rFonts w:ascii="宋体" w:hAnsi="宋体" w:eastAsia="宋体" w:cs="宋体"/>
                 <w:b w:val="0"/>
                 <w:color w:val="000000"/>
                 <w:sz w:val="21"/>
@@ -1576,7 +1597,7 @@
             </w:pPr>
             <w:r>
               <w:rPr>
-                <w:rFonts w:ascii="宋体" w:hAnsi="宋体" w:eastAsia="宋体"/>
+                <w:rFonts w:ascii="宋体" w:hAnsi="宋体" w:eastAsia="宋体" w:cs="宋体"/>
                 <w:b w:val="0"/>
                 <w:color w:val="000000"/>
                 <w:sz w:val="21"/>
@@ -1602,7 +1623,7 @@
             </w:pPr>
             <w:r>
               <w:rPr>
-                <w:rFonts w:ascii="宋体" w:hAnsi="宋体" w:eastAsia="宋体"/>
+                <w:rFonts w:ascii="宋体" w:hAnsi="宋体" w:eastAsia="宋体" w:cs="宋体"/>
                 <w:b w:val="0"/>
                 <w:color w:val="000000"/>
                 <w:sz w:val="21"/>
@@ -1630,7 +1651,7 @@
             </w:pPr>
             <w:r>
               <w:rPr>
-                <w:rFonts w:ascii="宋体" w:hAnsi="宋体" w:eastAsia="宋体"/>
+                <w:rFonts w:ascii="宋体" w:hAnsi="宋体" w:eastAsia="宋体" w:cs="宋体"/>
                 <w:b w:val="0"/>
                 <w:color w:val="000000"/>
                 <w:sz w:val="21"/>
@@ -1656,7 +1677,7 @@
             </w:pPr>
             <w:r>
               <w:rPr>
-                <w:rFonts w:ascii="宋体" w:hAnsi="宋体" w:eastAsia="宋体"/>
+                <w:rFonts w:ascii="宋体" w:hAnsi="宋体" w:eastAsia="宋体" w:cs="宋体"/>
                 <w:b w:val="0"/>
                 <w:color w:val="000000"/>
                 <w:sz w:val="21"/>
@@ -1682,7 +1703,7 @@
             </w:pPr>
             <w:r>
               <w:rPr>
-                <w:rFonts w:ascii="宋体" w:hAnsi="宋体" w:eastAsia="宋体"/>
+                <w:rFonts w:ascii="宋体" w:hAnsi="宋体" w:eastAsia="宋体" w:cs="宋体"/>
                 <w:b w:val="0"/>
                 <w:color w:val="000000"/>
                 <w:sz w:val="21"/>
@@ -1710,7 +1731,7 @@
             </w:pPr>
             <w:r>
               <w:rPr>
-                <w:rFonts w:ascii="宋体" w:hAnsi="宋体" w:eastAsia="宋体"/>
+                <w:rFonts w:ascii="宋体" w:hAnsi="宋体" w:eastAsia="宋体" w:cs="宋体"/>
                 <w:b w:val="0"/>
                 <w:color w:val="000000"/>
                 <w:sz w:val="21"/>
@@ -1736,7 +1757,7 @@
             </w:pPr>
             <w:r>
               <w:rPr>
-                <w:rFonts w:ascii="宋体" w:hAnsi="宋体" w:eastAsia="宋体"/>
+                <w:rFonts w:ascii="宋体" w:hAnsi="宋体" w:eastAsia="宋体" w:cs="宋体"/>
                 <w:b w:val="0"/>
                 <w:color w:val="000000"/>
                 <w:sz w:val="21"/>
@@ -1762,7 +1783,7 @@
             </w:pPr>
             <w:r>
               <w:rPr>
-                <w:rFonts w:ascii="宋体" w:hAnsi="宋体" w:eastAsia="宋体"/>
+                <w:rFonts w:ascii="宋体" w:hAnsi="宋体" w:eastAsia="宋体" w:cs="宋体"/>
                 <w:b w:val="0"/>
                 <w:color w:val="000000"/>
                 <w:sz w:val="21"/>
@@ -1779,7 +1800,7 @@
       </w:pPr>
       <w:r>
         <w:rPr>
-          <w:rFonts w:ascii="宋体" w:hAnsi="宋体" w:eastAsia="宋体"/>
+          <w:rFonts w:ascii="宋体" w:hAnsi="宋体" w:eastAsia="宋体" w:cs="宋体"/>
           <w:b w:val="0"/>
           <w:color w:val="000000"/>
           <w:sz w:val="22"/>
@@ -1790,8 +1811,15 @@
     <w:p>
       <w:pPr>
         <w:pStyle w:val="Heading1"/>
+        <w:spacing w:before="320" w:after="160" w:line="264" w:lineRule="auto"/>
       </w:pPr>
       <w:r>
+        <w:rPr>
+          <w:rFonts w:ascii="宋体" w:hAnsi="宋体" w:eastAsia="宋体" w:cs="宋体"/>
+          <w:b/>
+          <w:color w:val="000000"/>
+          <w:sz w:val="32"/>
+        </w:rPr>
         <w:t>4. 类型、地区与年代分析</w:t>
       </w:r>
     </w:p>
@@ -1802,7 +1830,7 @@
       </w:pPr>
       <w:r>
         <w:rPr>
-          <w:rFonts w:ascii="宋体" w:hAnsi="宋体" w:eastAsia="宋体"/>
+          <w:rFonts w:ascii="宋体" w:hAnsi="宋体" w:eastAsia="宋体" w:cs="宋体"/>
           <w:b w:val="0"/>
           <w:color w:val="000000"/>
           <w:sz w:val="21"/>
@@ -1817,7 +1845,7 @@
       </w:pPr>
       <w:r>
         <w:rPr>
-          <w:rFonts w:ascii="宋体" w:hAnsi="宋体" w:eastAsia="宋体"/>
+          <w:rFonts w:ascii="宋体" w:hAnsi="宋体" w:eastAsia="宋体" w:cs="宋体"/>
           <w:b w:val="0"/>
           <w:color w:val="000000"/>
           <w:sz w:val="21"/>
@@ -1832,7 +1860,7 @@
       </w:pPr>
       <w:r>
         <w:rPr>
-          <w:rFonts w:ascii="宋体" w:hAnsi="宋体" w:eastAsia="宋体"/>
+          <w:rFonts w:ascii="宋体" w:hAnsi="宋体" w:eastAsia="宋体" w:cs="宋体"/>
           <w:b w:val="0"/>
           <w:color w:val="000000"/>
           <w:sz w:val="21"/>
@@ -1847,7 +1875,7 @@
       </w:pPr>
       <w:r>
         <w:rPr>
-          <w:rFonts w:ascii="宋体" w:hAnsi="宋体" w:eastAsia="宋体"/>
+          <w:rFonts w:ascii="宋体" w:hAnsi="宋体" w:eastAsia="宋体" w:cs="宋体"/>
           <w:b w:val="0"/>
           <w:color w:val="000000"/>
           <w:sz w:val="21"/>
@@ -1888,7 +1916,7 @@
             </w:pPr>
             <w:r>
               <w:rPr>
-                <w:rFonts w:ascii="宋体" w:hAnsi="宋体" w:eastAsia="宋体"/>
+                <w:rFonts w:ascii="宋体" w:hAnsi="宋体" w:eastAsia="宋体" w:cs="宋体"/>
                 <w:b/>
                 <w:color w:val="000000"/>
                 <w:sz w:val="21"/>
@@ -1915,7 +1943,7 @@
             </w:pPr>
             <w:r>
               <w:rPr>
-                <w:rFonts w:ascii="宋体" w:hAnsi="宋体" w:eastAsia="宋体"/>
+                <w:rFonts w:ascii="宋体" w:hAnsi="宋体" w:eastAsia="宋体" w:cs="宋体"/>
                 <w:b/>
                 <w:color w:val="000000"/>
                 <w:sz w:val="21"/>
@@ -1942,7 +1970,7 @@
             </w:pPr>
             <w:r>
               <w:rPr>
-                <w:rFonts w:ascii="宋体" w:hAnsi="宋体" w:eastAsia="宋体"/>
+                <w:rFonts w:ascii="宋体" w:hAnsi="宋体" w:eastAsia="宋体" w:cs="宋体"/>
                 <w:b/>
                 <w:color w:val="000000"/>
                 <w:sz w:val="21"/>
@@ -1969,7 +1997,7 @@
             </w:pPr>
             <w:r>
               <w:rPr>
-                <w:rFonts w:ascii="宋体" w:hAnsi="宋体" w:eastAsia="宋体"/>
+                <w:rFonts w:ascii="宋体" w:hAnsi="宋体" w:eastAsia="宋体" w:cs="宋体"/>
                 <w:b/>
                 <w:color w:val="000000"/>
                 <w:sz w:val="21"/>
@@ -1997,7 +2025,7 @@
             </w:pPr>
             <w:r>
               <w:rPr>
-                <w:rFonts w:ascii="宋体" w:hAnsi="宋体" w:eastAsia="宋体"/>
+                <w:rFonts w:ascii="宋体" w:hAnsi="宋体" w:eastAsia="宋体" w:cs="宋体"/>
                 <w:b w:val="0"/>
                 <w:color w:val="000000"/>
                 <w:sz w:val="21"/>
@@ -2023,7 +2051,7 @@
             </w:pPr>
             <w:r>
               <w:rPr>
-                <w:rFonts w:ascii="宋体" w:hAnsi="宋体" w:eastAsia="宋体"/>
+                <w:rFonts w:ascii="宋体" w:hAnsi="宋体" w:eastAsia="宋体" w:cs="宋体"/>
                 <w:b w:val="0"/>
                 <w:color w:val="000000"/>
                 <w:sz w:val="21"/>
@@ -2049,7 +2077,7 @@
             </w:pPr>
             <w:r>
               <w:rPr>
-                <w:rFonts w:ascii="宋体" w:hAnsi="宋体" w:eastAsia="宋体"/>
+                <w:rFonts w:ascii="宋体" w:hAnsi="宋体" w:eastAsia="宋体" w:cs="宋体"/>
                 <w:b w:val="0"/>
                 <w:color w:val="000000"/>
                 <w:sz w:val="21"/>
@@ -2075,7 +2103,7 @@
             </w:pPr>
             <w:r>
               <w:rPr>
-                <w:rFonts w:ascii="宋体" w:hAnsi="宋体" w:eastAsia="宋体"/>
+                <w:rFonts w:ascii="宋体" w:hAnsi="宋体" w:eastAsia="宋体" w:cs="宋体"/>
                 <w:b w:val="0"/>
                 <w:color w:val="000000"/>
                 <w:sz w:val="21"/>
@@ -2103,7 +2131,7 @@
             </w:pPr>
             <w:r>
               <w:rPr>
-                <w:rFonts w:ascii="宋体" w:hAnsi="宋体" w:eastAsia="宋体"/>
+                <w:rFonts w:ascii="宋体" w:hAnsi="宋体" w:eastAsia="宋体" w:cs="宋体"/>
                 <w:b w:val="0"/>
                 <w:color w:val="000000"/>
                 <w:sz w:val="21"/>
@@ -2129,7 +2157,7 @@
             </w:pPr>
             <w:r>
               <w:rPr>
-                <w:rFonts w:ascii="宋体" w:hAnsi="宋体" w:eastAsia="宋体"/>
+                <w:rFonts w:ascii="宋体" w:hAnsi="宋体" w:eastAsia="宋体" w:cs="宋体"/>
                 <w:b w:val="0"/>
                 <w:color w:val="000000"/>
                 <w:sz w:val="21"/>
@@ -2155,7 +2183,7 @@
             </w:pPr>
             <w:r>
               <w:rPr>
-                <w:rFonts w:ascii="宋体" w:hAnsi="宋体" w:eastAsia="宋体"/>
+                <w:rFonts w:ascii="宋体" w:hAnsi="宋体" w:eastAsia="宋体" w:cs="宋体"/>
                 <w:b w:val="0"/>
                 <w:color w:val="000000"/>
                 <w:sz w:val="21"/>
@@ -2181,7 +2209,7 @@
             </w:pPr>
             <w:r>
               <w:rPr>
-                <w:rFonts w:ascii="宋体" w:hAnsi="宋体" w:eastAsia="宋体"/>
+                <w:rFonts w:ascii="宋体" w:hAnsi="宋体" w:eastAsia="宋体" w:cs="宋体"/>
                 <w:b w:val="0"/>
                 <w:color w:val="000000"/>
                 <w:sz w:val="21"/>
@@ -2209,7 +2237,7 @@
             </w:pPr>
             <w:r>
               <w:rPr>
-                <w:rFonts w:ascii="宋体" w:hAnsi="宋体" w:eastAsia="宋体"/>
+                <w:rFonts w:ascii="宋体" w:hAnsi="宋体" w:eastAsia="宋体" w:cs="宋体"/>
                 <w:b w:val="0"/>
                 <w:color w:val="000000"/>
                 <w:sz w:val="21"/>
@@ -2235,7 +2263,7 @@
             </w:pPr>
             <w:r>
               <w:rPr>
-                <w:rFonts w:ascii="宋体" w:hAnsi="宋体" w:eastAsia="宋体"/>
+                <w:rFonts w:ascii="宋体" w:hAnsi="宋体" w:eastAsia="宋体" w:cs="宋体"/>
                 <w:b w:val="0"/>
                 <w:color w:val="000000"/>
                 <w:sz w:val="21"/>
@@ -2261,7 +2289,7 @@
             </w:pPr>
             <w:r>
               <w:rPr>
-                <w:rFonts w:ascii="宋体" w:hAnsi="宋体" w:eastAsia="宋体"/>
+                <w:rFonts w:ascii="宋体" w:hAnsi="宋体" w:eastAsia="宋体" w:cs="宋体"/>
                 <w:b w:val="0"/>
                 <w:color w:val="000000"/>
                 <w:sz w:val="21"/>
@@ -2287,7 +2315,7 @@
             </w:pPr>
             <w:r>
               <w:rPr>
-                <w:rFonts w:ascii="宋体" w:hAnsi="宋体" w:eastAsia="宋体"/>
+                <w:rFonts w:ascii="宋体" w:hAnsi="宋体" w:eastAsia="宋体" w:cs="宋体"/>
                 <w:b w:val="0"/>
                 <w:color w:val="000000"/>
                 <w:sz w:val="21"/>
@@ -2315,7 +2343,7 @@
             </w:pPr>
             <w:r>
               <w:rPr>
-                <w:rFonts w:ascii="宋体" w:hAnsi="宋体" w:eastAsia="宋体"/>
+                <w:rFonts w:ascii="宋体" w:hAnsi="宋体" w:eastAsia="宋体" w:cs="宋体"/>
                 <w:b w:val="0"/>
                 <w:color w:val="000000"/>
                 <w:sz w:val="21"/>
@@ -2341,7 +2369,7 @@
             </w:pPr>
             <w:r>
               <w:rPr>
-                <w:rFonts w:ascii="宋体" w:hAnsi="宋体" w:eastAsia="宋体"/>
+                <w:rFonts w:ascii="宋体" w:hAnsi="宋体" w:eastAsia="宋体" w:cs="宋体"/>
                 <w:b w:val="0"/>
                 <w:color w:val="000000"/>
                 <w:sz w:val="21"/>
@@ -2367,7 +2395,7 @@
             </w:pPr>
             <w:r>
               <w:rPr>
-                <w:rFonts w:ascii="宋体" w:hAnsi="宋体" w:eastAsia="宋体"/>
+                <w:rFonts w:ascii="宋体" w:hAnsi="宋体" w:eastAsia="宋体" w:cs="宋体"/>
                 <w:b w:val="0"/>
                 <w:color w:val="000000"/>
                 <w:sz w:val="21"/>
@@ -2393,7 +2421,7 @@
             </w:pPr>
             <w:r>
               <w:rPr>
-                <w:rFonts w:ascii="宋体" w:hAnsi="宋体" w:eastAsia="宋体"/>
+                <w:rFonts w:ascii="宋体" w:hAnsi="宋体" w:eastAsia="宋体" w:cs="宋体"/>
                 <w:b w:val="0"/>
                 <w:color w:val="000000"/>
                 <w:sz w:val="21"/>
@@ -2421,7 +2449,7 @@
             </w:pPr>
             <w:r>
               <w:rPr>
-                <w:rFonts w:ascii="宋体" w:hAnsi="宋体" w:eastAsia="宋体"/>
+                <w:rFonts w:ascii="宋体" w:hAnsi="宋体" w:eastAsia="宋体" w:cs="宋体"/>
                 <w:b w:val="0"/>
                 <w:color w:val="000000"/>
                 <w:sz w:val="21"/>
@@ -2447,7 +2475,7 @@
             </w:pPr>
             <w:r>
               <w:rPr>
-                <w:rFonts w:ascii="宋体" w:hAnsi="宋体" w:eastAsia="宋体"/>
+                <w:rFonts w:ascii="宋体" w:hAnsi="宋体" w:eastAsia="宋体" w:cs="宋体"/>
                 <w:b w:val="0"/>
                 <w:color w:val="000000"/>
                 <w:sz w:val="21"/>
@@ -2473,7 +2501,7 @@
             </w:pPr>
             <w:r>
               <w:rPr>
-                <w:rFonts w:ascii="宋体" w:hAnsi="宋体" w:eastAsia="宋体"/>
+                <w:rFonts w:ascii="宋体" w:hAnsi="宋体" w:eastAsia="宋体" w:cs="宋体"/>
                 <w:b w:val="0"/>
                 <w:color w:val="000000"/>
                 <w:sz w:val="21"/>
@@ -2499,7 +2527,7 @@
             </w:pPr>
             <w:r>
               <w:rPr>
-                <w:rFonts w:ascii="宋体" w:hAnsi="宋体" w:eastAsia="宋体"/>
+                <w:rFonts w:ascii="宋体" w:hAnsi="宋体" w:eastAsia="宋体" w:cs="宋体"/>
                 <w:b w:val="0"/>
                 <w:color w:val="000000"/>
                 <w:sz w:val="21"/>
@@ -2527,7 +2555,7 @@
             </w:pPr>
             <w:r>
               <w:rPr>
-                <w:rFonts w:ascii="宋体" w:hAnsi="宋体" w:eastAsia="宋体"/>
+                <w:rFonts w:ascii="宋体" w:hAnsi="宋体" w:eastAsia="宋体" w:cs="宋体"/>
                 <w:b w:val="0"/>
                 <w:color w:val="000000"/>
                 <w:sz w:val="21"/>
@@ -2553,7 +2581,7 @@
             </w:pPr>
             <w:r>
               <w:rPr>
-                <w:rFonts w:ascii="宋体" w:hAnsi="宋体" w:eastAsia="宋体"/>
+                <w:rFonts w:ascii="宋体" w:hAnsi="宋体" w:eastAsia="宋体" w:cs="宋体"/>
                 <w:b w:val="0"/>
                 <w:color w:val="000000"/>
                 <w:sz w:val="21"/>
@@ -2579,7 +2607,7 @@
             </w:pPr>
             <w:r>
               <w:rPr>
-                <w:rFonts w:ascii="宋体" w:hAnsi="宋体" w:eastAsia="宋体"/>
+                <w:rFonts w:ascii="宋体" w:hAnsi="宋体" w:eastAsia="宋体" w:cs="宋体"/>
                 <w:b w:val="0"/>
                 <w:color w:val="000000"/>
                 <w:sz w:val="21"/>
@@ -2605,7 +2633,7 @@
             </w:pPr>
             <w:r>
               <w:rPr>
-                <w:rFonts w:ascii="宋体" w:hAnsi="宋体" w:eastAsia="宋体"/>
+                <w:rFonts w:ascii="宋体" w:hAnsi="宋体" w:eastAsia="宋体" w:cs="宋体"/>
                 <w:b w:val="0"/>
                 <w:color w:val="000000"/>
                 <w:sz w:val="21"/>
@@ -2633,7 +2661,7 @@
             </w:pPr>
             <w:r>
               <w:rPr>
-                <w:rFonts w:ascii="宋体" w:hAnsi="宋体" w:eastAsia="宋体"/>
+                <w:rFonts w:ascii="宋体" w:hAnsi="宋体" w:eastAsia="宋体" w:cs="宋体"/>
                 <w:b w:val="0"/>
                 <w:color w:val="000000"/>
                 <w:sz w:val="21"/>
@@ -2659,7 +2687,7 @@
             </w:pPr>
             <w:r>
               <w:rPr>
-                <w:rFonts w:ascii="宋体" w:hAnsi="宋体" w:eastAsia="宋体"/>
+                <w:rFonts w:ascii="宋体" w:hAnsi="宋体" w:eastAsia="宋体" w:cs="宋体"/>
                 <w:b w:val="0"/>
                 <w:color w:val="000000"/>
                 <w:sz w:val="21"/>
@@ -2685,7 +2713,7 @@
             </w:pPr>
             <w:r>
               <w:rPr>
-                <w:rFonts w:ascii="宋体" w:hAnsi="宋体" w:eastAsia="宋体"/>
+                <w:rFonts w:ascii="宋体" w:hAnsi="宋体" w:eastAsia="宋体" w:cs="宋体"/>
                 <w:b w:val="0"/>
                 <w:color w:val="000000"/>
                 <w:sz w:val="21"/>
@@ -2711,7 +2739,7 @@
             </w:pPr>
             <w:r>
               <w:rPr>
-                <w:rFonts w:ascii="宋体" w:hAnsi="宋体" w:eastAsia="宋体"/>
+                <w:rFonts w:ascii="宋体" w:hAnsi="宋体" w:eastAsia="宋体" w:cs="宋体"/>
                 <w:b w:val="0"/>
                 <w:color w:val="000000"/>
                 <w:sz w:val="21"/>
@@ -2739,7 +2767,7 @@
             </w:pPr>
             <w:r>
               <w:rPr>
-                <w:rFonts w:ascii="宋体" w:hAnsi="宋体" w:eastAsia="宋体"/>
+                <w:rFonts w:ascii="宋体" w:hAnsi="宋体" w:eastAsia="宋体" w:cs="宋体"/>
                 <w:b w:val="0"/>
                 <w:color w:val="000000"/>
                 <w:sz w:val="21"/>
@@ -2765,7 +2793,7 @@
             </w:pPr>
             <w:r>
               <w:rPr>
-                <w:rFonts w:ascii="宋体" w:hAnsi="宋体" w:eastAsia="宋体"/>
+                <w:rFonts w:ascii="宋体" w:hAnsi="宋体" w:eastAsia="宋体" w:cs="宋体"/>
                 <w:b w:val="0"/>
                 <w:color w:val="000000"/>
                 <w:sz w:val="21"/>
@@ -2791,7 +2819,7 @@
             </w:pPr>
             <w:r>
               <w:rPr>
-                <w:rFonts w:ascii="宋体" w:hAnsi="宋体" w:eastAsia="宋体"/>
+                <w:rFonts w:ascii="宋体" w:hAnsi="宋体" w:eastAsia="宋体" w:cs="宋体"/>
                 <w:b w:val="0"/>
                 <w:color w:val="000000"/>
                 <w:sz w:val="21"/>
@@ -2817,7 +2845,7 @@
             </w:pPr>
             <w:r>
               <w:rPr>
-                <w:rFonts w:ascii="宋体" w:hAnsi="宋体" w:eastAsia="宋体"/>
+                <w:rFonts w:ascii="宋体" w:hAnsi="宋体" w:eastAsia="宋体" w:cs="宋体"/>
                 <w:b w:val="0"/>
                 <w:color w:val="000000"/>
                 <w:sz w:val="21"/>
@@ -2834,7 +2862,7 @@
       </w:pPr>
       <w:r>
         <w:rPr>
-          <w:rFonts w:ascii="宋体" w:hAnsi="宋体" w:eastAsia="宋体"/>
+          <w:rFonts w:ascii="宋体" w:hAnsi="宋体" w:eastAsia="宋体" w:cs="宋体"/>
           <w:b w:val="0"/>
           <w:color w:val="000000"/>
           <w:sz w:val="22"/>
@@ -2874,7 +2902,7 @@
             </w:pPr>
             <w:r>
               <w:rPr>
-                <w:rFonts w:ascii="宋体" w:hAnsi="宋体" w:eastAsia="宋体"/>
+                <w:rFonts w:ascii="宋体" w:hAnsi="宋体" w:eastAsia="宋体" w:cs="宋体"/>
                 <w:b/>
                 <w:color w:val="000000"/>
                 <w:sz w:val="21"/>
@@ -2901,7 +2929,7 @@
             </w:pPr>
             <w:r>
               <w:rPr>
-                <w:rFonts w:ascii="宋体" w:hAnsi="宋体" w:eastAsia="宋体"/>
+                <w:rFonts w:ascii="宋体" w:hAnsi="宋体" w:eastAsia="宋体" w:cs="宋体"/>
                 <w:b/>
                 <w:color w:val="000000"/>
                 <w:sz w:val="21"/>
@@ -2928,7 +2956,7 @@
             </w:pPr>
             <w:r>
               <w:rPr>
-                <w:rFonts w:ascii="宋体" w:hAnsi="宋体" w:eastAsia="宋体"/>
+                <w:rFonts w:ascii="宋体" w:hAnsi="宋体" w:eastAsia="宋体" w:cs="宋体"/>
                 <w:b/>
                 <w:color w:val="000000"/>
                 <w:sz w:val="21"/>
@@ -2956,7 +2984,7 @@
             </w:pPr>
             <w:r>
               <w:rPr>
-                <w:rFonts w:ascii="宋体" w:hAnsi="宋体" w:eastAsia="宋体"/>
+                <w:rFonts w:ascii="宋体" w:hAnsi="宋体" w:eastAsia="宋体" w:cs="宋体"/>
                 <w:b w:val="0"/>
                 <w:color w:val="000000"/>
                 <w:sz w:val="21"/>
@@ -2982,7 +3010,7 @@
             </w:pPr>
             <w:r>
               <w:rPr>
-                <w:rFonts w:ascii="宋体" w:hAnsi="宋体" w:eastAsia="宋体"/>
+                <w:rFonts w:ascii="宋体" w:hAnsi="宋体" w:eastAsia="宋体" w:cs="宋体"/>
                 <w:b w:val="0"/>
                 <w:color w:val="000000"/>
                 <w:sz w:val="21"/>
@@ -3008,7 +3036,7 @@
             </w:pPr>
             <w:r>
               <w:rPr>
-                <w:rFonts w:ascii="宋体" w:hAnsi="宋体" w:eastAsia="宋体"/>
+                <w:rFonts w:ascii="宋体" w:hAnsi="宋体" w:eastAsia="宋体" w:cs="宋体"/>
                 <w:b w:val="0"/>
                 <w:color w:val="000000"/>
                 <w:sz w:val="21"/>
@@ -3036,7 +3064,7 @@
             </w:pPr>
             <w:r>
               <w:rPr>
-                <w:rFonts w:ascii="宋体" w:hAnsi="宋体" w:eastAsia="宋体"/>
+                <w:rFonts w:ascii="宋体" w:hAnsi="宋体" w:eastAsia="宋体" w:cs="宋体"/>
                 <w:b w:val="0"/>
                 <w:color w:val="000000"/>
                 <w:sz w:val="21"/>
@@ -3062,7 +3090,7 @@
             </w:pPr>
             <w:r>
               <w:rPr>
-                <w:rFonts w:ascii="宋体" w:hAnsi="宋体" w:eastAsia="宋体"/>
+                <w:rFonts w:ascii="宋体" w:hAnsi="宋体" w:eastAsia="宋体" w:cs="宋体"/>
                 <w:b w:val="0"/>
                 <w:color w:val="000000"/>
                 <w:sz w:val="21"/>
@@ -3088,7 +3116,7 @@
             </w:pPr>
             <w:r>
               <w:rPr>
-                <w:rFonts w:ascii="宋体" w:hAnsi="宋体" w:eastAsia="宋体"/>
+                <w:rFonts w:ascii="宋体" w:hAnsi="宋体" w:eastAsia="宋体" w:cs="宋体"/>
                 <w:b w:val="0"/>
                 <w:color w:val="000000"/>
                 <w:sz w:val="21"/>
@@ -3116,7 +3144,7 @@
             </w:pPr>
             <w:r>
               <w:rPr>
-                <w:rFonts w:ascii="宋体" w:hAnsi="宋体" w:eastAsia="宋体"/>
+                <w:rFonts w:ascii="宋体" w:hAnsi="宋体" w:eastAsia="宋体" w:cs="宋体"/>
                 <w:b w:val="0"/>
                 <w:color w:val="000000"/>
                 <w:sz w:val="21"/>
@@ -3142,7 +3170,7 @@
             </w:pPr>
             <w:r>
               <w:rPr>
-                <w:rFonts w:ascii="宋体" w:hAnsi="宋体" w:eastAsia="宋体"/>
+                <w:rFonts w:ascii="宋体" w:hAnsi="宋体" w:eastAsia="宋体" w:cs="宋体"/>
                 <w:b w:val="0"/>
                 <w:color w:val="000000"/>
                 <w:sz w:val="21"/>
@@ -3168,7 +3196,7 @@
             </w:pPr>
             <w:r>
               <w:rPr>
-                <w:rFonts w:ascii="宋体" w:hAnsi="宋体" w:eastAsia="宋体"/>
+                <w:rFonts w:ascii="宋体" w:hAnsi="宋体" w:eastAsia="宋体" w:cs="宋体"/>
                 <w:b w:val="0"/>
                 <w:color w:val="000000"/>
                 <w:sz w:val="21"/>
@@ -3196,7 +3224,7 @@
             </w:pPr>
             <w:r>
               <w:rPr>
-                <w:rFonts w:ascii="宋体" w:hAnsi="宋体" w:eastAsia="宋体"/>
+                <w:rFonts w:ascii="宋体" w:hAnsi="宋体" w:eastAsia="宋体" w:cs="宋体"/>
                 <w:b w:val="0"/>
                 <w:color w:val="000000"/>
                 <w:sz w:val="21"/>
@@ -3222,7 +3250,7 @@
             </w:pPr>
             <w:r>
               <w:rPr>
-                <w:rFonts w:ascii="宋体" w:hAnsi="宋体" w:eastAsia="宋体"/>
+                <w:rFonts w:ascii="宋体" w:hAnsi="宋体" w:eastAsia="宋体" w:cs="宋体"/>
                 <w:b w:val="0"/>
                 <w:color w:val="000000"/>
                 <w:sz w:val="21"/>
@@ -3248,7 +3276,7 @@
             </w:pPr>
             <w:r>
               <w:rPr>
-                <w:rFonts w:ascii="宋体" w:hAnsi="宋体" w:eastAsia="宋体"/>
+                <w:rFonts w:ascii="宋体" w:hAnsi="宋体" w:eastAsia="宋体" w:cs="宋体"/>
                 <w:b w:val="0"/>
                 <w:color w:val="000000"/>
                 <w:sz w:val="21"/>
@@ -3276,7 +3304,7 @@
             </w:pPr>
             <w:r>
               <w:rPr>
-                <w:rFonts w:ascii="宋体" w:hAnsi="宋体" w:eastAsia="宋体"/>
+                <w:rFonts w:ascii="宋体" w:hAnsi="宋体" w:eastAsia="宋体" w:cs="宋体"/>
                 <w:b w:val="0"/>
                 <w:color w:val="000000"/>
                 <w:sz w:val="21"/>
@@ -3302,7 +3330,7 @@
             </w:pPr>
             <w:r>
               <w:rPr>
-                <w:rFonts w:ascii="宋体" w:hAnsi="宋体" w:eastAsia="宋体"/>
+                <w:rFonts w:ascii="宋体" w:hAnsi="宋体" w:eastAsia="宋体" w:cs="宋体"/>
                 <w:b w:val="0"/>
                 <w:color w:val="000000"/>
                 <w:sz w:val="21"/>
@@ -3328,7 +3356,7 @@
             </w:pPr>
             <w:r>
               <w:rPr>
-                <w:rFonts w:ascii="宋体" w:hAnsi="宋体" w:eastAsia="宋体"/>
+                <w:rFonts w:ascii="宋体" w:hAnsi="宋体" w:eastAsia="宋体" w:cs="宋体"/>
                 <w:b w:val="0"/>
                 <w:color w:val="000000"/>
                 <w:sz w:val="21"/>
@@ -3356,7 +3384,7 @@
             </w:pPr>
             <w:r>
               <w:rPr>
-                <w:rFonts w:ascii="宋体" w:hAnsi="宋体" w:eastAsia="宋体"/>
+                <w:rFonts w:ascii="宋体" w:hAnsi="宋体" w:eastAsia="宋体" w:cs="宋体"/>
                 <w:b w:val="0"/>
                 <w:color w:val="000000"/>
                 <w:sz w:val="21"/>
@@ -3382,7 +3410,7 @@
             </w:pPr>
             <w:r>
               <w:rPr>
-                <w:rFonts w:ascii="宋体" w:hAnsi="宋体" w:eastAsia="宋体"/>
+                <w:rFonts w:ascii="宋体" w:hAnsi="宋体" w:eastAsia="宋体" w:cs="宋体"/>
                 <w:b w:val="0"/>
                 <w:color w:val="000000"/>
                 <w:sz w:val="21"/>
@@ -3408,7 +3436,7 @@
             </w:pPr>
             <w:r>
               <w:rPr>
-                <w:rFonts w:ascii="宋体" w:hAnsi="宋体" w:eastAsia="宋体"/>
+                <w:rFonts w:ascii="宋体" w:hAnsi="宋体" w:eastAsia="宋体" w:cs="宋体"/>
                 <w:b w:val="0"/>
                 <w:color w:val="000000"/>
                 <w:sz w:val="21"/>
@@ -3436,7 +3464,7 @@
             </w:pPr>
             <w:r>
               <w:rPr>
-                <w:rFonts w:ascii="宋体" w:hAnsi="宋体" w:eastAsia="宋体"/>
+                <w:rFonts w:ascii="宋体" w:hAnsi="宋体" w:eastAsia="宋体" w:cs="宋体"/>
                 <w:b w:val="0"/>
                 <w:color w:val="000000"/>
                 <w:sz w:val="21"/>
@@ -3462,7 +3490,7 @@
             </w:pPr>
             <w:r>
               <w:rPr>
-                <w:rFonts w:ascii="宋体" w:hAnsi="宋体" w:eastAsia="宋体"/>
+                <w:rFonts w:ascii="宋体" w:hAnsi="宋体" w:eastAsia="宋体" w:cs="宋体"/>
                 <w:b w:val="0"/>
                 <w:color w:val="000000"/>
                 <w:sz w:val="21"/>
@@ -3488,7 +3516,7 @@
             </w:pPr>
             <w:r>
               <w:rPr>
-                <w:rFonts w:ascii="宋体" w:hAnsi="宋体" w:eastAsia="宋体"/>
+                <w:rFonts w:ascii="宋体" w:hAnsi="宋体" w:eastAsia="宋体" w:cs="宋体"/>
                 <w:b w:val="0"/>
                 <w:color w:val="000000"/>
                 <w:sz w:val="21"/>
@@ -3516,7 +3544,7 @@
             </w:pPr>
             <w:r>
               <w:rPr>
-                <w:rFonts w:ascii="宋体" w:hAnsi="宋体" w:eastAsia="宋体"/>
+                <w:rFonts w:ascii="宋体" w:hAnsi="宋体" w:eastAsia="宋体" w:cs="宋体"/>
                 <w:b w:val="0"/>
                 <w:color w:val="000000"/>
                 <w:sz w:val="21"/>
@@ -3542,7 +3570,7 @@
             </w:pPr>
             <w:r>
               <w:rPr>
-                <w:rFonts w:ascii="宋体" w:hAnsi="宋体" w:eastAsia="宋体"/>
+                <w:rFonts w:ascii="宋体" w:hAnsi="宋体" w:eastAsia="宋体" w:cs="宋体"/>
                 <w:b w:val="0"/>
                 <w:color w:val="000000"/>
                 <w:sz w:val="21"/>
@@ -3568,7 +3596,7 @@
             </w:pPr>
             <w:r>
               <w:rPr>
-                <w:rFonts w:ascii="宋体" w:hAnsi="宋体" w:eastAsia="宋体"/>
+                <w:rFonts w:ascii="宋体" w:hAnsi="宋体" w:eastAsia="宋体" w:cs="宋体"/>
                 <w:b w:val="0"/>
                 <w:color w:val="000000"/>
                 <w:sz w:val="21"/>
@@ -3585,7 +3613,7 @@
       </w:pPr>
       <w:r>
         <w:rPr>
-          <w:rFonts w:ascii="宋体" w:hAnsi="宋体" w:eastAsia="宋体"/>
+          <w:rFonts w:ascii="宋体" w:hAnsi="宋体" w:eastAsia="宋体" w:cs="宋体"/>
           <w:b w:val="0"/>
           <w:color w:val="000000"/>
           <w:sz w:val="22"/>
@@ -3625,7 +3653,7 @@
             </w:pPr>
             <w:r>
               <w:rPr>
-                <w:rFonts w:ascii="宋体" w:hAnsi="宋体" w:eastAsia="宋体"/>
+                <w:rFonts w:ascii="宋体" w:hAnsi="宋体" w:eastAsia="宋体" w:cs="宋体"/>
                 <w:b/>
                 <w:color w:val="000000"/>
                 <w:sz w:val="21"/>
@@ -3652,7 +3680,7 @@
             </w:pPr>
             <w:r>
               <w:rPr>
-                <w:rFonts w:ascii="宋体" w:hAnsi="宋体" w:eastAsia="宋体"/>
+                <w:rFonts w:ascii="宋体" w:hAnsi="宋体" w:eastAsia="宋体" w:cs="宋体"/>
                 <w:b/>
                 <w:color w:val="000000"/>
                 <w:sz w:val="21"/>
@@ -3679,7 +3707,7 @@
             </w:pPr>
             <w:r>
               <w:rPr>
-                <w:rFonts w:ascii="宋体" w:hAnsi="宋体" w:eastAsia="宋体"/>
+                <w:rFonts w:ascii="宋体" w:hAnsi="宋体" w:eastAsia="宋体" w:cs="宋体"/>
                 <w:b/>
                 <w:color w:val="000000"/>
                 <w:sz w:val="21"/>
@@ -3707,7 +3735,7 @@
             </w:pPr>
             <w:r>
               <w:rPr>
-                <w:rFonts w:ascii="宋体" w:hAnsi="宋体" w:eastAsia="宋体"/>
+                <w:rFonts w:ascii="宋体" w:hAnsi="宋体" w:eastAsia="宋体" w:cs="宋体"/>
                 <w:b w:val="0"/>
                 <w:color w:val="000000"/>
                 <w:sz w:val="21"/>
@@ -3733,7 +3761,7 @@
             </w:pPr>
             <w:r>
               <w:rPr>
-                <w:rFonts w:ascii="宋体" w:hAnsi="宋体" w:eastAsia="宋体"/>
+                <w:rFonts w:ascii="宋体" w:hAnsi="宋体" w:eastAsia="宋体" w:cs="宋体"/>
                 <w:b w:val="0"/>
                 <w:color w:val="000000"/>
                 <w:sz w:val="21"/>
@@ -3759,7 +3787,7 @@
             </w:pPr>
             <w:r>
               <w:rPr>
-                <w:rFonts w:ascii="宋体" w:hAnsi="宋体" w:eastAsia="宋体"/>
+                <w:rFonts w:ascii="宋体" w:hAnsi="宋体" w:eastAsia="宋体" w:cs="宋体"/>
                 <w:b w:val="0"/>
                 <w:color w:val="000000"/>
                 <w:sz w:val="21"/>
@@ -3787,7 +3815,7 @@
             </w:pPr>
             <w:r>
               <w:rPr>
-                <w:rFonts w:ascii="宋体" w:hAnsi="宋体" w:eastAsia="宋体"/>
+                <w:rFonts w:ascii="宋体" w:hAnsi="宋体" w:eastAsia="宋体" w:cs="宋体"/>
                 <w:b w:val="0"/>
                 <w:color w:val="000000"/>
                 <w:sz w:val="21"/>
@@ -3813,7 +3841,7 @@
             </w:pPr>
             <w:r>
               <w:rPr>
-                <w:rFonts w:ascii="宋体" w:hAnsi="宋体" w:eastAsia="宋体"/>
+                <w:rFonts w:ascii="宋体" w:hAnsi="宋体" w:eastAsia="宋体" w:cs="宋体"/>
                 <w:b w:val="0"/>
                 <w:color w:val="000000"/>
                 <w:sz w:val="21"/>
@@ -3839,7 +3867,7 @@
             </w:pPr>
             <w:r>
               <w:rPr>
-                <w:rFonts w:ascii="宋体" w:hAnsi="宋体" w:eastAsia="宋体"/>
+                <w:rFonts w:ascii="宋体" w:hAnsi="宋体" w:eastAsia="宋体" w:cs="宋体"/>
                 <w:b w:val="0"/>
                 <w:color w:val="000000"/>
                 <w:sz w:val="21"/>
@@ -3867,7 +3895,7 @@
             </w:pPr>
             <w:r>
               <w:rPr>
-                <w:rFonts w:ascii="宋体" w:hAnsi="宋体" w:eastAsia="宋体"/>
+                <w:rFonts w:ascii="宋体" w:hAnsi="宋体" w:eastAsia="宋体" w:cs="宋体"/>
                 <w:b w:val="0"/>
                 <w:color w:val="000000"/>
                 <w:sz w:val="21"/>
@@ -3893,7 +3921,7 @@
             </w:pPr>
             <w:r>
               <w:rPr>
-                <w:rFonts w:ascii="宋体" w:hAnsi="宋体" w:eastAsia="宋体"/>
+                <w:rFonts w:ascii="宋体" w:hAnsi="宋体" w:eastAsia="宋体" w:cs="宋体"/>
                 <w:b w:val="0"/>
                 <w:color w:val="000000"/>
                 <w:sz w:val="21"/>
@@ -3919,7 +3947,7 @@
             </w:pPr>
             <w:r>
               <w:rPr>
-                <w:rFonts w:ascii="宋体" w:hAnsi="宋体" w:eastAsia="宋体"/>
+                <w:rFonts w:ascii="宋体" w:hAnsi="宋体" w:eastAsia="宋体" w:cs="宋体"/>
                 <w:b w:val="0"/>
                 <w:color w:val="000000"/>
                 <w:sz w:val="21"/>
@@ -3947,7 +3975,7 @@
             </w:pPr>
             <w:r>
               <w:rPr>
-                <w:rFonts w:ascii="宋体" w:hAnsi="宋体" w:eastAsia="宋体"/>
+                <w:rFonts w:ascii="宋体" w:hAnsi="宋体" w:eastAsia="宋体" w:cs="宋体"/>
                 <w:b w:val="0"/>
                 <w:color w:val="000000"/>
                 <w:sz w:val="21"/>
@@ -3973,7 +4001,7 @@
             </w:pPr>
             <w:r>
               <w:rPr>
-                <w:rFonts w:ascii="宋体" w:hAnsi="宋体" w:eastAsia="宋体"/>
+                <w:rFonts w:ascii="宋体" w:hAnsi="宋体" w:eastAsia="宋体" w:cs="宋体"/>
                 <w:b w:val="0"/>
                 <w:color w:val="000000"/>
                 <w:sz w:val="21"/>
@@ -3999,7 +4027,7 @@
             </w:pPr>
             <w:r>
               <w:rPr>
-                <w:rFonts w:ascii="宋体" w:hAnsi="宋体" w:eastAsia="宋体"/>
+                <w:rFonts w:ascii="宋体" w:hAnsi="宋体" w:eastAsia="宋体" w:cs="宋体"/>
                 <w:b w:val="0"/>
                 <w:color w:val="000000"/>
                 <w:sz w:val="21"/>
@@ -4027,7 +4055,7 @@
             </w:pPr>
             <w:r>
               <w:rPr>
-                <w:rFonts w:ascii="宋体" w:hAnsi="宋体" w:eastAsia="宋体"/>
+                <w:rFonts w:ascii="宋体" w:hAnsi="宋体" w:eastAsia="宋体" w:cs="宋体"/>
                 <w:b w:val="0"/>
                 <w:color w:val="000000"/>
                 <w:sz w:val="21"/>
@@ -4053,7 +4081,7 @@
             </w:pPr>
             <w:r>
               <w:rPr>
-                <w:rFonts w:ascii="宋体" w:hAnsi="宋体" w:eastAsia="宋体"/>
+                <w:rFonts w:ascii="宋体" w:hAnsi="宋体" w:eastAsia="宋体" w:cs="宋体"/>
                 <w:b w:val="0"/>
                 <w:color w:val="000000"/>
                 <w:sz w:val="21"/>
@@ -4079,7 +4107,7 @@
             </w:pPr>
             <w:r>
               <w:rPr>
-                <w:rFonts w:ascii="宋体" w:hAnsi="宋体" w:eastAsia="宋体"/>
+                <w:rFonts w:ascii="宋体" w:hAnsi="宋体" w:eastAsia="宋体" w:cs="宋体"/>
                 <w:b w:val="0"/>
                 <w:color w:val="000000"/>
                 <w:sz w:val="21"/>
@@ -4107,7 +4135,7 @@
             </w:pPr>
             <w:r>
               <w:rPr>
-                <w:rFonts w:ascii="宋体" w:hAnsi="宋体" w:eastAsia="宋体"/>
+                <w:rFonts w:ascii="宋体" w:hAnsi="宋体" w:eastAsia="宋体" w:cs="宋体"/>
                 <w:b w:val="0"/>
                 <w:color w:val="000000"/>
                 <w:sz w:val="21"/>
@@ -4133,7 +4161,7 @@
             </w:pPr>
             <w:r>
               <w:rPr>
-                <w:rFonts w:ascii="宋体" w:hAnsi="宋体" w:eastAsia="宋体"/>
+                <w:rFonts w:ascii="宋体" w:hAnsi="宋体" w:eastAsia="宋体" w:cs="宋体"/>
                 <w:b w:val="0"/>
                 <w:color w:val="000000"/>
                 <w:sz w:val="21"/>
@@ -4159,7 +4187,7 @@
             </w:pPr>
             <w:r>
               <w:rPr>
-                <w:rFonts w:ascii="宋体" w:hAnsi="宋体" w:eastAsia="宋体"/>
+                <w:rFonts w:ascii="宋体" w:hAnsi="宋体" w:eastAsia="宋体" w:cs="宋体"/>
                 <w:b w:val="0"/>
                 <w:color w:val="000000"/>
                 <w:sz w:val="21"/>
@@ -4187,7 +4215,7 @@
             </w:pPr>
             <w:r>
               <w:rPr>
-                <w:rFonts w:ascii="宋体" w:hAnsi="宋体" w:eastAsia="宋体"/>
+                <w:rFonts w:ascii="宋体" w:hAnsi="宋体" w:eastAsia="宋体" w:cs="宋体"/>
                 <w:b w:val="0"/>
                 <w:color w:val="000000"/>
                 <w:sz w:val="21"/>
@@ -4213,7 +4241,7 @@
             </w:pPr>
             <w:r>
               <w:rPr>
-                <w:rFonts w:ascii="宋体" w:hAnsi="宋体" w:eastAsia="宋体"/>
+                <w:rFonts w:ascii="宋体" w:hAnsi="宋体" w:eastAsia="宋体" w:cs="宋体"/>
                 <w:b w:val="0"/>
                 <w:color w:val="000000"/>
                 <w:sz w:val="21"/>
@@ -4239,7 +4267,7 @@
             </w:pPr>
             <w:r>
               <w:rPr>
-                <w:rFonts w:ascii="宋体" w:hAnsi="宋体" w:eastAsia="宋体"/>
+                <w:rFonts w:ascii="宋体" w:hAnsi="宋体" w:eastAsia="宋体" w:cs="宋体"/>
                 <w:b w:val="0"/>
                 <w:color w:val="000000"/>
                 <w:sz w:val="21"/>
@@ -4267,7 +4295,7 @@
             </w:pPr>
             <w:r>
               <w:rPr>
-                <w:rFonts w:ascii="宋体" w:hAnsi="宋体" w:eastAsia="宋体"/>
+                <w:rFonts w:ascii="宋体" w:hAnsi="宋体" w:eastAsia="宋体" w:cs="宋体"/>
                 <w:b w:val="0"/>
                 <w:color w:val="000000"/>
                 <w:sz w:val="21"/>
@@ -4293,7 +4321,7 @@
             </w:pPr>
             <w:r>
               <w:rPr>
-                <w:rFonts w:ascii="宋体" w:hAnsi="宋体" w:eastAsia="宋体"/>
+                <w:rFonts w:ascii="宋体" w:hAnsi="宋体" w:eastAsia="宋体" w:cs="宋体"/>
                 <w:b w:val="0"/>
                 <w:color w:val="000000"/>
                 <w:sz w:val="21"/>
@@ -4319,7 +4347,7 @@
             </w:pPr>
             <w:r>
               <w:rPr>
-                <w:rFonts w:ascii="宋体" w:hAnsi="宋体" w:eastAsia="宋体"/>
+                <w:rFonts w:ascii="宋体" w:hAnsi="宋体" w:eastAsia="宋体" w:cs="宋体"/>
                 <w:b w:val="0"/>
                 <w:color w:val="000000"/>
                 <w:sz w:val="21"/>
@@ -4336,7 +4364,7 @@
       </w:pPr>
       <w:r>
         <w:rPr>
-          <w:rFonts w:ascii="宋体" w:hAnsi="宋体" w:eastAsia="宋体"/>
+          <w:rFonts w:ascii="宋体" w:hAnsi="宋体" w:eastAsia="宋体" w:cs="宋体"/>
           <w:b w:val="0"/>
           <w:color w:val="000000"/>
           <w:sz w:val="22"/>
@@ -4376,7 +4404,7 @@
             </w:pPr>
             <w:r>
               <w:rPr>
-                <w:rFonts w:ascii="宋体" w:hAnsi="宋体" w:eastAsia="宋体"/>
+                <w:rFonts w:ascii="宋体" w:hAnsi="宋体" w:eastAsia="宋体" w:cs="宋体"/>
                 <w:b/>
                 <w:color w:val="000000"/>
                 <w:sz w:val="21"/>
@@ -4403,7 +4431,7 @@
             </w:pPr>
             <w:r>
               <w:rPr>
-                <w:rFonts w:ascii="宋体" w:hAnsi="宋体" w:eastAsia="宋体"/>
+                <w:rFonts w:ascii="宋体" w:hAnsi="宋体" w:eastAsia="宋体" w:cs="宋体"/>
                 <w:b/>
                 <w:color w:val="000000"/>
                 <w:sz w:val="21"/>
@@ -4430,7 +4458,7 @@
             </w:pPr>
             <w:r>
               <w:rPr>
-                <w:rFonts w:ascii="宋体" w:hAnsi="宋体" w:eastAsia="宋体"/>
+                <w:rFonts w:ascii="宋体" w:hAnsi="宋体" w:eastAsia="宋体" w:cs="宋体"/>
                 <w:b/>
                 <w:color w:val="000000"/>
                 <w:sz w:val="21"/>
@@ -4458,7 +4486,7 @@
             </w:pPr>
             <w:r>
               <w:rPr>
-                <w:rFonts w:ascii="宋体" w:hAnsi="宋体" w:eastAsia="宋体"/>
+                <w:rFonts w:ascii="宋体" w:hAnsi="宋体" w:eastAsia="宋体" w:cs="宋体"/>
                 <w:b w:val="0"/>
                 <w:color w:val="000000"/>
                 <w:sz w:val="21"/>
@@ -4484,7 +4512,7 @@
             </w:pPr>
             <w:r>
               <w:rPr>
-                <w:rFonts w:ascii="宋体" w:hAnsi="宋体" w:eastAsia="宋体"/>
+                <w:rFonts w:ascii="宋体" w:hAnsi="宋体" w:eastAsia="宋体" w:cs="宋体"/>
                 <w:b w:val="0"/>
                 <w:color w:val="000000"/>
                 <w:sz w:val="21"/>
@@ -4510,7 +4538,7 @@
             </w:pPr>
             <w:r>
               <w:rPr>
-                <w:rFonts w:ascii="宋体" w:hAnsi="宋体" w:eastAsia="宋体"/>
+                <w:rFonts w:ascii="宋体" w:hAnsi="宋体" w:eastAsia="宋体" w:cs="宋体"/>
                 <w:b w:val="0"/>
                 <w:color w:val="000000"/>
                 <w:sz w:val="21"/>
@@ -4538,7 +4566,7 @@
             </w:pPr>
             <w:r>
               <w:rPr>
-                <w:rFonts w:ascii="宋体" w:hAnsi="宋体" w:eastAsia="宋体"/>
+                <w:rFonts w:ascii="宋体" w:hAnsi="宋体" w:eastAsia="宋体" w:cs="宋体"/>
                 <w:b w:val="0"/>
                 <w:color w:val="000000"/>
                 <w:sz w:val="21"/>
@@ -4564,7 +4592,7 @@
             </w:pPr>
             <w:r>
               <w:rPr>
-                <w:rFonts w:ascii="宋体" w:hAnsi="宋体" w:eastAsia="宋体"/>
+                <w:rFonts w:ascii="宋体" w:hAnsi="宋体" w:eastAsia="宋体" w:cs="宋体"/>
                 <w:b w:val="0"/>
                 <w:color w:val="000000"/>
                 <w:sz w:val="21"/>
@@ -4590,7 +4618,7 @@
             </w:pPr>
             <w:r>
               <w:rPr>
-                <w:rFonts w:ascii="宋体" w:hAnsi="宋体" w:eastAsia="宋体"/>
+                <w:rFonts w:ascii="宋体" w:hAnsi="宋体" w:eastAsia="宋体" w:cs="宋体"/>
                 <w:b w:val="0"/>
                 <w:color w:val="000000"/>
                 <w:sz w:val="21"/>
@@ -4618,7 +4646,7 @@
             </w:pPr>
             <w:r>
               <w:rPr>
-                <w:rFonts w:ascii="宋体" w:hAnsi="宋体" w:eastAsia="宋体"/>
+                <w:rFonts w:ascii="宋体" w:hAnsi="宋体" w:eastAsia="宋体" w:cs="宋体"/>
                 <w:b w:val="0"/>
                 <w:color w:val="000000"/>
                 <w:sz w:val="21"/>
@@ -4644,7 +4672,7 @@
             </w:pPr>
             <w:r>
               <w:rPr>
-                <w:rFonts w:ascii="宋体" w:hAnsi="宋体" w:eastAsia="宋体"/>
+                <w:rFonts w:ascii="宋体" w:hAnsi="宋体" w:eastAsia="宋体" w:cs="宋体"/>
                 <w:b w:val="0"/>
                 <w:color w:val="000000"/>
                 <w:sz w:val="21"/>
@@ -4670,7 +4698,7 @@
             </w:pPr>
             <w:r>
               <w:rPr>
-                <w:rFonts w:ascii="宋体" w:hAnsi="宋体" w:eastAsia="宋体"/>
+                <w:rFonts w:ascii="宋体" w:hAnsi="宋体" w:eastAsia="宋体" w:cs="宋体"/>
                 <w:b w:val="0"/>
                 <w:color w:val="000000"/>
                 <w:sz w:val="21"/>
@@ -4698,7 +4726,7 @@
             </w:pPr>
             <w:r>
               <w:rPr>
-                <w:rFonts w:ascii="宋体" w:hAnsi="宋体" w:eastAsia="宋体"/>
+                <w:rFonts w:ascii="宋体" w:hAnsi="宋体" w:eastAsia="宋体" w:cs="宋体"/>
                 <w:b w:val="0"/>
                 <w:color w:val="000000"/>
                 <w:sz w:val="21"/>
@@ -4724,7 +4752,7 @@
             </w:pPr>
             <w:r>
               <w:rPr>
-                <w:rFonts w:ascii="宋体" w:hAnsi="宋体" w:eastAsia="宋体"/>
+                <w:rFonts w:ascii="宋体" w:hAnsi="宋体" w:eastAsia="宋体" w:cs="宋体"/>
                 <w:b w:val="0"/>
                 <w:color w:val="000000"/>
                 <w:sz w:val="21"/>
@@ -4750,7 +4778,7 @@
             </w:pPr>
             <w:r>
               <w:rPr>
-                <w:rFonts w:ascii="宋体" w:hAnsi="宋体" w:eastAsia="宋体"/>
+                <w:rFonts w:ascii="宋体" w:hAnsi="宋体" w:eastAsia="宋体" w:cs="宋体"/>
                 <w:b w:val="0"/>
                 <w:color w:val="000000"/>
                 <w:sz w:val="21"/>
@@ -4778,7 +4806,7 @@
             </w:pPr>
             <w:r>
               <w:rPr>
-                <w:rFonts w:ascii="宋体" w:hAnsi="宋体" w:eastAsia="宋体"/>
+                <w:rFonts w:ascii="宋体" w:hAnsi="宋体" w:eastAsia="宋体" w:cs="宋体"/>
                 <w:b w:val="0"/>
                 <w:color w:val="000000"/>
                 <w:sz w:val="21"/>
@@ -4804,7 +4832,7 @@
             </w:pPr>
             <w:r>
               <w:rPr>
-                <w:rFonts w:ascii="宋体" w:hAnsi="宋体" w:eastAsia="宋体"/>
+                <w:rFonts w:ascii="宋体" w:hAnsi="宋体" w:eastAsia="宋体" w:cs="宋体"/>
                 <w:b w:val="0"/>
                 <w:color w:val="000000"/>
                 <w:sz w:val="21"/>
@@ -4830,7 +4858,7 @@
             </w:pPr>
             <w:r>
               <w:rPr>
-                <w:rFonts w:ascii="宋体" w:hAnsi="宋体" w:eastAsia="宋体"/>
+                <w:rFonts w:ascii="宋体" w:hAnsi="宋体" w:eastAsia="宋体" w:cs="宋体"/>
                 <w:b w:val="0"/>
                 <w:color w:val="000000"/>
                 <w:sz w:val="21"/>
@@ -4858,7 +4886,7 @@
             </w:pPr>
             <w:r>
               <w:rPr>
-                <w:rFonts w:ascii="宋体" w:hAnsi="宋体" w:eastAsia="宋体"/>
+                <w:rFonts w:ascii="宋体" w:hAnsi="宋体" w:eastAsia="宋体" w:cs="宋体"/>
                 <w:b w:val="0"/>
                 <w:color w:val="000000"/>
                 <w:sz w:val="21"/>
@@ -4884,7 +4912,7 @@
             </w:pPr>
             <w:r>
               <w:rPr>
-                <w:rFonts w:ascii="宋体" w:hAnsi="宋体" w:eastAsia="宋体"/>
+                <w:rFonts w:ascii="宋体" w:hAnsi="宋体" w:eastAsia="宋体" w:cs="宋体"/>
                 <w:b w:val="0"/>
                 <w:color w:val="000000"/>
                 <w:sz w:val="21"/>
@@ -4910,7 +4938,7 @@
             </w:pPr>
             <w:r>
               <w:rPr>
-                <w:rFonts w:ascii="宋体" w:hAnsi="宋体" w:eastAsia="宋体"/>
+                <w:rFonts w:ascii="宋体" w:hAnsi="宋体" w:eastAsia="宋体" w:cs="宋体"/>
                 <w:b w:val="0"/>
                 <w:color w:val="000000"/>
                 <w:sz w:val="21"/>
@@ -4938,7 +4966,7 @@
             </w:pPr>
             <w:r>
               <w:rPr>
-                <w:rFonts w:ascii="宋体" w:hAnsi="宋体" w:eastAsia="宋体"/>
+                <w:rFonts w:ascii="宋体" w:hAnsi="宋体" w:eastAsia="宋体" w:cs="宋体"/>
                 <w:b w:val="0"/>
                 <w:color w:val="000000"/>
                 <w:sz w:val="21"/>
@@ -4964,7 +4992,7 @@
             </w:pPr>
             <w:r>
               <w:rPr>
-                <w:rFonts w:ascii="宋体" w:hAnsi="宋体" w:eastAsia="宋体"/>
+                <w:rFonts w:ascii="宋体" w:hAnsi="宋体" w:eastAsia="宋体" w:cs="宋体"/>
                 <w:b w:val="0"/>
                 <w:color w:val="000000"/>
                 <w:sz w:val="21"/>
@@ -4990,7 +5018,7 @@
             </w:pPr>
             <w:r>
               <w:rPr>
-                <w:rFonts w:ascii="宋体" w:hAnsi="宋体" w:eastAsia="宋体"/>
+                <w:rFonts w:ascii="宋体" w:hAnsi="宋体" w:eastAsia="宋体" w:cs="宋体"/>
                 <w:b w:val="0"/>
                 <w:color w:val="000000"/>
                 <w:sz w:val="21"/>
@@ -5018,7 +5046,7 @@
             </w:pPr>
             <w:r>
               <w:rPr>
-                <w:rFonts w:ascii="宋体" w:hAnsi="宋体" w:eastAsia="宋体"/>
+                <w:rFonts w:ascii="宋体" w:hAnsi="宋体" w:eastAsia="宋体" w:cs="宋体"/>
                 <w:b w:val="0"/>
                 <w:color w:val="000000"/>
                 <w:sz w:val="21"/>
@@ -5044,7 +5072,7 @@
             </w:pPr>
             <w:r>
               <w:rPr>
-                <w:rFonts w:ascii="宋体" w:hAnsi="宋体" w:eastAsia="宋体"/>
+                <w:rFonts w:ascii="宋体" w:hAnsi="宋体" w:eastAsia="宋体" w:cs="宋体"/>
                 <w:b w:val="0"/>
                 <w:color w:val="000000"/>
                 <w:sz w:val="21"/>
@@ -5070,7 +5098,7 @@
             </w:pPr>
             <w:r>
               <w:rPr>
-                <w:rFonts w:ascii="宋体" w:hAnsi="宋体" w:eastAsia="宋体"/>
+                <w:rFonts w:ascii="宋体" w:hAnsi="宋体" w:eastAsia="宋体" w:cs="宋体"/>
                 <w:b w:val="0"/>
                 <w:color w:val="000000"/>
                 <w:sz w:val="21"/>
@@ -5098,7 +5126,7 @@
             </w:pPr>
             <w:r>
               <w:rPr>
-                <w:rFonts w:ascii="宋体" w:hAnsi="宋体" w:eastAsia="宋体"/>
+                <w:rFonts w:ascii="宋体" w:hAnsi="宋体" w:eastAsia="宋体" w:cs="宋体"/>
                 <w:b w:val="0"/>
                 <w:color w:val="000000"/>
                 <w:sz w:val="21"/>
@@ -5124,7 +5152,7 @@
             </w:pPr>
             <w:r>
               <w:rPr>
-                <w:rFonts w:ascii="宋体" w:hAnsi="宋体" w:eastAsia="宋体"/>
+                <w:rFonts w:ascii="宋体" w:hAnsi="宋体" w:eastAsia="宋体" w:cs="宋体"/>
                 <w:b w:val="0"/>
                 <w:color w:val="000000"/>
                 <w:sz w:val="21"/>
@@ -5150,7 +5178,7 @@
             </w:pPr>
             <w:r>
               <w:rPr>
-                <w:rFonts w:ascii="宋体" w:hAnsi="宋体" w:eastAsia="宋体"/>
+                <w:rFonts w:ascii="宋体" w:hAnsi="宋体" w:eastAsia="宋体" w:cs="宋体"/>
                 <w:b w:val="0"/>
                 <w:color w:val="000000"/>
                 <w:sz w:val="21"/>
@@ -5175,8 +5203,15 @@
     <w:p>
       <w:pPr>
         <w:pStyle w:val="Heading1"/>
+        <w:spacing w:before="320" w:after="160" w:line="264" w:lineRule="auto"/>
       </w:pPr>
       <w:r>
+        <w:rPr>
+          <w:rFonts w:ascii="宋体" w:hAnsi="宋体" w:eastAsia="宋体" w:cs="宋体"/>
+          <w:b/>
+          <w:color w:val="000000"/>
+          <w:sz w:val="32"/>
+        </w:rPr>
         <w:t>5. 排名、评价人数与评分关系</w:t>
       </w:r>
     </w:p>
@@ -5186,7 +5221,7 @@
       </w:pPr>
       <w:r>
         <w:rPr>
-          <w:rFonts w:ascii="宋体" w:hAnsi="宋体" w:eastAsia="宋体"/>
+          <w:rFonts w:ascii="宋体" w:hAnsi="宋体" w:eastAsia="宋体" w:cs="宋体"/>
           <w:b w:val="0"/>
           <w:color w:val="000000"/>
           <w:sz w:val="22"/>
@@ -5200,7 +5235,7 @@
       </w:pPr>
       <w:r>
         <w:rPr>
-          <w:rFonts w:ascii="宋体" w:hAnsi="宋体" w:eastAsia="宋体"/>
+          <w:rFonts w:ascii="宋体" w:hAnsi="宋体" w:eastAsia="宋体" w:cs="宋体"/>
           <w:b w:val="0"/>
           <w:color w:val="000000"/>
           <w:sz w:val="22"/>
@@ -5241,7 +5276,7 @@
             </w:pPr>
             <w:r>
               <w:rPr>
-                <w:rFonts w:ascii="宋体" w:hAnsi="宋体" w:eastAsia="宋体"/>
+                <w:rFonts w:ascii="宋体" w:hAnsi="宋体" w:eastAsia="宋体" w:cs="宋体"/>
                 <w:b/>
                 <w:color w:val="000000"/>
                 <w:sz w:val="21"/>
@@ -5268,7 +5303,7 @@
             </w:pPr>
             <w:r>
               <w:rPr>
-                <w:rFonts w:ascii="宋体" w:hAnsi="宋体" w:eastAsia="宋体"/>
+                <w:rFonts w:ascii="宋体" w:hAnsi="宋体" w:eastAsia="宋体" w:cs="宋体"/>
                 <w:b/>
                 <w:color w:val="000000"/>
                 <w:sz w:val="21"/>
@@ -5295,7 +5330,7 @@
             </w:pPr>
             <w:r>
               <w:rPr>
-                <w:rFonts w:ascii="宋体" w:hAnsi="宋体" w:eastAsia="宋体"/>
+                <w:rFonts w:ascii="宋体" w:hAnsi="宋体" w:eastAsia="宋体" w:cs="宋体"/>
                 <w:b/>
                 <w:color w:val="000000"/>
                 <w:sz w:val="21"/>
@@ -5322,7 +5357,7 @@
             </w:pPr>
             <w:r>
               <w:rPr>
-                <w:rFonts w:ascii="宋体" w:hAnsi="宋体" w:eastAsia="宋体"/>
+                <w:rFonts w:ascii="宋体" w:hAnsi="宋体" w:eastAsia="宋体" w:cs="宋体"/>
                 <w:b/>
                 <w:color w:val="000000"/>
                 <w:sz w:val="21"/>
@@ -5350,7 +5385,7 @@
             </w:pPr>
             <w:r>
               <w:rPr>
-                <w:rFonts w:ascii="宋体" w:hAnsi="宋体" w:eastAsia="宋体"/>
+                <w:rFonts w:ascii="宋体" w:hAnsi="宋体" w:eastAsia="宋体" w:cs="宋体"/>
                 <w:b w:val="0"/>
                 <w:color w:val="000000"/>
                 <w:sz w:val="21"/>
@@ -5376,7 +5411,7 @@
             </w:pPr>
             <w:r>
               <w:rPr>
-                <w:rFonts w:ascii="宋体" w:hAnsi="宋体" w:eastAsia="宋体"/>
+                <w:rFonts w:ascii="宋体" w:hAnsi="宋体" w:eastAsia="宋体" w:cs="宋体"/>
                 <w:b w:val="0"/>
                 <w:color w:val="000000"/>
                 <w:sz w:val="21"/>
@@ -5402,7 +5437,7 @@
             </w:pPr>
             <w:r>
               <w:rPr>
-                <w:rFonts w:ascii="宋体" w:hAnsi="宋体" w:eastAsia="宋体"/>
+                <w:rFonts w:ascii="宋体" w:hAnsi="宋体" w:eastAsia="宋体" w:cs="宋体"/>
                 <w:b w:val="0"/>
                 <w:color w:val="000000"/>
                 <w:sz w:val="21"/>
@@ -5428,7 +5463,7 @@
             </w:pPr>
             <w:r>
               <w:rPr>
-                <w:rFonts w:ascii="宋体" w:hAnsi="宋体" w:eastAsia="宋体"/>
+                <w:rFonts w:ascii="宋体" w:hAnsi="宋体" w:eastAsia="宋体" w:cs="宋体"/>
                 <w:b w:val="0"/>
                 <w:color w:val="000000"/>
                 <w:sz w:val="21"/>
@@ -5456,7 +5491,7 @@
             </w:pPr>
             <w:r>
               <w:rPr>
-                <w:rFonts w:ascii="宋体" w:hAnsi="宋体" w:eastAsia="宋体"/>
+                <w:rFonts w:ascii="宋体" w:hAnsi="宋体" w:eastAsia="宋体" w:cs="宋体"/>
                 <w:b w:val="0"/>
                 <w:color w:val="000000"/>
                 <w:sz w:val="21"/>
@@ -5482,7 +5517,7 @@
             </w:pPr>
             <w:r>
               <w:rPr>
-                <w:rFonts w:ascii="宋体" w:hAnsi="宋体" w:eastAsia="宋体"/>
+                <w:rFonts w:ascii="宋体" w:hAnsi="宋体" w:eastAsia="宋体" w:cs="宋体"/>
                 <w:b w:val="0"/>
                 <w:color w:val="000000"/>
                 <w:sz w:val="21"/>
@@ -5508,7 +5543,7 @@
             </w:pPr>
             <w:r>
               <w:rPr>
-                <w:rFonts w:ascii="宋体" w:hAnsi="宋体" w:eastAsia="宋体"/>
+                <w:rFonts w:ascii="宋体" w:hAnsi="宋体" w:eastAsia="宋体" w:cs="宋体"/>
                 <w:b w:val="0"/>
                 <w:color w:val="000000"/>
                 <w:sz w:val="21"/>
@@ -5534,7 +5569,7 @@
             </w:pPr>
             <w:r>
               <w:rPr>
-                <w:rFonts w:ascii="宋体" w:hAnsi="宋体" w:eastAsia="宋体"/>
+                <w:rFonts w:ascii="宋体" w:hAnsi="宋体" w:eastAsia="宋体" w:cs="宋体"/>
                 <w:b w:val="0"/>
                 <w:color w:val="000000"/>
                 <w:sz w:val="21"/>
@@ -5562,7 +5597,7 @@
             </w:pPr>
             <w:r>
               <w:rPr>
-                <w:rFonts w:ascii="宋体" w:hAnsi="宋体" w:eastAsia="宋体"/>
+                <w:rFonts w:ascii="宋体" w:hAnsi="宋体" w:eastAsia="宋体" w:cs="宋体"/>
                 <w:b w:val="0"/>
                 <w:color w:val="000000"/>
                 <w:sz w:val="21"/>
@@ -5588,7 +5623,7 @@
             </w:pPr>
             <w:r>
               <w:rPr>
-                <w:rFonts w:ascii="宋体" w:hAnsi="宋体" w:eastAsia="宋体"/>
+                <w:rFonts w:ascii="宋体" w:hAnsi="宋体" w:eastAsia="宋体" w:cs="宋体"/>
                 <w:b w:val="0"/>
                 <w:color w:val="000000"/>
                 <w:sz w:val="21"/>
@@ -5614,7 +5649,7 @@
             </w:pPr>
             <w:r>
               <w:rPr>
-                <w:rFonts w:ascii="宋体" w:hAnsi="宋体" w:eastAsia="宋体"/>
+                <w:rFonts w:ascii="宋体" w:hAnsi="宋体" w:eastAsia="宋体" w:cs="宋体"/>
                 <w:b w:val="0"/>
                 <w:color w:val="000000"/>
                 <w:sz w:val="21"/>
@@ -5640,7 +5675,7 @@
             </w:pPr>
             <w:r>
               <w:rPr>
-                <w:rFonts w:ascii="宋体" w:hAnsi="宋体" w:eastAsia="宋体"/>
+                <w:rFonts w:ascii="宋体" w:hAnsi="宋体" w:eastAsia="宋体" w:cs="宋体"/>
                 <w:b w:val="0"/>
                 <w:color w:val="000000"/>
                 <w:sz w:val="21"/>
@@ -5668,7 +5703,7 @@
             </w:pPr>
             <w:r>
               <w:rPr>
-                <w:rFonts w:ascii="宋体" w:hAnsi="宋体" w:eastAsia="宋体"/>
+                <w:rFonts w:ascii="宋体" w:hAnsi="宋体" w:eastAsia="宋体" w:cs="宋体"/>
                 <w:b w:val="0"/>
                 <w:color w:val="000000"/>
                 <w:sz w:val="21"/>
@@ -5694,7 +5729,7 @@
             </w:pPr>
             <w:r>
               <w:rPr>
-                <w:rFonts w:ascii="宋体" w:hAnsi="宋体" w:eastAsia="宋体"/>
+                <w:rFonts w:ascii="宋体" w:hAnsi="宋体" w:eastAsia="宋体" w:cs="宋体"/>
                 <w:b w:val="0"/>
                 <w:color w:val="000000"/>
                 <w:sz w:val="21"/>
@@ -5720,7 +5755,7 @@
             </w:pPr>
             <w:r>
               <w:rPr>
-                <w:rFonts w:ascii="宋体" w:hAnsi="宋体" w:eastAsia="宋体"/>
+                <w:rFonts w:ascii="宋体" w:hAnsi="宋体" w:eastAsia="宋体" w:cs="宋体"/>
                 <w:b w:val="0"/>
                 <w:color w:val="000000"/>
                 <w:sz w:val="21"/>
@@ -5746,7 +5781,7 @@
             </w:pPr>
             <w:r>
               <w:rPr>
-                <w:rFonts w:ascii="宋体" w:hAnsi="宋体" w:eastAsia="宋体"/>
+                <w:rFonts w:ascii="宋体" w:hAnsi="宋体" w:eastAsia="宋体" w:cs="宋体"/>
                 <w:b w:val="0"/>
                 <w:color w:val="000000"/>
                 <w:sz w:val="21"/>
@@ -5774,7 +5809,7 @@
             </w:pPr>
             <w:r>
               <w:rPr>
-                <w:rFonts w:ascii="宋体" w:hAnsi="宋体" w:eastAsia="宋体"/>
+                <w:rFonts w:ascii="宋体" w:hAnsi="宋体" w:eastAsia="宋体" w:cs="宋体"/>
                 <w:b w:val="0"/>
                 <w:color w:val="000000"/>
                 <w:sz w:val="21"/>
@@ -5800,7 +5835,7 @@
             </w:pPr>
             <w:r>
               <w:rPr>
-                <w:rFonts w:ascii="宋体" w:hAnsi="宋体" w:eastAsia="宋体"/>
+                <w:rFonts w:ascii="宋体" w:hAnsi="宋体" w:eastAsia="宋体" w:cs="宋体"/>
                 <w:b w:val="0"/>
                 <w:color w:val="000000"/>
                 <w:sz w:val="21"/>
@@ -5826,7 +5861,7 @@
             </w:pPr>
             <w:r>
               <w:rPr>
-                <w:rFonts w:ascii="宋体" w:hAnsi="宋体" w:eastAsia="宋体"/>
+                <w:rFonts w:ascii="宋体" w:hAnsi="宋体" w:eastAsia="宋体" w:cs="宋体"/>
                 <w:b w:val="0"/>
                 <w:color w:val="000000"/>
                 <w:sz w:val="21"/>
@@ -5852,7 +5887,7 @@
             </w:pPr>
             <w:r>
               <w:rPr>
-                <w:rFonts w:ascii="宋体" w:hAnsi="宋体" w:eastAsia="宋体"/>
+                <w:rFonts w:ascii="宋体" w:hAnsi="宋体" w:eastAsia="宋体" w:cs="宋体"/>
                 <w:b w:val="0"/>
                 <w:color w:val="000000"/>
                 <w:sz w:val="21"/>
@@ -5880,7 +5915,7 @@
             </w:pPr>
             <w:r>
               <w:rPr>
-                <w:rFonts w:ascii="宋体" w:hAnsi="宋体" w:eastAsia="宋体"/>
+                <w:rFonts w:ascii="宋体" w:hAnsi="宋体" w:eastAsia="宋体" w:cs="宋体"/>
                 <w:b w:val="0"/>
                 <w:color w:val="000000"/>
                 <w:sz w:val="21"/>
@@ -5906,7 +5941,7 @@
             </w:pPr>
             <w:r>
               <w:rPr>
-                <w:rFonts w:ascii="宋体" w:hAnsi="宋体" w:eastAsia="宋体"/>
+                <w:rFonts w:ascii="宋体" w:hAnsi="宋体" w:eastAsia="宋体" w:cs="宋体"/>
                 <w:b w:val="0"/>
                 <w:color w:val="000000"/>
                 <w:sz w:val="21"/>
@@ -5932,7 +5967,7 @@
             </w:pPr>
             <w:r>
               <w:rPr>
-                <w:rFonts w:ascii="宋体" w:hAnsi="宋体" w:eastAsia="宋体"/>
+                <w:rFonts w:ascii="宋体" w:hAnsi="宋体" w:eastAsia="宋体" w:cs="宋体"/>
                 <w:b w:val="0"/>
                 <w:color w:val="000000"/>
                 <w:sz w:val="21"/>
@@ -5958,7 +5993,7 @@
             </w:pPr>
             <w:r>
               <w:rPr>
-                <w:rFonts w:ascii="宋体" w:hAnsi="宋体" w:eastAsia="宋体"/>
+                <w:rFonts w:ascii="宋体" w:hAnsi="宋体" w:eastAsia="宋体" w:cs="宋体"/>
                 <w:b w:val="0"/>
                 <w:color w:val="000000"/>
                 <w:sz w:val="21"/>
@@ -5986,7 +6021,7 @@
             </w:pPr>
             <w:r>
               <w:rPr>
-                <w:rFonts w:ascii="宋体" w:hAnsi="宋体" w:eastAsia="宋体"/>
+                <w:rFonts w:ascii="宋体" w:hAnsi="宋体" w:eastAsia="宋体" w:cs="宋体"/>
                 <w:b w:val="0"/>
                 <w:color w:val="000000"/>
                 <w:sz w:val="21"/>
@@ -6012,7 +6047,7 @@
             </w:pPr>
             <w:r>
               <w:rPr>
-                <w:rFonts w:ascii="宋体" w:hAnsi="宋体" w:eastAsia="宋体"/>
+                <w:rFonts w:ascii="宋体" w:hAnsi="宋体" w:eastAsia="宋体" w:cs="宋体"/>
                 <w:b w:val="0"/>
                 <w:color w:val="000000"/>
                 <w:sz w:val="21"/>
@@ -6038,7 +6073,7 @@
             </w:pPr>
             <w:r>
               <w:rPr>
-                <w:rFonts w:ascii="宋体" w:hAnsi="宋体" w:eastAsia="宋体"/>
+                <w:rFonts w:ascii="宋体" w:hAnsi="宋体" w:eastAsia="宋体" w:cs="宋体"/>
                 <w:b w:val="0"/>
                 <w:color w:val="000000"/>
                 <w:sz w:val="21"/>
@@ -6064,7 +6099,7 @@
             </w:pPr>
             <w:r>
               <w:rPr>
-                <w:rFonts w:ascii="宋体" w:hAnsi="宋体" w:eastAsia="宋体"/>
+                <w:rFonts w:ascii="宋体" w:hAnsi="宋体" w:eastAsia="宋体" w:cs="宋体"/>
                 <w:b w:val="0"/>
                 <w:color w:val="000000"/>
                 <w:sz w:val="21"/>
@@ -6092,7 +6127,7 @@
             </w:pPr>
             <w:r>
               <w:rPr>
-                <w:rFonts w:ascii="宋体" w:hAnsi="宋体" w:eastAsia="宋体"/>
+                <w:rFonts w:ascii="宋体" w:hAnsi="宋体" w:eastAsia="宋体" w:cs="宋体"/>
                 <w:b w:val="0"/>
                 <w:color w:val="000000"/>
                 <w:sz w:val="21"/>
@@ -6118,7 +6153,7 @@
             </w:pPr>
             <w:r>
               <w:rPr>
-                <w:rFonts w:ascii="宋体" w:hAnsi="宋体" w:eastAsia="宋体"/>
+                <w:rFonts w:ascii="宋体" w:hAnsi="宋体" w:eastAsia="宋体" w:cs="宋体"/>
                 <w:b w:val="0"/>
                 <w:color w:val="000000"/>
                 <w:sz w:val="21"/>
@@ -6144,7 +6179,7 @@
             </w:pPr>
             <w:r>
               <w:rPr>
-                <w:rFonts w:ascii="宋体" w:hAnsi="宋体" w:eastAsia="宋体"/>
+                <w:rFonts w:ascii="宋体" w:hAnsi="宋体" w:eastAsia="宋体" w:cs="宋体"/>
                 <w:b w:val="0"/>
                 <w:color w:val="000000"/>
                 <w:sz w:val="21"/>
@@ -6170,7 +6205,7 @@
             </w:pPr>
             <w:r>
               <w:rPr>
-                <w:rFonts w:ascii="宋体" w:hAnsi="宋体" w:eastAsia="宋体"/>
+                <w:rFonts w:ascii="宋体" w:hAnsi="宋体" w:eastAsia="宋体" w:cs="宋体"/>
                 <w:b w:val="0"/>
                 <w:color w:val="000000"/>
                 <w:sz w:val="21"/>
@@ -6184,8 +6219,15 @@
     <w:p>
       <w:pPr>
         <w:pStyle w:val="Heading1"/>
+        <w:spacing w:before="320" w:after="160" w:line="264" w:lineRule="auto"/>
       </w:pPr>
       <w:r>
+        <w:rPr>
+          <w:rFonts w:ascii="宋体" w:hAnsi="宋体" w:eastAsia="宋体" w:cs="宋体"/>
+          <w:b/>
+          <w:color w:val="000000"/>
+          <w:sz w:val="32"/>
+        </w:rPr>
         <w:t>6. 机器学习补充分析</w:t>
       </w:r>
     </w:p>
@@ -6195,7 +6237,7 @@
       </w:pPr>
       <w:r>
         <w:rPr>
-          <w:rFonts w:ascii="宋体" w:hAnsi="宋体" w:eastAsia="宋体"/>
+          <w:rFonts w:ascii="宋体" w:hAnsi="宋体" w:eastAsia="宋体" w:cs="宋体"/>
           <w:b w:val="0"/>
           <w:color w:val="000000"/>
           <w:sz w:val="22"/>
@@ -6236,7 +6278,7 @@
             </w:pPr>
             <w:r>
               <w:rPr>
-                <w:rFonts w:ascii="宋体" w:hAnsi="宋体" w:eastAsia="宋体"/>
+                <w:rFonts w:ascii="宋体" w:hAnsi="宋体" w:eastAsia="宋体" w:cs="宋体"/>
                 <w:b/>
                 <w:color w:val="000000"/>
                 <w:sz w:val="21"/>
@@ -6263,7 +6305,7 @@
             </w:pPr>
             <w:r>
               <w:rPr>
-                <w:rFonts w:ascii="宋体" w:hAnsi="宋体" w:eastAsia="宋体"/>
+                <w:rFonts w:ascii="宋体" w:hAnsi="宋体" w:eastAsia="宋体" w:cs="宋体"/>
                 <w:b/>
                 <w:color w:val="000000"/>
                 <w:sz w:val="21"/>
@@ -6290,7 +6332,7 @@
             </w:pPr>
             <w:r>
               <w:rPr>
-                <w:rFonts w:ascii="宋体" w:hAnsi="宋体" w:eastAsia="宋体"/>
+                <w:rFonts w:ascii="宋体" w:hAnsi="宋体" w:eastAsia="宋体" w:cs="宋体"/>
                 <w:b/>
                 <w:color w:val="000000"/>
                 <w:sz w:val="21"/>
@@ -6317,7 +6359,7 @@
             </w:pPr>
             <w:r>
               <w:rPr>
-                <w:rFonts w:ascii="宋体" w:hAnsi="宋体" w:eastAsia="宋体"/>
+                <w:rFonts w:ascii="宋体" w:hAnsi="宋体" w:eastAsia="宋体" w:cs="宋体"/>
                 <w:b/>
                 <w:color w:val="000000"/>
                 <w:sz w:val="21"/>
@@ -6345,7 +6387,7 @@
             </w:pPr>
             <w:r>
               <w:rPr>
-                <w:rFonts w:ascii="宋体" w:hAnsi="宋体" w:eastAsia="宋体"/>
+                <w:rFonts w:ascii="宋体" w:hAnsi="宋体" w:eastAsia="宋体" w:cs="宋体"/>
                 <w:b w:val="0"/>
                 <w:color w:val="000000"/>
                 <w:sz w:val="21"/>
@@ -6371,7 +6413,7 @@
             </w:pPr>
             <w:r>
               <w:rPr>
-                <w:rFonts w:ascii="宋体" w:hAnsi="宋体" w:eastAsia="宋体"/>
+                <w:rFonts w:ascii="宋体" w:hAnsi="宋体" w:eastAsia="宋体" w:cs="宋体"/>
                 <w:b w:val="0"/>
                 <w:color w:val="000000"/>
                 <w:sz w:val="21"/>
@@ -6397,7 +6439,7 @@
             </w:pPr>
             <w:r>
               <w:rPr>
-                <w:rFonts w:ascii="宋体" w:hAnsi="宋体" w:eastAsia="宋体"/>
+                <w:rFonts w:ascii="宋体" w:hAnsi="宋体" w:eastAsia="宋体" w:cs="宋体"/>
                 <w:b w:val="0"/>
                 <w:color w:val="000000"/>
                 <w:sz w:val="21"/>
@@ -6423,7 +6465,7 @@
             </w:pPr>
             <w:r>
               <w:rPr>
-                <w:rFonts w:ascii="宋体" w:hAnsi="宋体" w:eastAsia="宋体"/>
+                <w:rFonts w:ascii="宋体" w:hAnsi="宋体" w:eastAsia="宋体" w:cs="宋体"/>
                 <w:b w:val="0"/>
                 <w:color w:val="000000"/>
                 <w:sz w:val="21"/>
@@ -6451,7 +6493,7 @@
             </w:pPr>
             <w:r>
               <w:rPr>
-                <w:rFonts w:ascii="宋体" w:hAnsi="宋体" w:eastAsia="宋体"/>
+                <w:rFonts w:ascii="宋体" w:hAnsi="宋体" w:eastAsia="宋体" w:cs="宋体"/>
                 <w:b w:val="0"/>
                 <w:color w:val="000000"/>
                 <w:sz w:val="21"/>
@@ -6477,7 +6519,7 @@
             </w:pPr>
             <w:r>
               <w:rPr>
-                <w:rFonts w:ascii="宋体" w:hAnsi="宋体" w:eastAsia="宋体"/>
+                <w:rFonts w:ascii="宋体" w:hAnsi="宋体" w:eastAsia="宋体" w:cs="宋体"/>
                 <w:b w:val="0"/>
                 <w:color w:val="000000"/>
                 <w:sz w:val="21"/>
@@ -6503,7 +6545,7 @@
             </w:pPr>
             <w:r>
               <w:rPr>
-                <w:rFonts w:ascii="宋体" w:hAnsi="宋体" w:eastAsia="宋体"/>
+                <w:rFonts w:ascii="宋体" w:hAnsi="宋体" w:eastAsia="宋体" w:cs="宋体"/>
                 <w:b w:val="0"/>
                 <w:color w:val="000000"/>
                 <w:sz w:val="21"/>
@@ -6529,7 +6571,7 @@
             </w:pPr>
             <w:r>
               <w:rPr>
-                <w:rFonts w:ascii="宋体" w:hAnsi="宋体" w:eastAsia="宋体"/>
+                <w:rFonts w:ascii="宋体" w:hAnsi="宋体" w:eastAsia="宋体" w:cs="宋体"/>
                 <w:b w:val="0"/>
                 <w:color w:val="000000"/>
                 <w:sz w:val="21"/>
@@ -6557,7 +6599,7 @@
             </w:pPr>
             <w:r>
               <w:rPr>
-                <w:rFonts w:ascii="宋体" w:hAnsi="宋体" w:eastAsia="宋体"/>
+                <w:rFonts w:ascii="宋体" w:hAnsi="宋体" w:eastAsia="宋体" w:cs="宋体"/>
                 <w:b w:val="0"/>
                 <w:color w:val="000000"/>
                 <w:sz w:val="21"/>
@@ -6583,7 +6625,7 @@
             </w:pPr>
             <w:r>
               <w:rPr>
-                <w:rFonts w:ascii="宋体" w:hAnsi="宋体" w:eastAsia="宋体"/>
+                <w:rFonts w:ascii="宋体" w:hAnsi="宋体" w:eastAsia="宋体" w:cs="宋体"/>
                 <w:b w:val="0"/>
                 <w:color w:val="000000"/>
                 <w:sz w:val="21"/>
@@ -6609,7 +6651,7 @@
             </w:pPr>
             <w:r>
               <w:rPr>
-                <w:rFonts w:ascii="宋体" w:hAnsi="宋体" w:eastAsia="宋体"/>
+                <w:rFonts w:ascii="宋体" w:hAnsi="宋体" w:eastAsia="宋体" w:cs="宋体"/>
                 <w:b w:val="0"/>
                 <w:color w:val="000000"/>
                 <w:sz w:val="21"/>
@@ -6635,7 +6677,7 @@
             </w:pPr>
             <w:r>
               <w:rPr>
-                <w:rFonts w:ascii="宋体" w:hAnsi="宋体" w:eastAsia="宋体"/>
+                <w:rFonts w:ascii="宋体" w:hAnsi="宋体" w:eastAsia="宋体" w:cs="宋体"/>
                 <w:b w:val="0"/>
                 <w:color w:val="000000"/>
                 <w:sz w:val="21"/>
@@ -6652,7 +6694,7 @@
       </w:pPr>
       <w:r>
         <w:rPr>
-          <w:rFonts w:ascii="宋体" w:hAnsi="宋体" w:eastAsia="宋体"/>
+          <w:rFonts w:ascii="宋体" w:hAnsi="宋体" w:eastAsia="宋体" w:cs="宋体"/>
           <w:b w:val="0"/>
           <w:color w:val="000000"/>
           <w:sz w:val="22"/>
@@ -6666,7 +6708,7 @@
       </w:pPr>
       <w:r>
         <w:rPr>
-          <w:rFonts w:ascii="宋体" w:hAnsi="宋体" w:eastAsia="宋体"/>
+          <w:rFonts w:ascii="宋体" w:hAnsi="宋体" w:eastAsia="宋体" w:cs="宋体"/>
           <w:b w:val="0"/>
           <w:color w:val="000000"/>
           <w:sz w:val="22"/>
@@ -6706,7 +6748,7 @@
             </w:pPr>
             <w:r>
               <w:rPr>
-                <w:rFonts w:ascii="宋体" w:hAnsi="宋体" w:eastAsia="宋体"/>
+                <w:rFonts w:ascii="宋体" w:hAnsi="宋体" w:eastAsia="宋体" w:cs="宋体"/>
                 <w:b/>
                 <w:color w:val="000000"/>
                 <w:sz w:val="21"/>
@@ -6733,7 +6775,7 @@
             </w:pPr>
             <w:r>
               <w:rPr>
-                <w:rFonts w:ascii="宋体" w:hAnsi="宋体" w:eastAsia="宋体"/>
+                <w:rFonts w:ascii="宋体" w:hAnsi="宋体" w:eastAsia="宋体" w:cs="宋体"/>
                 <w:b/>
                 <w:color w:val="000000"/>
                 <w:sz w:val="21"/>
@@ -6760,7 +6802,7 @@
             </w:pPr>
             <w:r>
               <w:rPr>
-                <w:rFonts w:ascii="宋体" w:hAnsi="宋体" w:eastAsia="宋体"/>
+                <w:rFonts w:ascii="宋体" w:hAnsi="宋体" w:eastAsia="宋体" w:cs="宋体"/>
                 <w:b/>
                 <w:color w:val="000000"/>
                 <w:sz w:val="21"/>
@@ -6788,7 +6830,7 @@
             </w:pPr>
             <w:r>
               <w:rPr>
-                <w:rFonts w:ascii="宋体" w:hAnsi="宋体" w:eastAsia="宋体"/>
+                <w:rFonts w:ascii="宋体" w:hAnsi="宋体" w:eastAsia="宋体" w:cs="宋体"/>
                 <w:b w:val="0"/>
                 <w:color w:val="000000"/>
                 <w:sz w:val="21"/>
@@ -6814,7 +6856,7 @@
             </w:pPr>
             <w:r>
               <w:rPr>
-                <w:rFonts w:ascii="宋体" w:hAnsi="宋体" w:eastAsia="宋体"/>
+                <w:rFonts w:ascii="宋体" w:hAnsi="宋体" w:eastAsia="宋体" w:cs="宋体"/>
                 <w:b w:val="0"/>
                 <w:color w:val="000000"/>
                 <w:sz w:val="21"/>
@@ -6840,7 +6882,7 @@
             </w:pPr>
             <w:r>
               <w:rPr>
-                <w:rFonts w:ascii="宋体" w:hAnsi="宋体" w:eastAsia="宋体"/>
+                <w:rFonts w:ascii="宋体" w:hAnsi="宋体" w:eastAsia="宋体" w:cs="宋体"/>
                 <w:b w:val="0"/>
                 <w:color w:val="000000"/>
                 <w:sz w:val="21"/>
@@ -6868,7 +6910,7 @@
             </w:pPr>
             <w:r>
               <w:rPr>
-                <w:rFonts w:ascii="宋体" w:hAnsi="宋体" w:eastAsia="宋体"/>
+                <w:rFonts w:ascii="宋体" w:hAnsi="宋体" w:eastAsia="宋体" w:cs="宋体"/>
                 <w:b w:val="0"/>
                 <w:color w:val="000000"/>
                 <w:sz w:val="21"/>
@@ -6894,7 +6936,7 @@
             </w:pPr>
             <w:r>
               <w:rPr>
-                <w:rFonts w:ascii="宋体" w:hAnsi="宋体" w:eastAsia="宋体"/>
+                <w:rFonts w:ascii="宋体" w:hAnsi="宋体" w:eastAsia="宋体" w:cs="宋体"/>
                 <w:b w:val="0"/>
                 <w:color w:val="000000"/>
                 <w:sz w:val="21"/>
@@ -6920,7 +6962,7 @@
             </w:pPr>
             <w:r>
               <w:rPr>
-                <w:rFonts w:ascii="宋体" w:hAnsi="宋体" w:eastAsia="宋体"/>
+                <w:rFonts w:ascii="宋体" w:hAnsi="宋体" w:eastAsia="宋体" w:cs="宋体"/>
                 <w:b w:val="0"/>
                 <w:color w:val="000000"/>
                 <w:sz w:val="21"/>
@@ -6948,7 +6990,7 @@
             </w:pPr>
             <w:r>
               <w:rPr>
-                <w:rFonts w:ascii="宋体" w:hAnsi="宋体" w:eastAsia="宋体"/>
+                <w:rFonts w:ascii="宋体" w:hAnsi="宋体" w:eastAsia="宋体" w:cs="宋体"/>
                 <w:b w:val="0"/>
                 <w:color w:val="000000"/>
                 <w:sz w:val="21"/>
@@ -6974,7 +7016,7 @@
             </w:pPr>
             <w:r>
               <w:rPr>
-                <w:rFonts w:ascii="宋体" w:hAnsi="宋体" w:eastAsia="宋体"/>
+                <w:rFonts w:ascii="宋体" w:hAnsi="宋体" w:eastAsia="宋体" w:cs="宋体"/>
                 <w:b w:val="0"/>
                 <w:color w:val="000000"/>
                 <w:sz w:val="21"/>
@@ -7000,7 +7042,7 @@
             </w:pPr>
             <w:r>
               <w:rPr>
-                <w:rFonts w:ascii="宋体" w:hAnsi="宋体" w:eastAsia="宋体"/>
+                <w:rFonts w:ascii="宋体" w:hAnsi="宋体" w:eastAsia="宋体" w:cs="宋体"/>
                 <w:b w:val="0"/>
                 <w:color w:val="000000"/>
                 <w:sz w:val="21"/>
@@ -7028,7 +7070,7 @@
             </w:pPr>
             <w:r>
               <w:rPr>
-                <w:rFonts w:ascii="宋体" w:hAnsi="宋体" w:eastAsia="宋体"/>
+                <w:rFonts w:ascii="宋体" w:hAnsi="宋体" w:eastAsia="宋体" w:cs="宋体"/>
                 <w:b w:val="0"/>
                 <w:color w:val="000000"/>
                 <w:sz w:val="21"/>
@@ -7054,7 +7096,7 @@
             </w:pPr>
             <w:r>
               <w:rPr>
-                <w:rFonts w:ascii="宋体" w:hAnsi="宋体" w:eastAsia="宋体"/>
+                <w:rFonts w:ascii="宋体" w:hAnsi="宋体" w:eastAsia="宋体" w:cs="宋体"/>
                 <w:b w:val="0"/>
                 <w:color w:val="000000"/>
                 <w:sz w:val="21"/>
@@ -7080,7 +7122,7 @@
             </w:pPr>
             <w:r>
               <w:rPr>
-                <w:rFonts w:ascii="宋体" w:hAnsi="宋体" w:eastAsia="宋体"/>
+                <w:rFonts w:ascii="宋体" w:hAnsi="宋体" w:eastAsia="宋体" w:cs="宋体"/>
                 <w:b w:val="0"/>
                 <w:color w:val="000000"/>
                 <w:sz w:val="21"/>
@@ -7108,7 +7150,7 @@
             </w:pPr>
             <w:r>
               <w:rPr>
-                <w:rFonts w:ascii="宋体" w:hAnsi="宋体" w:eastAsia="宋体"/>
+                <w:rFonts w:ascii="宋体" w:hAnsi="宋体" w:eastAsia="宋体" w:cs="宋体"/>
                 <w:b w:val="0"/>
                 <w:color w:val="000000"/>
                 <w:sz w:val="21"/>
@@ -7134,7 +7176,7 @@
             </w:pPr>
             <w:r>
               <w:rPr>
-                <w:rFonts w:ascii="宋体" w:hAnsi="宋体" w:eastAsia="宋体"/>
+                <w:rFonts w:ascii="宋体" w:hAnsi="宋体" w:eastAsia="宋体" w:cs="宋体"/>
                 <w:b w:val="0"/>
                 <w:color w:val="000000"/>
                 <w:sz w:val="21"/>
@@ -7160,7 +7202,7 @@
             </w:pPr>
             <w:r>
               <w:rPr>
-                <w:rFonts w:ascii="宋体" w:hAnsi="宋体" w:eastAsia="宋体"/>
+                <w:rFonts w:ascii="宋体" w:hAnsi="宋体" w:eastAsia="宋体" w:cs="宋体"/>
                 <w:b w:val="0"/>
                 <w:color w:val="000000"/>
                 <w:sz w:val="21"/>
@@ -7188,7 +7230,7 @@
             </w:pPr>
             <w:r>
               <w:rPr>
-                <w:rFonts w:ascii="宋体" w:hAnsi="宋体" w:eastAsia="宋体"/>
+                <w:rFonts w:ascii="宋体" w:hAnsi="宋体" w:eastAsia="宋体" w:cs="宋体"/>
                 <w:b w:val="0"/>
                 <w:color w:val="000000"/>
                 <w:sz w:val="21"/>
@@ -7214,7 +7256,7 @@
             </w:pPr>
             <w:r>
               <w:rPr>
-                <w:rFonts w:ascii="宋体" w:hAnsi="宋体" w:eastAsia="宋体"/>
+                <w:rFonts w:ascii="宋体" w:hAnsi="宋体" w:eastAsia="宋体" w:cs="宋体"/>
                 <w:b w:val="0"/>
                 <w:color w:val="000000"/>
                 <w:sz w:val="21"/>
@@ -7240,7 +7282,7 @@
             </w:pPr>
             <w:r>
               <w:rPr>
-                <w:rFonts w:ascii="宋体" w:hAnsi="宋体" w:eastAsia="宋体"/>
+                <w:rFonts w:ascii="宋体" w:hAnsi="宋体" w:eastAsia="宋体" w:cs="宋体"/>
                 <w:b w:val="0"/>
                 <w:color w:val="000000"/>
                 <w:sz w:val="21"/>
@@ -7268,7 +7310,7 @@
             </w:pPr>
             <w:r>
               <w:rPr>
-                <w:rFonts w:ascii="宋体" w:hAnsi="宋体" w:eastAsia="宋体"/>
+                <w:rFonts w:ascii="宋体" w:hAnsi="宋体" w:eastAsia="宋体" w:cs="宋体"/>
                 <w:b w:val="0"/>
                 <w:color w:val="000000"/>
                 <w:sz w:val="21"/>
@@ -7294,7 +7336,7 @@
             </w:pPr>
             <w:r>
               <w:rPr>
-                <w:rFonts w:ascii="宋体" w:hAnsi="宋体" w:eastAsia="宋体"/>
+                <w:rFonts w:ascii="宋体" w:hAnsi="宋体" w:eastAsia="宋体" w:cs="宋体"/>
                 <w:b w:val="0"/>
                 <w:color w:val="000000"/>
                 <w:sz w:val="21"/>
@@ -7320,7 +7362,7 @@
             </w:pPr>
             <w:r>
               <w:rPr>
-                <w:rFonts w:ascii="宋体" w:hAnsi="宋体" w:eastAsia="宋体"/>
+                <w:rFonts w:ascii="宋体" w:hAnsi="宋体" w:eastAsia="宋体" w:cs="宋体"/>
                 <w:b w:val="0"/>
                 <w:color w:val="000000"/>
                 <w:sz w:val="21"/>
@@ -7348,7 +7390,7 @@
             </w:pPr>
             <w:r>
               <w:rPr>
-                <w:rFonts w:ascii="宋体" w:hAnsi="宋体" w:eastAsia="宋体"/>
+                <w:rFonts w:ascii="宋体" w:hAnsi="宋体" w:eastAsia="宋体" w:cs="宋体"/>
                 <w:b w:val="0"/>
                 <w:color w:val="000000"/>
                 <w:sz w:val="21"/>
@@ -7374,7 +7416,7 @@
             </w:pPr>
             <w:r>
               <w:rPr>
-                <w:rFonts w:ascii="宋体" w:hAnsi="宋体" w:eastAsia="宋体"/>
+                <w:rFonts w:ascii="宋体" w:hAnsi="宋体" w:eastAsia="宋体" w:cs="宋体"/>
                 <w:b w:val="0"/>
                 <w:color w:val="000000"/>
                 <w:sz w:val="21"/>
@@ -7400,7 +7442,7 @@
             </w:pPr>
             <w:r>
               <w:rPr>
-                <w:rFonts w:ascii="宋体" w:hAnsi="宋体" w:eastAsia="宋体"/>
+                <w:rFonts w:ascii="宋体" w:hAnsi="宋体" w:eastAsia="宋体" w:cs="宋体"/>
                 <w:b w:val="0"/>
                 <w:color w:val="000000"/>
                 <w:sz w:val="21"/>
@@ -7417,7 +7459,7 @@
       </w:pPr>
       <w:r>
         <w:rPr>
-          <w:rFonts w:ascii="宋体" w:hAnsi="宋体" w:eastAsia="宋体"/>
+          <w:rFonts w:ascii="宋体" w:hAnsi="宋体" w:eastAsia="宋体" w:cs="宋体"/>
           <w:b w:val="0"/>
           <w:color w:val="000000"/>
           <w:sz w:val="22"/>
@@ -7458,7 +7500,7 @@
             </w:pPr>
             <w:r>
               <w:rPr>
-                <w:rFonts w:ascii="宋体" w:hAnsi="宋体" w:eastAsia="宋体"/>
+                <w:rFonts w:ascii="宋体" w:hAnsi="宋体" w:eastAsia="宋体" w:cs="宋体"/>
                 <w:b/>
                 <w:color w:val="000000"/>
                 <w:sz w:val="21"/>
@@ -7485,7 +7527,7 @@
             </w:pPr>
             <w:r>
               <w:rPr>
-                <w:rFonts w:ascii="宋体" w:hAnsi="宋体" w:eastAsia="宋体"/>
+                <w:rFonts w:ascii="宋体" w:hAnsi="宋体" w:eastAsia="宋体" w:cs="宋体"/>
                 <w:b/>
                 <w:color w:val="000000"/>
                 <w:sz w:val="21"/>
@@ -7512,7 +7554,7 @@
             </w:pPr>
             <w:r>
               <w:rPr>
-                <w:rFonts w:ascii="宋体" w:hAnsi="宋体" w:eastAsia="宋体"/>
+                <w:rFonts w:ascii="宋体" w:hAnsi="宋体" w:eastAsia="宋体" w:cs="宋体"/>
                 <w:b/>
                 <w:color w:val="000000"/>
                 <w:sz w:val="21"/>
@@ -7539,7 +7581,7 @@
             </w:pPr>
             <w:r>
               <w:rPr>
-                <w:rFonts w:ascii="宋体" w:hAnsi="宋体" w:eastAsia="宋体"/>
+                <w:rFonts w:ascii="宋体" w:hAnsi="宋体" w:eastAsia="宋体" w:cs="宋体"/>
                 <w:b/>
                 <w:color w:val="000000"/>
                 <w:sz w:val="21"/>
@@ -7567,7 +7609,7 @@
             </w:pPr>
             <w:r>
               <w:rPr>
-                <w:rFonts w:ascii="宋体" w:hAnsi="宋体" w:eastAsia="宋体"/>
+                <w:rFonts w:ascii="宋体" w:hAnsi="宋体" w:eastAsia="宋体" w:cs="宋体"/>
                 <w:b w:val="0"/>
                 <w:color w:val="000000"/>
                 <w:sz w:val="21"/>
@@ -7593,7 +7635,7 @@
             </w:pPr>
             <w:r>
               <w:rPr>
-                <w:rFonts w:ascii="宋体" w:hAnsi="宋体" w:eastAsia="宋体"/>
+                <w:rFonts w:ascii="宋体" w:hAnsi="宋体" w:eastAsia="宋体" w:cs="宋体"/>
                 <w:b w:val="0"/>
                 <w:color w:val="000000"/>
                 <w:sz w:val="21"/>
@@ -7619,7 +7661,7 @@
             </w:pPr>
             <w:r>
               <w:rPr>
-                <w:rFonts w:ascii="宋体" w:hAnsi="宋体" w:eastAsia="宋体"/>
+                <w:rFonts w:ascii="宋体" w:hAnsi="宋体" w:eastAsia="宋体" w:cs="宋体"/>
                 <w:b w:val="0"/>
                 <w:color w:val="000000"/>
                 <w:sz w:val="21"/>
@@ -7645,7 +7687,7 @@
             </w:pPr>
             <w:r>
               <w:rPr>
-                <w:rFonts w:ascii="宋体" w:hAnsi="宋体" w:eastAsia="宋体"/>
+                <w:rFonts w:ascii="宋体" w:hAnsi="宋体" w:eastAsia="宋体" w:cs="宋体"/>
                 <w:b w:val="0"/>
                 <w:color w:val="000000"/>
                 <w:sz w:val="21"/>
@@ -7673,7 +7715,7 @@
             </w:pPr>
             <w:r>
               <w:rPr>
-                <w:rFonts w:ascii="宋体" w:hAnsi="宋体" w:eastAsia="宋体"/>
+                <w:rFonts w:ascii="宋体" w:hAnsi="宋体" w:eastAsia="宋体" w:cs="宋体"/>
                 <w:b w:val="0"/>
                 <w:color w:val="000000"/>
                 <w:sz w:val="21"/>
@@ -7699,7 +7741,7 @@
             </w:pPr>
             <w:r>
               <w:rPr>
-                <w:rFonts w:ascii="宋体" w:hAnsi="宋体" w:eastAsia="宋体"/>
+                <w:rFonts w:ascii="宋体" w:hAnsi="宋体" w:eastAsia="宋体" w:cs="宋体"/>
                 <w:b w:val="0"/>
                 <w:color w:val="000000"/>
                 <w:sz w:val="21"/>
@@ -7725,7 +7767,7 @@
             </w:pPr>
             <w:r>
               <w:rPr>
-                <w:rFonts w:ascii="宋体" w:hAnsi="宋体" w:eastAsia="宋体"/>
+                <w:rFonts w:ascii="宋体" w:hAnsi="宋体" w:eastAsia="宋体" w:cs="宋体"/>
                 <w:b w:val="0"/>
                 <w:color w:val="000000"/>
                 <w:sz w:val="21"/>
@@ -7751,7 +7793,7 @@
             </w:pPr>
             <w:r>
               <w:rPr>
-                <w:rFonts w:ascii="宋体" w:hAnsi="宋体" w:eastAsia="宋体"/>
+                <w:rFonts w:ascii="宋体" w:hAnsi="宋体" w:eastAsia="宋体" w:cs="宋体"/>
                 <w:b w:val="0"/>
                 <w:color w:val="000000"/>
                 <w:sz w:val="21"/>
@@ -7779,7 +7821,7 @@
             </w:pPr>
             <w:r>
               <w:rPr>
-                <w:rFonts w:ascii="宋体" w:hAnsi="宋体" w:eastAsia="宋体"/>
+                <w:rFonts w:ascii="宋体" w:hAnsi="宋体" w:eastAsia="宋体" w:cs="宋体"/>
                 <w:b w:val="0"/>
                 <w:color w:val="000000"/>
                 <w:sz w:val="21"/>
@@ -7805,7 +7847,7 @@
             </w:pPr>
             <w:r>
               <w:rPr>
-                <w:rFonts w:ascii="宋体" w:hAnsi="宋体" w:eastAsia="宋体"/>
+                <w:rFonts w:ascii="宋体" w:hAnsi="宋体" w:eastAsia="宋体" w:cs="宋体"/>
                 <w:b w:val="0"/>
                 <w:color w:val="000000"/>
                 <w:sz w:val="21"/>
@@ -7831,7 +7873,7 @@
             </w:pPr>
             <w:r>
               <w:rPr>
-                <w:rFonts w:ascii="宋体" w:hAnsi="宋体" w:eastAsia="宋体"/>
+                <w:rFonts w:ascii="宋体" w:hAnsi="宋体" w:eastAsia="宋体" w:cs="宋体"/>
                 <w:b w:val="0"/>
                 <w:color w:val="000000"/>
                 <w:sz w:val="21"/>
@@ -7857,7 +7899,7 @@
             </w:pPr>
             <w:r>
               <w:rPr>
-                <w:rFonts w:ascii="宋体" w:hAnsi="宋体" w:eastAsia="宋体"/>
+                <w:rFonts w:ascii="宋体" w:hAnsi="宋体" w:eastAsia="宋体" w:cs="宋体"/>
                 <w:b w:val="0"/>
                 <w:color w:val="000000"/>
                 <w:sz w:val="21"/>
@@ -7885,7 +7927,7 @@
             </w:pPr>
             <w:r>
               <w:rPr>
-                <w:rFonts w:ascii="宋体" w:hAnsi="宋体" w:eastAsia="宋体"/>
+                <w:rFonts w:ascii="宋体" w:hAnsi="宋体" w:eastAsia="宋体" w:cs="宋体"/>
                 <w:b w:val="0"/>
                 <w:color w:val="000000"/>
                 <w:sz w:val="21"/>
@@ -7911,7 +7953,7 @@
             </w:pPr>
             <w:r>
               <w:rPr>
-                <w:rFonts w:ascii="宋体" w:hAnsi="宋体" w:eastAsia="宋体"/>
+                <w:rFonts w:ascii="宋体" w:hAnsi="宋体" w:eastAsia="宋体" w:cs="宋体"/>
                 <w:b w:val="0"/>
                 <w:color w:val="000000"/>
                 <w:sz w:val="21"/>
@@ -7937,7 +7979,7 @@
             </w:pPr>
             <w:r>
               <w:rPr>
-                <w:rFonts w:ascii="宋体" w:hAnsi="宋体" w:eastAsia="宋体"/>
+                <w:rFonts w:ascii="宋体" w:hAnsi="宋体" w:eastAsia="宋体" w:cs="宋体"/>
                 <w:b w:val="0"/>
                 <w:color w:val="000000"/>
                 <w:sz w:val="21"/>
@@ -7963,7 +8005,7 @@
             </w:pPr>
             <w:r>
               <w:rPr>
-                <w:rFonts w:ascii="宋体" w:hAnsi="宋体" w:eastAsia="宋体"/>
+                <w:rFonts w:ascii="宋体" w:hAnsi="宋体" w:eastAsia="宋体" w:cs="宋体"/>
                 <w:b w:val="0"/>
                 <w:color w:val="000000"/>
                 <w:sz w:val="21"/>
@@ -7987,8 +8029,15 @@
     <w:p>
       <w:pPr>
         <w:pStyle w:val="Heading1"/>
+        <w:spacing w:before="320" w:after="160" w:line="264" w:lineRule="auto"/>
       </w:pPr>
       <w:r>
+        <w:rPr>
+          <w:rFonts w:ascii="宋体" w:hAnsi="宋体" w:eastAsia="宋体" w:cs="宋体"/>
+          <w:b/>
+          <w:color w:val="000000"/>
+          <w:sz w:val="32"/>
+        </w:rPr>
         <w:t>7. 可视化结果</w:t>
       </w:r>
     </w:p>
@@ -8038,7 +8087,7 @@
       </w:pPr>
       <w:r>
         <w:rPr>
-          <w:rFonts w:ascii="宋体" w:hAnsi="宋体" w:eastAsia="宋体"/>
+          <w:rFonts w:ascii="宋体" w:hAnsi="宋体" w:eastAsia="宋体" w:cs="宋体"/>
           <w:b w:val="0"/>
           <w:color w:val="000000"/>
           <w:sz w:val="18"/>
@@ -8092,7 +8141,7 @@
       </w:pPr>
       <w:r>
         <w:rPr>
-          <w:rFonts w:ascii="宋体" w:hAnsi="宋体" w:eastAsia="宋体"/>
+          <w:rFonts w:ascii="宋体" w:hAnsi="宋体" w:eastAsia="宋体" w:cs="宋体"/>
           <w:b w:val="0"/>
           <w:color w:val="000000"/>
           <w:sz w:val="18"/>
@@ -8146,7 +8195,7 @@
       </w:pPr>
       <w:r>
         <w:rPr>
-          <w:rFonts w:ascii="宋体" w:hAnsi="宋体" w:eastAsia="宋体"/>
+          <w:rFonts w:ascii="宋体" w:hAnsi="宋体" w:eastAsia="宋体" w:cs="宋体"/>
           <w:b w:val="0"/>
           <w:color w:val="000000"/>
           <w:sz w:val="18"/>
@@ -8200,7 +8249,7 @@
       </w:pPr>
       <w:r>
         <w:rPr>
-          <w:rFonts w:ascii="宋体" w:hAnsi="宋体" w:eastAsia="宋体"/>
+          <w:rFonts w:ascii="宋体" w:hAnsi="宋体" w:eastAsia="宋体" w:cs="宋体"/>
           <w:b w:val="0"/>
           <w:color w:val="000000"/>
           <w:sz w:val="18"/>
@@ -8254,7 +8303,7 @@
       </w:pPr>
       <w:r>
         <w:rPr>
-          <w:rFonts w:ascii="宋体" w:hAnsi="宋体" w:eastAsia="宋体"/>
+          <w:rFonts w:ascii="宋体" w:hAnsi="宋体" w:eastAsia="宋体" w:cs="宋体"/>
           <w:b w:val="0"/>
           <w:color w:val="000000"/>
           <w:sz w:val="18"/>
@@ -8308,7 +8357,7 @@
       </w:pPr>
       <w:r>
         <w:rPr>
-          <w:rFonts w:ascii="宋体" w:hAnsi="宋体" w:eastAsia="宋体"/>
+          <w:rFonts w:ascii="宋体" w:hAnsi="宋体" w:eastAsia="宋体" w:cs="宋体"/>
           <w:b w:val="0"/>
           <w:color w:val="000000"/>
           <w:sz w:val="18"/>
@@ -8362,7 +8411,7 @@
       </w:pPr>
       <w:r>
         <w:rPr>
-          <w:rFonts w:ascii="宋体" w:hAnsi="宋体" w:eastAsia="宋体"/>
+          <w:rFonts w:ascii="宋体" w:hAnsi="宋体" w:eastAsia="宋体" w:cs="宋体"/>
           <w:b w:val="0"/>
           <w:color w:val="000000"/>
           <w:sz w:val="18"/>
@@ -8416,7 +8465,7 @@
       </w:pPr>
       <w:r>
         <w:rPr>
-          <w:rFonts w:ascii="宋体" w:hAnsi="宋体" w:eastAsia="宋体"/>
+          <w:rFonts w:ascii="宋体" w:hAnsi="宋体" w:eastAsia="宋体" w:cs="宋体"/>
           <w:b w:val="0"/>
           <w:color w:val="000000"/>
           <w:sz w:val="18"/>
@@ -8427,8 +8476,15 @@
     <w:p>
       <w:pPr>
         <w:pStyle w:val="Heading1"/>
+        <w:spacing w:before="320" w:after="160" w:line="264" w:lineRule="auto"/>
       </w:pPr>
       <w:r>
+        <w:rPr>
+          <w:rFonts w:ascii="宋体" w:hAnsi="宋体" w:eastAsia="宋体" w:cs="宋体"/>
+          <w:b/>
+          <w:color w:val="000000"/>
+          <w:sz w:val="32"/>
+        </w:rPr>
         <w:t>8. 项目输出与可复现操作</w:t>
       </w:r>
     </w:p>
@@ -8438,7 +8494,7 @@
       </w:pPr>
       <w:r>
         <w:rPr>
-          <w:rFonts w:ascii="宋体" w:hAnsi="宋体" w:eastAsia="宋体"/>
+          <w:rFonts w:ascii="宋体" w:hAnsi="宋体" w:eastAsia="宋体" w:cs="宋体"/>
           <w:b w:val="0"/>
           <w:color w:val="000000"/>
           <w:sz w:val="22"/>
@@ -8477,7 +8533,7 @@
             </w:pPr>
             <w:r>
               <w:rPr>
-                <w:rFonts w:ascii="宋体" w:hAnsi="宋体" w:eastAsia="宋体"/>
+                <w:rFonts w:ascii="宋体" w:hAnsi="宋体" w:eastAsia="宋体" w:cs="宋体"/>
                 <w:b/>
                 <w:color w:val="000000"/>
                 <w:sz w:val="21"/>
@@ -8504,7 +8560,7 @@
             </w:pPr>
             <w:r>
               <w:rPr>
-                <w:rFonts w:ascii="宋体" w:hAnsi="宋体" w:eastAsia="宋体"/>
+                <w:rFonts w:ascii="宋体" w:hAnsi="宋体" w:eastAsia="宋体" w:cs="宋体"/>
                 <w:b/>
                 <w:color w:val="000000"/>
                 <w:sz w:val="21"/>
@@ -8532,7 +8588,7 @@
             </w:pPr>
             <w:r>
               <w:rPr>
-                <w:rFonts w:ascii="宋体" w:hAnsi="宋体" w:eastAsia="宋体"/>
+                <w:rFonts w:ascii="宋体" w:hAnsi="宋体" w:eastAsia="宋体" w:cs="宋体"/>
                 <w:b w:val="0"/>
                 <w:color w:val="000000"/>
                 <w:sz w:val="21"/>
@@ -8558,7 +8614,7 @@
             </w:pPr>
             <w:r>
               <w:rPr>
-                <w:rFonts w:ascii="宋体" w:hAnsi="宋体" w:eastAsia="宋体"/>
+                <w:rFonts w:ascii="宋体" w:hAnsi="宋体" w:eastAsia="宋体" w:cs="宋体"/>
                 <w:b w:val="0"/>
                 <w:color w:val="000000"/>
                 <w:sz w:val="21"/>
@@ -8586,7 +8642,7 @@
             </w:pPr>
             <w:r>
               <w:rPr>
-                <w:rFonts w:ascii="宋体" w:hAnsi="宋体" w:eastAsia="宋体"/>
+                <w:rFonts w:ascii="宋体" w:hAnsi="宋体" w:eastAsia="宋体" w:cs="宋体"/>
                 <w:b w:val="0"/>
                 <w:color w:val="000000"/>
                 <w:sz w:val="21"/>
@@ -8612,7 +8668,7 @@
             </w:pPr>
             <w:r>
               <w:rPr>
-                <w:rFonts w:ascii="宋体" w:hAnsi="宋体" w:eastAsia="宋体"/>
+                <w:rFonts w:ascii="宋体" w:hAnsi="宋体" w:eastAsia="宋体" w:cs="宋体"/>
                 <w:b w:val="0"/>
                 <w:color w:val="000000"/>
                 <w:sz w:val="21"/>
@@ -8640,7 +8696,7 @@
             </w:pPr>
             <w:r>
               <w:rPr>
-                <w:rFonts w:ascii="宋体" w:hAnsi="宋体" w:eastAsia="宋体"/>
+                <w:rFonts w:ascii="宋体" w:hAnsi="宋体" w:eastAsia="宋体" w:cs="宋体"/>
                 <w:b w:val="0"/>
                 <w:color w:val="000000"/>
                 <w:sz w:val="21"/>
@@ -8666,7 +8722,7 @@
             </w:pPr>
             <w:r>
               <w:rPr>
-                <w:rFonts w:ascii="宋体" w:hAnsi="宋体" w:eastAsia="宋体"/>
+                <w:rFonts w:ascii="宋体" w:hAnsi="宋体" w:eastAsia="宋体" w:cs="宋体"/>
                 <w:b w:val="0"/>
                 <w:color w:val="000000"/>
                 <w:sz w:val="21"/>
@@ -8694,7 +8750,7 @@
             </w:pPr>
             <w:r>
               <w:rPr>
-                <w:rFonts w:ascii="宋体" w:hAnsi="宋体" w:eastAsia="宋体"/>
+                <w:rFonts w:ascii="宋体" w:hAnsi="宋体" w:eastAsia="宋体" w:cs="宋体"/>
                 <w:b w:val="0"/>
                 <w:color w:val="000000"/>
                 <w:sz w:val="21"/>
@@ -8720,7 +8776,7 @@
             </w:pPr>
             <w:r>
               <w:rPr>
-                <w:rFonts w:ascii="宋体" w:hAnsi="宋体" w:eastAsia="宋体"/>
+                <w:rFonts w:ascii="宋体" w:hAnsi="宋体" w:eastAsia="宋体" w:cs="宋体"/>
                 <w:b w:val="0"/>
                 <w:color w:val="000000"/>
                 <w:sz w:val="21"/>
@@ -8748,7 +8804,7 @@
             </w:pPr>
             <w:r>
               <w:rPr>
-                <w:rFonts w:ascii="宋体" w:hAnsi="宋体" w:eastAsia="宋体"/>
+                <w:rFonts w:ascii="宋体" w:hAnsi="宋体" w:eastAsia="宋体" w:cs="宋体"/>
                 <w:b w:val="0"/>
                 <w:color w:val="000000"/>
                 <w:sz w:val="21"/>
@@ -8774,7 +8830,7 @@
             </w:pPr>
             <w:r>
               <w:rPr>
-                <w:rFonts w:ascii="宋体" w:hAnsi="宋体" w:eastAsia="宋体"/>
+                <w:rFonts w:ascii="宋体" w:hAnsi="宋体" w:eastAsia="宋体" w:cs="宋体"/>
                 <w:b w:val="0"/>
                 <w:color w:val="000000"/>
                 <w:sz w:val="21"/>
@@ -8802,7 +8858,7 @@
             </w:pPr>
             <w:r>
               <w:rPr>
-                <w:rFonts w:ascii="宋体" w:hAnsi="宋体" w:eastAsia="宋体"/>
+                <w:rFonts w:ascii="宋体" w:hAnsi="宋体" w:eastAsia="宋体" w:cs="宋体"/>
                 <w:b w:val="0"/>
                 <w:color w:val="000000"/>
                 <w:sz w:val="21"/>
@@ -8828,7 +8884,7 @@
             </w:pPr>
             <w:r>
               <w:rPr>
-                <w:rFonts w:ascii="宋体" w:hAnsi="宋体" w:eastAsia="宋体"/>
+                <w:rFonts w:ascii="宋体" w:hAnsi="宋体" w:eastAsia="宋体" w:cs="宋体"/>
                 <w:b w:val="0"/>
                 <w:color w:val="000000"/>
                 <w:sz w:val="21"/>
@@ -8856,7 +8912,7 @@
             </w:pPr>
             <w:r>
               <w:rPr>
-                <w:rFonts w:ascii="宋体" w:hAnsi="宋体" w:eastAsia="宋体"/>
+                <w:rFonts w:ascii="宋体" w:hAnsi="宋体" w:eastAsia="宋体" w:cs="宋体"/>
                 <w:b w:val="0"/>
                 <w:color w:val="000000"/>
                 <w:sz w:val="21"/>
@@ -8882,7 +8938,7 @@
             </w:pPr>
             <w:r>
               <w:rPr>
-                <w:rFonts w:ascii="宋体" w:hAnsi="宋体" w:eastAsia="宋体"/>
+                <w:rFonts w:ascii="宋体" w:hAnsi="宋体" w:eastAsia="宋体" w:cs="宋体"/>
                 <w:b w:val="0"/>
                 <w:color w:val="000000"/>
                 <w:sz w:val="21"/>
@@ -8910,7 +8966,7 @@
             </w:pPr>
             <w:r>
               <w:rPr>
-                <w:rFonts w:ascii="宋体" w:hAnsi="宋体" w:eastAsia="宋体"/>
+                <w:rFonts w:ascii="宋体" w:hAnsi="宋体" w:eastAsia="宋体" w:cs="宋体"/>
                 <w:b w:val="0"/>
                 <w:color w:val="000000"/>
                 <w:sz w:val="21"/>
@@ -8936,7 +8992,7 @@
             </w:pPr>
             <w:r>
               <w:rPr>
-                <w:rFonts w:ascii="宋体" w:hAnsi="宋体" w:eastAsia="宋体"/>
+                <w:rFonts w:ascii="宋体" w:hAnsi="宋体" w:eastAsia="宋体" w:cs="宋体"/>
                 <w:b w:val="0"/>
                 <w:color w:val="000000"/>
                 <w:sz w:val="21"/>
@@ -8978,7 +9034,7 @@
             </w:pPr>
             <w:r>
               <w:rPr>
-                <w:rFonts w:ascii="宋体" w:hAnsi="宋体" w:eastAsia="宋体"/>
+                <w:rFonts w:ascii="宋体" w:hAnsi="宋体" w:eastAsia="宋体" w:cs="宋体"/>
                 <w:b/>
                 <w:color w:val="000000"/>
                 <w:sz w:val="21"/>
@@ -9005,7 +9061,7 @@
             </w:pPr>
             <w:r>
               <w:rPr>
-                <w:rFonts w:ascii="宋体" w:hAnsi="宋体" w:eastAsia="宋体"/>
+                <w:rFonts w:ascii="宋体" w:hAnsi="宋体" w:eastAsia="宋体" w:cs="宋体"/>
                 <w:b/>
                 <w:color w:val="000000"/>
                 <w:sz w:val="21"/>
@@ -9033,7 +9089,7 @@
             </w:pPr>
             <w:r>
               <w:rPr>
-                <w:rFonts w:ascii="宋体" w:hAnsi="宋体" w:eastAsia="宋体"/>
+                <w:rFonts w:ascii="宋体" w:hAnsi="宋体" w:eastAsia="宋体" w:cs="宋体"/>
                 <w:b w:val="0"/>
                 <w:color w:val="000000"/>
                 <w:sz w:val="21"/>
@@ -9059,7 +9115,7 @@
             </w:pPr>
             <w:r>
               <w:rPr>
-                <w:rFonts w:ascii="宋体" w:hAnsi="宋体" w:eastAsia="宋体"/>
+                <w:rFonts w:ascii="宋体" w:hAnsi="宋体" w:eastAsia="宋体" w:cs="宋体"/>
                 <w:b w:val="0"/>
                 <w:color w:val="000000"/>
                 <w:sz w:val="21"/>
@@ -9087,7 +9143,7 @@
             </w:pPr>
             <w:r>
               <w:rPr>
-                <w:rFonts w:ascii="宋体" w:hAnsi="宋体" w:eastAsia="宋体"/>
+                <w:rFonts w:ascii="宋体" w:hAnsi="宋体" w:eastAsia="宋体" w:cs="宋体"/>
                 <w:b w:val="0"/>
                 <w:color w:val="000000"/>
                 <w:sz w:val="21"/>
@@ -9113,7 +9169,7 @@
             </w:pPr>
             <w:r>
               <w:rPr>
-                <w:rFonts w:ascii="宋体" w:hAnsi="宋体" w:eastAsia="宋体"/>
+                <w:rFonts w:ascii="宋体" w:hAnsi="宋体" w:eastAsia="宋体" w:cs="宋体"/>
                 <w:b w:val="0"/>
                 <w:color w:val="000000"/>
                 <w:sz w:val="21"/>
@@ -9141,7 +9197,7 @@
             </w:pPr>
             <w:r>
               <w:rPr>
-                <w:rFonts w:ascii="宋体" w:hAnsi="宋体" w:eastAsia="宋体"/>
+                <w:rFonts w:ascii="宋体" w:hAnsi="宋体" w:eastAsia="宋体" w:cs="宋体"/>
                 <w:b w:val="0"/>
                 <w:color w:val="000000"/>
                 <w:sz w:val="21"/>
@@ -9167,7 +9223,7 @@
             </w:pPr>
             <w:r>
               <w:rPr>
-                <w:rFonts w:ascii="宋体" w:hAnsi="宋体" w:eastAsia="宋体"/>
+                <w:rFonts w:ascii="宋体" w:hAnsi="宋体" w:eastAsia="宋体" w:cs="宋体"/>
                 <w:b w:val="0"/>
                 <w:color w:val="000000"/>
                 <w:sz w:val="21"/>
@@ -9195,7 +9251,7 @@
             </w:pPr>
             <w:r>
               <w:rPr>
-                <w:rFonts w:ascii="宋体" w:hAnsi="宋体" w:eastAsia="宋体"/>
+                <w:rFonts w:ascii="宋体" w:hAnsi="宋体" w:eastAsia="宋体" w:cs="宋体"/>
                 <w:b w:val="0"/>
                 <w:color w:val="000000"/>
                 <w:sz w:val="21"/>
@@ -9221,7 +9277,7 @@
             </w:pPr>
             <w:r>
               <w:rPr>
-                <w:rFonts w:ascii="宋体" w:hAnsi="宋体" w:eastAsia="宋体"/>
+                <w:rFonts w:ascii="宋体" w:hAnsi="宋体" w:eastAsia="宋体" w:cs="宋体"/>
                 <w:b w:val="0"/>
                 <w:color w:val="000000"/>
                 <w:sz w:val="21"/>
@@ -9249,7 +9305,7 @@
             </w:pPr>
             <w:r>
               <w:rPr>
-                <w:rFonts w:ascii="宋体" w:hAnsi="宋体" w:eastAsia="宋体"/>
+                <w:rFonts w:ascii="宋体" w:hAnsi="宋体" w:eastAsia="宋体" w:cs="宋体"/>
                 <w:b w:val="0"/>
                 <w:color w:val="000000"/>
                 <w:sz w:val="21"/>
@@ -9275,7 +9331,7 @@
             </w:pPr>
             <w:r>
               <w:rPr>
-                <w:rFonts w:ascii="宋体" w:hAnsi="宋体" w:eastAsia="宋体"/>
+                <w:rFonts w:ascii="宋体" w:hAnsi="宋体" w:eastAsia="宋体" w:cs="宋体"/>
                 <w:b w:val="0"/>
                 <w:color w:val="000000"/>
                 <w:sz w:val="21"/>
@@ -9303,7 +9359,7 @@
             </w:pPr>
             <w:r>
               <w:rPr>
-                <w:rFonts w:ascii="宋体" w:hAnsi="宋体" w:eastAsia="宋体"/>
+                <w:rFonts w:ascii="宋体" w:hAnsi="宋体" w:eastAsia="宋体" w:cs="宋体"/>
                 <w:b w:val="0"/>
                 <w:color w:val="000000"/>
                 <w:sz w:val="21"/>
@@ -9329,7 +9385,7 @@
             </w:pPr>
             <w:r>
               <w:rPr>
-                <w:rFonts w:ascii="宋体" w:hAnsi="宋体" w:eastAsia="宋体"/>
+                <w:rFonts w:ascii="宋体" w:hAnsi="宋体" w:eastAsia="宋体" w:cs="宋体"/>
                 <w:b w:val="0"/>
                 <w:color w:val="000000"/>
                 <w:sz w:val="21"/>
@@ -9343,8 +9399,15 @@
     <w:p>
       <w:pPr>
         <w:pStyle w:val="Heading1"/>
+        <w:spacing w:before="320" w:after="160" w:line="264" w:lineRule="auto"/>
       </w:pPr>
       <w:r>
+        <w:rPr>
+          <w:rFonts w:ascii="宋体" w:hAnsi="宋体" w:eastAsia="宋体" w:cs="宋体"/>
+          <w:b/>
+          <w:color w:val="000000"/>
+          <w:sz w:val="32"/>
+        </w:rPr>
         <w:t>9. 项目实现说明</w:t>
       </w:r>
     </w:p>
@@ -9379,7 +9442,7 @@
             </w:pPr>
             <w:r>
               <w:rPr>
-                <w:rFonts w:ascii="宋体" w:hAnsi="宋体" w:eastAsia="宋体"/>
+                <w:rFonts w:ascii="宋体" w:hAnsi="宋体" w:eastAsia="宋体" w:cs="宋体"/>
                 <w:b/>
                 <w:color w:val="000000"/>
                 <w:sz w:val="21"/>
@@ -9406,7 +9469,7 @@
             </w:pPr>
             <w:r>
               <w:rPr>
-                <w:rFonts w:ascii="宋体" w:hAnsi="宋体" w:eastAsia="宋体"/>
+                <w:rFonts w:ascii="宋体" w:hAnsi="宋体" w:eastAsia="宋体" w:cs="宋体"/>
                 <w:b/>
                 <w:color w:val="000000"/>
                 <w:sz w:val="21"/>
@@ -9434,7 +9497,7 @@
             </w:pPr>
             <w:r>
               <w:rPr>
-                <w:rFonts w:ascii="宋体" w:hAnsi="宋体" w:eastAsia="宋体"/>
+                <w:rFonts w:ascii="宋体" w:hAnsi="宋体" w:eastAsia="宋体" w:cs="宋体"/>
                 <w:b w:val="0"/>
                 <w:color w:val="000000"/>
                 <w:sz w:val="21"/>
@@ -9460,7 +9523,7 @@
             </w:pPr>
             <w:r>
               <w:rPr>
-                <w:rFonts w:ascii="宋体" w:hAnsi="宋体" w:eastAsia="宋体"/>
+                <w:rFonts w:ascii="宋体" w:hAnsi="宋体" w:eastAsia="宋体" w:cs="宋体"/>
                 <w:b w:val="0"/>
                 <w:color w:val="000000"/>
                 <w:sz w:val="21"/>
@@ -9488,7 +9551,7 @@
             </w:pPr>
             <w:r>
               <w:rPr>
-                <w:rFonts w:ascii="宋体" w:hAnsi="宋体" w:eastAsia="宋体"/>
+                <w:rFonts w:ascii="宋体" w:hAnsi="宋体" w:eastAsia="宋体" w:cs="宋体"/>
                 <w:b w:val="0"/>
                 <w:color w:val="000000"/>
                 <w:sz w:val="21"/>
@@ -9514,7 +9577,7 @@
             </w:pPr>
             <w:r>
               <w:rPr>
-                <w:rFonts w:ascii="宋体" w:hAnsi="宋体" w:eastAsia="宋体"/>
+                <w:rFonts w:ascii="宋体" w:hAnsi="宋体" w:eastAsia="宋体" w:cs="宋体"/>
                 <w:b w:val="0"/>
                 <w:color w:val="000000"/>
                 <w:sz w:val="21"/>
@@ -9542,7 +9605,7 @@
             </w:pPr>
             <w:r>
               <w:rPr>
-                <w:rFonts w:ascii="宋体" w:hAnsi="宋体" w:eastAsia="宋体"/>
+                <w:rFonts w:ascii="宋体" w:hAnsi="宋体" w:eastAsia="宋体" w:cs="宋体"/>
                 <w:b w:val="0"/>
                 <w:color w:val="000000"/>
                 <w:sz w:val="21"/>
@@ -9568,7 +9631,7 @@
             </w:pPr>
             <w:r>
               <w:rPr>
-                <w:rFonts w:ascii="宋体" w:hAnsi="宋体" w:eastAsia="宋体"/>
+                <w:rFonts w:ascii="宋体" w:hAnsi="宋体" w:eastAsia="宋体" w:cs="宋体"/>
                 <w:b w:val="0"/>
                 <w:color w:val="000000"/>
                 <w:sz w:val="21"/>
@@ -9596,7 +9659,7 @@
             </w:pPr>
             <w:r>
               <w:rPr>
-                <w:rFonts w:ascii="宋体" w:hAnsi="宋体" w:eastAsia="宋体"/>
+                <w:rFonts w:ascii="宋体" w:hAnsi="宋体" w:eastAsia="宋体" w:cs="宋体"/>
                 <w:b w:val="0"/>
                 <w:color w:val="000000"/>
                 <w:sz w:val="21"/>
@@ -9622,7 +9685,7 @@
             </w:pPr>
             <w:r>
               <w:rPr>
-                <w:rFonts w:ascii="宋体" w:hAnsi="宋体" w:eastAsia="宋体"/>
+                <w:rFonts w:ascii="宋体" w:hAnsi="宋体" w:eastAsia="宋体" w:cs="宋体"/>
                 <w:b w:val="0"/>
                 <w:color w:val="000000"/>
                 <w:sz w:val="21"/>
@@ -9650,7 +9713,7 @@
             </w:pPr>
             <w:r>
               <w:rPr>
-                <w:rFonts w:ascii="宋体" w:hAnsi="宋体" w:eastAsia="宋体"/>
+                <w:rFonts w:ascii="宋体" w:hAnsi="宋体" w:eastAsia="宋体" w:cs="宋体"/>
                 <w:b w:val="0"/>
                 <w:color w:val="000000"/>
                 <w:sz w:val="21"/>
@@ -9676,7 +9739,7 @@
             </w:pPr>
             <w:r>
               <w:rPr>
-                <w:rFonts w:ascii="宋体" w:hAnsi="宋体" w:eastAsia="宋体"/>
+                <w:rFonts w:ascii="宋体" w:hAnsi="宋体" w:eastAsia="宋体" w:cs="宋体"/>
                 <w:b w:val="0"/>
                 <w:color w:val="000000"/>
                 <w:sz w:val="21"/>
@@ -9690,8 +9753,15 @@
     <w:p>
       <w:pPr>
         <w:pStyle w:val="Heading1"/>
+        <w:spacing w:before="320" w:after="160" w:line="264" w:lineRule="auto"/>
       </w:pPr>
       <w:r>
+        <w:rPr>
+          <w:rFonts w:ascii="宋体" w:hAnsi="宋体" w:eastAsia="宋体" w:cs="宋体"/>
+          <w:b/>
+          <w:color w:val="000000"/>
+          <w:sz w:val="32"/>
+        </w:rPr>
         <w:t>10. 局限性与改进方向</w:t>
       </w:r>
     </w:p>
@@ -9702,7 +9772,7 @@
       </w:pPr>
       <w:r>
         <w:rPr>
-          <w:rFonts w:ascii="宋体" w:hAnsi="宋体" w:eastAsia="宋体"/>
+          <w:rFonts w:ascii="宋体" w:hAnsi="宋体" w:eastAsia="宋体" w:cs="宋体"/>
           <w:b w:val="0"/>
           <w:color w:val="000000"/>
           <w:sz w:val="21"/>
@@ -9717,7 +9787,7 @@
       </w:pPr>
       <w:r>
         <w:rPr>
-          <w:rFonts w:ascii="宋体" w:hAnsi="宋体" w:eastAsia="宋体"/>
+          <w:rFonts w:ascii="宋体" w:hAnsi="宋体" w:eastAsia="宋体" w:cs="宋体"/>
           <w:b w:val="0"/>
           <w:color w:val="000000"/>
           <w:sz w:val="21"/>
@@ -9732,7 +9802,7 @@
       </w:pPr>
       <w:r>
         <w:rPr>
-          <w:rFonts w:ascii="宋体" w:hAnsi="宋体" w:eastAsia="宋体"/>
+          <w:rFonts w:ascii="宋体" w:hAnsi="宋体" w:eastAsia="宋体" w:cs="宋体"/>
           <w:b w:val="0"/>
           <w:color w:val="000000"/>
           <w:sz w:val="21"/>
@@ -9747,7 +9817,7 @@
       </w:pPr>
       <w:r>
         <w:rPr>
-          <w:rFonts w:ascii="宋体" w:hAnsi="宋体" w:eastAsia="宋体"/>
+          <w:rFonts w:ascii="宋体" w:hAnsi="宋体" w:eastAsia="宋体" w:cs="宋体"/>
           <w:b w:val="0"/>
           <w:color w:val="000000"/>
           <w:sz w:val="21"/>
@@ -9762,7 +9832,7 @@
       </w:pPr>
       <w:r>
         <w:rPr>
-          <w:rFonts w:ascii="宋体" w:hAnsi="宋体" w:eastAsia="宋体"/>
+          <w:rFonts w:ascii="宋体" w:hAnsi="宋体" w:eastAsia="宋体" w:cs="宋体"/>
           <w:b w:val="0"/>
           <w:color w:val="000000"/>
           <w:sz w:val="21"/>
@@ -9789,7 +9859,7 @@
     </w:pPr>
     <w:r>
       <w:rPr>
-        <w:rFonts w:ascii="宋体" w:hAnsi="宋体" w:eastAsia="宋体"/>
+        <w:rFonts w:ascii="宋体" w:hAnsi="宋体" w:eastAsia="宋体" w:cs="宋体"/>
         <w:b w:val="0"/>
         <w:color w:val="000000"/>
         <w:sz w:val="18"/>
@@ -9803,7 +9873,7 @@
     </w:r>
     <w:r>
       <w:rPr>
-        <w:rFonts w:ascii="宋体" w:hAnsi="宋体" w:eastAsia="宋体"/>
+        <w:rFonts w:ascii="宋体" w:hAnsi="宋体" w:eastAsia="宋体" w:cs="宋体"/>
         <w:b w:val="0"/>
         <w:color w:val="000000"/>
         <w:sz w:val="18"/>
@@ -10181,7 +10251,7 @@
       <w:spacing w:before="0" w:after="120" w:line="264" w:lineRule="auto"/>
     </w:pPr>
     <w:rPr>
-      <w:rFonts w:ascii="宋体" w:hAnsi="宋体" w:eastAsia="宋体"/>
+      <w:rFonts w:ascii="宋体" w:hAnsi="宋体" w:eastAsia="宋体" w:cs="宋体"/>
       <w:b w:val="0"/>
       <w:color w:val="000000"/>
       <w:sz w:val="22"/>
@@ -10246,7 +10316,7 @@
       <w:outlineLvl w:val="0"/>
     </w:pPr>
     <w:rPr>
-      <w:rFonts w:asciiTheme="majorHAnsi" w:eastAsiaTheme="majorEastAsia" w:hAnsiTheme="majorHAnsi" w:cstheme="majorBidi" w:ascii="宋体" w:hAnsi="宋体" w:eastAsia="宋体"/>
+      <w:rFonts w:ascii="宋体" w:hAnsi="宋体" w:eastAsia="宋体" w:cs="宋体"/>
       <w:b/>
       <w:bCs/>
       <w:color w:val="000000"/>
@@ -10270,7 +10340,7 @@
       <w:outlineLvl w:val="1"/>
     </w:pPr>
     <w:rPr>
-      <w:rFonts w:asciiTheme="majorHAnsi" w:eastAsiaTheme="majorEastAsia" w:hAnsiTheme="majorHAnsi" w:cstheme="majorBidi" w:ascii="宋体" w:hAnsi="宋体" w:eastAsia="宋体"/>
+      <w:rFonts w:ascii="宋体" w:hAnsi="宋体" w:eastAsia="宋体" w:cs="宋体"/>
       <w:b/>
       <w:bCs/>
       <w:color w:val="000000"/>
@@ -10294,7 +10364,7 @@
       <w:outlineLvl w:val="2"/>
     </w:pPr>
     <w:rPr>
-      <w:rFonts w:asciiTheme="majorHAnsi" w:eastAsiaTheme="majorEastAsia" w:hAnsiTheme="majorHAnsi" w:cstheme="majorBidi" w:ascii="宋体" w:hAnsi="宋体" w:eastAsia="宋体"/>
+      <w:rFonts w:ascii="宋体" w:hAnsi="宋体" w:eastAsia="宋体" w:cs="宋体"/>
       <w:b/>
       <w:bCs/>
       <w:color w:val="000000"/>

</xml_diff>